<commit_message>
feat(pricing): simplify quotation, keep docx only, remove pdf, streamline part 1 and 4, remove part 5 and 6
</commit_message>
<xml_diff>
--- a/02_Bao_Gia_Chi_Phi/Bao_Gia_Chi_Phi_Smart_FB_OS.docx
+++ b/02_Bao_Gia_Chi_Phi/Bao_Gia_Chi_Phi_Smart_FB_OS.docx
@@ -362,7 +362,7 @@
           <w:color w:val="8B4513"/>
           <w:sz w:val="26"/>
         </w:rPr>
-        <w:t>TÓM TẮT ĐIỀU HÀNH 3 KHỐI CHI PHÍ (EXECUTIVE SUMMARY)</w:t>
+        <w:t>TÓM TẮT ĐIỀU HÀNH 3 KHỐI CHI PHÍ (EXECUTIVE COST SUMMARY)</w:t>
       </w:r>
     </w:p>
     <w:tbl>
@@ -466,7 +466,7 @@
               <w:rPr>
                 <w:sz w:val="17"/>
               </w:rPr>
-              <w:t>• Phát triển trọn gói 10 module</w:t>
+              <w:t>• Phát triển trọn gói toàn hệ thống</w:t>
               <w:br/>
               <w:t>• Bàn giao 100% mã nguồn</w:t>
               <w:br/>
@@ -480,7 +480,7 @@
                 <w:color w:val="B45309"/>
                 <w:sz w:val="19"/>
               </w:rPr>
-              <w:t>💰 15.000.000 VNĐ (1 LẦN)</w:t>
+              <w:t>💰 15.000.000 VNĐ (TRẢ 1 LẦN)</w:t>
               <w:br/>
               <w:t>(Sở hữu vĩnh viễn)</w:t>
             </w:r>
@@ -506,7 +506,7 @@
               <w:br/>
               <w:t>• Vật tư giấy in nhiệt 3 quán</w:t>
               <w:br/>
-              <w:t>• Đầy đủ cổng VietQR PayOS</w:t>
+              <w:t>• Cổng thanh toán VietQR PayOS</w:t>
               <w:br/>
               <w:br/>
             </w:r>
@@ -538,7 +538,7 @@
               <w:rPr>
                 <w:sz w:val="17"/>
               </w:rPr>
-              <w:t>• 03 Tháng đầu: MIỄN PHÍ</w:t>
+              <w:t>• 03 Tháng đầu: MIỄN PHÍ 100%</w:t>
               <w:br/>
               <w:t>• Từ tháng 4: Gói Tier 1</w:t>
               <w:br/>
@@ -555,649 +555,6 @@
               <w:t>💰 1.000.000 VNĐ / THÁNG</w:t>
               <w:br/>
               <w:t>(~333.000 đ/quán/tháng)</w:t>
-            </w:r>
-          </w:p>
-        </w:tc>
-      </w:tr>
-    </w:tbl>
-    <w:p/>
-    <w:tbl>
-      <w:tblPr>
-        <w:tblW w:type="auto" w:w="0"/>
-        <w:jc w:val="center"/>
-        <w:tblLook w:firstColumn="1" w:firstRow="1" w:lastColumn="0" w:lastRow="0" w:noHBand="0" w:noVBand="1" w:val="04A0"/>
-        <w:tblBorders>
-          <w:top w:val="single" w:sz="4" w:space="0" w:color="CBD5E1"/>
-          <w:bottom w:val="single" w:sz="4" w:space="0" w:color="CBD5E1"/>
-          <w:left w:val="single" w:sz="4" w:space="0" w:color="CBD5E1"/>
-          <w:right w:val="single" w:sz="4" w:space="0" w:color="CBD5E1"/>
-          <w:insideH w:val="single" w:sz="4" w:space="0" w:color="CBD5E1"/>
-          <w:insideV w:val="single" w:sz="4" w:space="0" w:color="CBD5E1"/>
-        </w:tblBorders>
-      </w:tblPr>
-      <w:tblGrid>
-        <w:gridCol w:w="2007"/>
-        <w:gridCol w:w="2007"/>
-        <w:gridCol w:w="2007"/>
-        <w:gridCol w:w="2007"/>
-        <w:gridCol w:w="2007"/>
-      </w:tblGrid>
-      <w:tr>
-        <w:tc>
-          <w:tcPr>
-            <w:tcW w:type="dxa" w:w="2592"/>
-            <w:shd w:fill="F1F5F9"/>
-            <w:tcMar>
-              <w:top w:w="80" w:type="dxa"/>
-              <w:bottom w:w="80" w:type="dxa"/>
-              <w:left w:w="100" w:type="dxa"/>
-              <w:right w:w="100" w:type="dxa"/>
-            </w:tcMar>
-          </w:tcPr>
-          <w:p>
-            <w:r>
-              <w:rPr>
-                <w:b/>
-                <w:sz w:val="17"/>
-              </w:rPr>
-              <w:t>Hạng Mục Ngân Sách</w:t>
-            </w:r>
-          </w:p>
-        </w:tc>
-        <w:tc>
-          <w:tcPr>
-            <w:tcW w:type="dxa" w:w="1872"/>
-            <w:shd w:fill="F1F5F9"/>
-            <w:tcMar>
-              <w:top w:w="80" w:type="dxa"/>
-              <w:bottom w:w="80" w:type="dxa"/>
-              <w:left w:w="100" w:type="dxa"/>
-              <w:right w:w="100" w:type="dxa"/>
-            </w:tcMar>
-          </w:tcPr>
-          <w:p>
-            <w:r>
-              <w:rPr>
-                <w:b/>
-                <w:sz w:val="17"/>
-              </w:rPr>
-              <w:t>Tính Chất Chi Phí</w:t>
-            </w:r>
-          </w:p>
-        </w:tc>
-        <w:tc>
-          <w:tcPr>
-            <w:tcW w:type="dxa" w:w="1872"/>
-            <w:shd w:fill="F1F5F9"/>
-            <w:tcMar>
-              <w:top w:w="80" w:type="dxa"/>
-              <w:bottom w:w="80" w:type="dxa"/>
-              <w:left w:w="100" w:type="dxa"/>
-              <w:right w:w="100" w:type="dxa"/>
-            </w:tcMar>
-          </w:tcPr>
-          <w:p>
-            <w:r>
-              <w:rPr>
-                <w:b/>
-                <w:sz w:val="17"/>
-              </w:rPr>
-              <w:t>Chi Phí (3 Quán)</w:t>
-            </w:r>
-          </w:p>
-        </w:tc>
-        <w:tc>
-          <w:tcPr>
-            <w:tcW w:type="dxa" w:w="1584"/>
-            <w:shd w:fill="F1F5F9"/>
-            <w:tcMar>
-              <w:top w:w="80" w:type="dxa"/>
-              <w:bottom w:w="80" w:type="dxa"/>
-              <w:left w:w="100" w:type="dxa"/>
-              <w:right w:w="100" w:type="dxa"/>
-            </w:tcMar>
-          </w:tcPr>
-          <w:p>
-            <w:r>
-              <w:rPr>
-                <w:b/>
-                <w:sz w:val="17"/>
-              </w:rPr>
-              <w:t>Bình Quân / Quán</w:t>
-            </w:r>
-          </w:p>
-        </w:tc>
-        <w:tc>
-          <w:tcPr>
-            <w:tcW w:type="dxa" w:w="2160"/>
-            <w:shd w:fill="F1F5F9"/>
-            <w:tcMar>
-              <w:top w:w="80" w:type="dxa"/>
-              <w:bottom w:w="80" w:type="dxa"/>
-              <w:left w:w="100" w:type="dxa"/>
-              <w:right w:w="100" w:type="dxa"/>
-            </w:tcMar>
-          </w:tcPr>
-          <w:p>
-            <w:r>
-              <w:rPr>
-                <w:b/>
-                <w:sz w:val="17"/>
-              </w:rPr>
-              <w:t>Ghi Chú &amp; Quyền Lợi</w:t>
-            </w:r>
-          </w:p>
-        </w:tc>
-      </w:tr>
-      <w:tr>
-        <w:tc>
-          <w:tcPr>
-            <w:tcW w:type="dxa" w:w="2592"/>
-            <w:tcMar>
-              <w:top w:w="80" w:type="dxa"/>
-              <w:bottom w:w="80" w:type="dxa"/>
-              <w:left w:w="100" w:type="dxa"/>
-              <w:right w:w="100" w:type="dxa"/>
-            </w:tcMar>
-          </w:tcPr>
-          <w:p>
-            <w:r>
-              <w:rPr>
-                <w:b/>
-                <w:sz w:val="16"/>
-              </w:rPr>
-              <w:t>A. Phát Triển Phần Mềm (CAPEX)</w:t>
-            </w:r>
-          </w:p>
-        </w:tc>
-        <w:tc>
-          <w:tcPr>
-            <w:tcW w:type="dxa" w:w="1872"/>
-            <w:tcMar>
-              <w:top w:w="80" w:type="dxa"/>
-              <w:bottom w:w="80" w:type="dxa"/>
-              <w:left w:w="100" w:type="dxa"/>
-              <w:right w:w="100" w:type="dxa"/>
-            </w:tcMar>
-          </w:tcPr>
-          <w:p>
-            <w:r>
-              <w:rPr>
-                <w:sz w:val="16"/>
-              </w:rPr>
-              <w:t>Trả 01 lần duy nhất</w:t>
-            </w:r>
-          </w:p>
-        </w:tc>
-        <w:tc>
-          <w:tcPr>
-            <w:tcW w:type="dxa" w:w="1872"/>
-            <w:tcMar>
-              <w:top w:w="80" w:type="dxa"/>
-              <w:bottom w:w="80" w:type="dxa"/>
-              <w:left w:w="100" w:type="dxa"/>
-              <w:right w:w="100" w:type="dxa"/>
-            </w:tcMar>
-          </w:tcPr>
-          <w:p>
-            <w:r>
-              <w:rPr>
-                <w:b/>
-                <w:sz w:val="16"/>
-              </w:rPr>
-              <w:t>15.000.000 VNĐ</w:t>
-            </w:r>
-          </w:p>
-        </w:tc>
-        <w:tc>
-          <w:tcPr>
-            <w:tcW w:type="dxa" w:w="1584"/>
-            <w:tcMar>
-              <w:top w:w="80" w:type="dxa"/>
-              <w:bottom w:w="80" w:type="dxa"/>
-              <w:left w:w="100" w:type="dxa"/>
-              <w:right w:w="100" w:type="dxa"/>
-            </w:tcMar>
-          </w:tcPr>
-          <w:p>
-            <w:r>
-              <w:rPr>
-                <w:sz w:val="16"/>
-              </w:rPr>
-              <w:t>Phân bổ tài sản</w:t>
-            </w:r>
-          </w:p>
-        </w:tc>
-        <w:tc>
-          <w:tcPr>
-            <w:tcW w:type="dxa" w:w="2160"/>
-            <w:tcMar>
-              <w:top w:w="80" w:type="dxa"/>
-              <w:bottom w:w="80" w:type="dxa"/>
-              <w:left w:w="100" w:type="dxa"/>
-              <w:right w:w="100" w:type="dxa"/>
-            </w:tcMar>
-          </w:tcPr>
-          <w:p>
-            <w:r>
-              <w:rPr>
-                <w:sz w:val="16"/>
-              </w:rPr>
-              <w:t>Bàn giao 100% mã nguồn (0đ License)</w:t>
-            </w:r>
-          </w:p>
-        </w:tc>
-      </w:tr>
-      <w:tr>
-        <w:tc>
-          <w:tcPr>
-            <w:tcW w:type="dxa" w:w="2592"/>
-            <w:shd w:fill="FAFAFC"/>
-            <w:tcMar>
-              <w:top w:w="80" w:type="dxa"/>
-              <w:bottom w:w="80" w:type="dxa"/>
-              <w:left w:w="100" w:type="dxa"/>
-              <w:right w:w="100" w:type="dxa"/>
-            </w:tcMar>
-          </w:tcPr>
-          <w:p>
-            <w:r>
-              <w:rPr>
-                <w:b/>
-                <w:sz w:val="16"/>
-              </w:rPr>
-              <w:t>B. Vận Hành Hàng Tháng (OPEX)</w:t>
-            </w:r>
-          </w:p>
-        </w:tc>
-        <w:tc>
-          <w:tcPr>
-            <w:tcW w:type="dxa" w:w="1872"/>
-            <w:shd w:fill="FAFAFC"/>
-            <w:tcMar>
-              <w:top w:w="80" w:type="dxa"/>
-              <w:bottom w:w="80" w:type="dxa"/>
-              <w:left w:w="100" w:type="dxa"/>
-              <w:right w:w="100" w:type="dxa"/>
-            </w:tcMar>
-          </w:tcPr>
-          <w:p>
-            <w:r>
-              <w:rPr>
-                <w:sz w:val="16"/>
-              </w:rPr>
-              <w:t>Định kỳ hàng tháng</w:t>
-            </w:r>
-          </w:p>
-        </w:tc>
-        <w:tc>
-          <w:tcPr>
-            <w:tcW w:type="dxa" w:w="1872"/>
-            <w:shd w:fill="FAFAFC"/>
-            <w:tcMar>
-              <w:top w:w="80" w:type="dxa"/>
-              <w:bottom w:w="80" w:type="dxa"/>
-              <w:left w:w="100" w:type="dxa"/>
-              <w:right w:w="100" w:type="dxa"/>
-            </w:tcMar>
-          </w:tcPr>
-          <w:p>
-            <w:r>
-              <w:rPr>
-                <w:b/>
-                <w:sz w:val="16"/>
-              </w:rPr>
-              <w:t>940.000 VNĐ / tháng</w:t>
-            </w:r>
-          </w:p>
-        </w:tc>
-        <w:tc>
-          <w:tcPr>
-            <w:tcW w:type="dxa" w:w="1584"/>
-            <w:shd w:fill="FAFAFC"/>
-            <w:tcMar>
-              <w:top w:w="80" w:type="dxa"/>
-              <w:bottom w:w="80" w:type="dxa"/>
-              <w:left w:w="100" w:type="dxa"/>
-              <w:right w:w="100" w:type="dxa"/>
-            </w:tcMar>
-          </w:tcPr>
-          <w:p>
-            <w:r>
-              <w:rPr>
-                <w:sz w:val="16"/>
-              </w:rPr>
-              <w:t>~313.000 VNĐ</w:t>
-            </w:r>
-          </w:p>
-        </w:tc>
-        <w:tc>
-          <w:tcPr>
-            <w:tcW w:type="dxa" w:w="2160"/>
-            <w:shd w:fill="FAFAFC"/>
-            <w:tcMar>
-              <w:top w:w="80" w:type="dxa"/>
-              <w:bottom w:w="80" w:type="dxa"/>
-              <w:left w:w="100" w:type="dxa"/>
-              <w:right w:w="100" w:type="dxa"/>
-            </w:tcMar>
-          </w:tcPr>
-          <w:p>
-            <w:r>
-              <w:rPr>
-                <w:sz w:val="16"/>
-              </w:rPr>
-              <w:t>Cloud VPS, Tên miền, AI, Giấy in K80</w:t>
-            </w:r>
-          </w:p>
-        </w:tc>
-      </w:tr>
-      <w:tr>
-        <w:tc>
-          <w:tcPr>
-            <w:tcW w:type="dxa" w:w="2592"/>
-            <w:tcMar>
-              <w:top w:w="80" w:type="dxa"/>
-              <w:bottom w:w="80" w:type="dxa"/>
-              <w:left w:w="100" w:type="dxa"/>
-              <w:right w:w="100" w:type="dxa"/>
-            </w:tcMar>
-          </w:tcPr>
-          <w:p>
-            <w:r>
-              <w:rPr>
-                <w:b/>
-                <w:sz w:val="16"/>
-              </w:rPr>
-              <w:t>C. Bảo Trì Kỹ Thuật (SLA)</w:t>
-            </w:r>
-          </w:p>
-        </w:tc>
-        <w:tc>
-          <w:tcPr>
-            <w:tcW w:type="dxa" w:w="1872"/>
-            <w:tcMar>
-              <w:top w:w="80" w:type="dxa"/>
-              <w:bottom w:w="80" w:type="dxa"/>
-              <w:left w:w="100" w:type="dxa"/>
-              <w:right w:w="100" w:type="dxa"/>
-            </w:tcMar>
-          </w:tcPr>
-          <w:p>
-            <w:r>
-              <w:rPr>
-                <w:sz w:val="16"/>
-              </w:rPr>
-              <w:t>Định kỳ từ tháng thứ 4</w:t>
-            </w:r>
-          </w:p>
-        </w:tc>
-        <w:tc>
-          <w:tcPr>
-            <w:tcW w:type="dxa" w:w="1872"/>
-            <w:tcMar>
-              <w:top w:w="80" w:type="dxa"/>
-              <w:bottom w:w="80" w:type="dxa"/>
-              <w:left w:w="100" w:type="dxa"/>
-              <w:right w:w="100" w:type="dxa"/>
-            </w:tcMar>
-          </w:tcPr>
-          <w:p>
-            <w:r>
-              <w:rPr>
-                <w:b/>
-                <w:sz w:val="16"/>
-              </w:rPr>
-              <w:t>1.000.000 VNĐ / tháng</w:t>
-            </w:r>
-          </w:p>
-        </w:tc>
-        <w:tc>
-          <w:tcPr>
-            <w:tcW w:type="dxa" w:w="1584"/>
-            <w:tcMar>
-              <w:top w:w="80" w:type="dxa"/>
-              <w:bottom w:w="80" w:type="dxa"/>
-              <w:left w:w="100" w:type="dxa"/>
-              <w:right w:w="100" w:type="dxa"/>
-            </w:tcMar>
-          </w:tcPr>
-          <w:p>
-            <w:r>
-              <w:rPr>
-                <w:sz w:val="16"/>
-              </w:rPr>
-              <w:t>~333.000 VNĐ</w:t>
-            </w:r>
-          </w:p>
-        </w:tc>
-        <w:tc>
-          <w:tcPr>
-            <w:tcW w:type="dxa" w:w="2160"/>
-            <w:tcMar>
-              <w:top w:w="80" w:type="dxa"/>
-              <w:bottom w:w="80" w:type="dxa"/>
-              <w:left w:w="100" w:type="dxa"/>
-              <w:right w:w="100" w:type="dxa"/>
-            </w:tcMar>
-          </w:tcPr>
-          <w:p>
-            <w:r>
-              <w:rPr>
-                <w:sz w:val="16"/>
-              </w:rPr>
-              <w:t>03 tháng đầu tiên bảo hành miễn phí 100%</w:t>
-            </w:r>
-          </w:p>
-        </w:tc>
-      </w:tr>
-      <w:tr>
-        <w:tc>
-          <w:tcPr>
-            <w:tcW w:type="dxa" w:w="2592"/>
-            <w:shd w:fill="FAFAFC"/>
-            <w:tcMar>
-              <w:top w:w="80" w:type="dxa"/>
-              <w:bottom w:w="80" w:type="dxa"/>
-              <w:left w:w="100" w:type="dxa"/>
-              <w:right w:w="100" w:type="dxa"/>
-            </w:tcMar>
-          </w:tcPr>
-          <w:p>
-            <w:r>
-              <w:rPr>
-                <w:b/>
-                <w:sz w:val="16"/>
-              </w:rPr>
-              <w:t>D. Thiết Bị Tại Điểm Bán</w:t>
-            </w:r>
-          </w:p>
-        </w:tc>
-        <w:tc>
-          <w:tcPr>
-            <w:tcW w:type="dxa" w:w="1872"/>
-            <w:shd w:fill="FAFAFC"/>
-            <w:tcMar>
-              <w:top w:w="80" w:type="dxa"/>
-              <w:bottom w:w="80" w:type="dxa"/>
-              <w:left w:w="100" w:type="dxa"/>
-              <w:right w:w="100" w:type="dxa"/>
-            </w:tcMar>
-          </w:tcPr>
-          <w:p>
-            <w:r>
-              <w:rPr>
-                <w:sz w:val="16"/>
-              </w:rPr>
-              <w:t>Tự trang bị / có sẵn</w:t>
-            </w:r>
-          </w:p>
-        </w:tc>
-        <w:tc>
-          <w:tcPr>
-            <w:tcW w:type="dxa" w:w="1872"/>
-            <w:shd w:fill="FAFAFC"/>
-            <w:tcMar>
-              <w:top w:w="80" w:type="dxa"/>
-              <w:bottom w:w="80" w:type="dxa"/>
-              <w:left w:w="100" w:type="dxa"/>
-              <w:right w:w="100" w:type="dxa"/>
-            </w:tcMar>
-          </w:tcPr>
-          <w:p>
-            <w:r>
-              <w:rPr>
-                <w:b/>
-                <w:sz w:val="16"/>
-              </w:rPr>
-              <w:t>0 VNĐ</w:t>
-            </w:r>
-          </w:p>
-        </w:tc>
-        <w:tc>
-          <w:tcPr>
-            <w:tcW w:type="dxa" w:w="1584"/>
-            <w:shd w:fill="FAFAFC"/>
-            <w:tcMar>
-              <w:top w:w="80" w:type="dxa"/>
-              <w:bottom w:w="80" w:type="dxa"/>
-              <w:left w:w="100" w:type="dxa"/>
-              <w:right w:w="100" w:type="dxa"/>
-            </w:tcMar>
-          </w:tcPr>
-          <w:p>
-            <w:r>
-              <w:rPr>
-                <w:sz w:val="16"/>
-              </w:rPr>
-              <w:t>Tận dụng đồ cũ</w:t>
-            </w:r>
-          </w:p>
-        </w:tc>
-        <w:tc>
-          <w:tcPr>
-            <w:tcW w:type="dxa" w:w="2160"/>
-            <w:shd w:fill="FAFAFC"/>
-            <w:tcMar>
-              <w:top w:w="80" w:type="dxa"/>
-              <w:bottom w:w="80" w:type="dxa"/>
-              <w:left w:w="100" w:type="dxa"/>
-              <w:right w:w="100" w:type="dxa"/>
-            </w:tcMar>
-          </w:tcPr>
-          <w:p>
-            <w:r>
-              <w:rPr>
-                <w:sz w:val="16"/>
-              </w:rPr>
-              <w:t>Web-First chạy trên Smart TV, Laptop, Tablet</w:t>
-            </w:r>
-          </w:p>
-        </w:tc>
-      </w:tr>
-      <w:tr>
-        <w:tc>
-          <w:tcPr>
-            <w:tcW w:type="dxa" w:w="2592"/>
-            <w:shd w:fill="FEF3C7"/>
-            <w:tcMar>
-              <w:top w:w="80" w:type="dxa"/>
-              <w:bottom w:w="80" w:type="dxa"/>
-              <w:left w:w="100" w:type="dxa"/>
-              <w:right w:w="100" w:type="dxa"/>
-            </w:tcMar>
-          </w:tcPr>
-          <w:p>
-            <w:r>
-              <w:rPr>
-                <w:b/>
-                <w:sz w:val="16"/>
-              </w:rPr>
-              <w:t>⚡ THỜI GIAN THU HỒI VỐN (ROI)</w:t>
-            </w:r>
-          </w:p>
-        </w:tc>
-        <w:tc>
-          <w:tcPr>
-            <w:tcW w:type="dxa" w:w="1872"/>
-            <w:shd w:fill="FEF3C7"/>
-            <w:tcMar>
-              <w:top w:w="80" w:type="dxa"/>
-              <w:bottom w:w="80" w:type="dxa"/>
-              <w:left w:w="100" w:type="dxa"/>
-              <w:right w:w="100" w:type="dxa"/>
-            </w:tcMar>
-          </w:tcPr>
-          <w:p>
-            <w:r>
-              <w:rPr>
-                <w:b/>
-                <w:sz w:val="16"/>
-              </w:rPr>
-              <w:t>Lợi ích tiết kiệm ròng</w:t>
-            </w:r>
-          </w:p>
-        </w:tc>
-        <w:tc>
-          <w:tcPr>
-            <w:tcW w:type="dxa" w:w="1872"/>
-            <w:shd w:fill="FEF3C7"/>
-            <w:tcMar>
-              <w:top w:w="80" w:type="dxa"/>
-              <w:bottom w:w="80" w:type="dxa"/>
-              <w:left w:w="100" w:type="dxa"/>
-              <w:right w:w="100" w:type="dxa"/>
-            </w:tcMar>
-          </w:tcPr>
-          <w:p>
-            <w:r>
-              <w:rPr>
-                <w:b/>
-                <w:sz w:val="16"/>
-              </w:rPr>
-              <w:t>0.45 THÁNG (~14 NGÀY)</w:t>
-            </w:r>
-          </w:p>
-        </w:tc>
-        <w:tc>
-          <w:tcPr>
-            <w:tcW w:type="dxa" w:w="1584"/>
-            <w:shd w:fill="FEF3C7"/>
-            <w:tcMar>
-              <w:top w:w="80" w:type="dxa"/>
-              <w:bottom w:w="80" w:type="dxa"/>
-              <w:left w:w="100" w:type="dxa"/>
-              <w:right w:w="100" w:type="dxa"/>
-            </w:tcMar>
-          </w:tcPr>
-          <w:p>
-            <w:r>
-              <w:rPr>
-                <w:b/>
-                <w:sz w:val="16"/>
-              </w:rPr>
-              <w:t>Hoàn 100% vốn</w:t>
-            </w:r>
-          </w:p>
-        </w:tc>
-        <w:tc>
-          <w:tcPr>
-            <w:tcW w:type="dxa" w:w="2160"/>
-            <w:shd w:fill="FEF3C7"/>
-            <w:tcMar>
-              <w:top w:w="80" w:type="dxa"/>
-              <w:bottom w:w="80" w:type="dxa"/>
-              <w:left w:w="100" w:type="dxa"/>
-              <w:right w:w="100" w:type="dxa"/>
-            </w:tcMar>
-          </w:tcPr>
-          <w:p>
-            <w:r>
-              <w:rPr>
-                <w:b/>
-                <w:sz w:val="16"/>
-              </w:rPr>
-              <w:t>Hoàn vốn đầu tư sau chưa đầy nửa tháng!</w:t>
             </w:r>
           </w:p>
         </w:tc>
@@ -1239,10 +596,10 @@
             </w:tcBorders>
             <w:shd w:fill="FAF5FF"/>
             <w:tcMar>
-              <w:top w:w="120" w:type="dxa"/>
-              <w:bottom w:w="120" w:type="dxa"/>
-              <w:left w:w="150" w:type="dxa"/>
-              <w:right w:w="150" w:type="dxa"/>
+              <w:top w:w="100" w:type="dxa"/>
+              <w:bottom w:w="100" w:type="dxa"/>
+              <w:left w:w="140" w:type="dxa"/>
+              <w:right w:w="140" w:type="dxa"/>
             </w:tcMar>
           </w:tcPr>
           <w:p>
@@ -1267,1809 +624,182 @@
       </w:tr>
     </w:tbl>
     <w:p/>
-    <w:tbl>
-      <w:tblPr>
-        <w:tblW w:type="auto" w:w="0"/>
-        <w:jc w:val="center"/>
-        <w:tblLook w:firstColumn="1" w:firstRow="1" w:lastColumn="0" w:lastRow="0" w:noHBand="0" w:noVBand="1" w:val="04A0"/>
-        <w:tblBorders>
-          <w:top w:val="single" w:sz="4" w:space="0" w:color="CBD5E1"/>
-          <w:bottom w:val="single" w:sz="4" w:space="0" w:color="CBD5E1"/>
-          <w:left w:val="single" w:sz="4" w:space="0" w:color="CBD5E1"/>
-          <w:right w:val="single" w:sz="4" w:space="0" w:color="CBD5E1"/>
-          <w:insideH w:val="single" w:sz="4" w:space="0" w:color="CBD5E1"/>
-          <w:insideV w:val="single" w:sz="4" w:space="0" w:color="CBD5E1"/>
-        </w:tblBorders>
-      </w:tblPr>
-      <w:tblGrid>
-        <w:gridCol w:w="1434"/>
-        <w:gridCol w:w="1434"/>
-        <w:gridCol w:w="1434"/>
-        <w:gridCol w:w="1434"/>
-        <w:gridCol w:w="1434"/>
-        <w:gridCol w:w="1434"/>
-        <w:gridCol w:w="1434"/>
-      </w:tblGrid>
-      <w:tr>
-        <w:tc>
-          <w:tcPr>
-            <w:tcW w:type="dxa" w:w="576"/>
-            <w:shd w:fill="F1F5F9"/>
-            <w:tcMar>
-              <w:top w:w="80" w:type="dxa"/>
-              <w:bottom w:w="80" w:type="dxa"/>
-              <w:left w:w="100" w:type="dxa"/>
-              <w:right w:w="100" w:type="dxa"/>
-            </w:tcMar>
-          </w:tcPr>
-          <w:p>
-            <w:r>
-              <w:rPr>
-                <w:b/>
-                <w:sz w:val="16"/>
-              </w:rPr>
-              <w:t>STT</w:t>
-            </w:r>
-          </w:p>
-        </w:tc>
-        <w:tc>
-          <w:tcPr>
-            <w:tcW w:type="dxa" w:w="2592"/>
-            <w:shd w:fill="F1F5F9"/>
-            <w:tcMar>
-              <w:top w:w="80" w:type="dxa"/>
-              <w:bottom w:w="80" w:type="dxa"/>
-              <w:left w:w="100" w:type="dxa"/>
-              <w:right w:w="100" w:type="dxa"/>
-            </w:tcMar>
-          </w:tcPr>
-          <w:p>
-            <w:r>
-              <w:rPr>
-                <w:b/>
-                <w:sz w:val="16"/>
-              </w:rPr>
-              <w:t>Tên Hạng Mục Phát Triển</w:t>
-            </w:r>
-          </w:p>
-        </w:tc>
-        <w:tc>
-          <w:tcPr>
-            <w:tcW w:type="dxa" w:w="3312"/>
-            <w:shd w:fill="F1F5F9"/>
-            <w:tcMar>
-              <w:top w:w="80" w:type="dxa"/>
-              <w:bottom w:w="80" w:type="dxa"/>
-              <w:left w:w="100" w:type="dxa"/>
-              <w:right w:w="100" w:type="dxa"/>
-            </w:tcMar>
-          </w:tcPr>
-          <w:p>
-            <w:r>
-              <w:rPr>
-                <w:b/>
-                <w:sz w:val="16"/>
-              </w:rPr>
-              <w:t>Khối Lượng &amp; Chi Tiết Deliverables</w:t>
-            </w:r>
-          </w:p>
-        </w:tc>
-        <w:tc>
-          <w:tcPr>
-            <w:tcW w:type="dxa" w:w="576"/>
-            <w:shd w:fill="F1F5F9"/>
-            <w:tcMar>
-              <w:top w:w="80" w:type="dxa"/>
-              <w:bottom w:w="80" w:type="dxa"/>
-              <w:left w:w="100" w:type="dxa"/>
-              <w:right w:w="100" w:type="dxa"/>
-            </w:tcMar>
-          </w:tcPr>
-          <w:p>
-            <w:r>
-              <w:rPr>
-                <w:b/>
-                <w:sz w:val="16"/>
-              </w:rPr>
-              <w:t>ĐVT</w:t>
-            </w:r>
-          </w:p>
-        </w:tc>
-        <w:tc>
-          <w:tcPr>
-            <w:tcW w:type="dxa" w:w="432"/>
-            <w:shd w:fill="F1F5F9"/>
-            <w:tcMar>
-              <w:top w:w="80" w:type="dxa"/>
-              <w:bottom w:w="80" w:type="dxa"/>
-              <w:left w:w="100" w:type="dxa"/>
-              <w:right w:w="100" w:type="dxa"/>
-            </w:tcMar>
-          </w:tcPr>
-          <w:p>
-            <w:r>
-              <w:rPr>
-                <w:b/>
-                <w:sz w:val="16"/>
-              </w:rPr>
-              <w:t>SL</w:t>
-            </w:r>
-          </w:p>
-        </w:tc>
-        <w:tc>
-          <w:tcPr>
-            <w:tcW w:type="dxa" w:w="1296"/>
-            <w:shd w:fill="F1F5F9"/>
-            <w:tcMar>
-              <w:top w:w="80" w:type="dxa"/>
-              <w:bottom w:w="80" w:type="dxa"/>
-              <w:left w:w="100" w:type="dxa"/>
-              <w:right w:w="100" w:type="dxa"/>
-            </w:tcMar>
-          </w:tcPr>
-          <w:p>
-            <w:r>
-              <w:rPr>
-                <w:b/>
-                <w:sz w:val="16"/>
-              </w:rPr>
-              <w:t>Đơn Giá (VNĐ)</w:t>
-            </w:r>
-          </w:p>
-        </w:tc>
-        <w:tc>
-          <w:tcPr>
-            <w:tcW w:type="dxa" w:w="1296"/>
-            <w:shd w:fill="F1F5F9"/>
-            <w:tcMar>
-              <w:top w:w="80" w:type="dxa"/>
-              <w:bottom w:w="80" w:type="dxa"/>
-              <w:left w:w="100" w:type="dxa"/>
-              <w:right w:w="100" w:type="dxa"/>
-            </w:tcMar>
-          </w:tcPr>
-          <w:p>
-            <w:r>
-              <w:rPr>
-                <w:b/>
-                <w:sz w:val="16"/>
-              </w:rPr>
-              <w:t>Thành Tiền (VNĐ)</w:t>
-            </w:r>
-          </w:p>
-        </w:tc>
-      </w:tr>
-      <w:tr>
-        <w:tc>
-          <w:tcPr>
-            <w:tcW w:type="dxa" w:w="576"/>
-            <w:tcMar>
-              <w:top w:w="80" w:type="dxa"/>
-              <w:bottom w:w="80" w:type="dxa"/>
-              <w:left w:w="100" w:type="dxa"/>
-              <w:right w:w="100" w:type="dxa"/>
-            </w:tcMar>
-          </w:tcPr>
-          <w:p>
-            <w:pPr>
-              <w:jc w:val="center"/>
-            </w:pPr>
-            <w:r>
-              <w:rPr>
-                <w:sz w:val="15"/>
-              </w:rPr>
-              <w:t>1</w:t>
-            </w:r>
-          </w:p>
-        </w:tc>
-        <w:tc>
-          <w:tcPr>
-            <w:tcW w:type="dxa" w:w="2592"/>
-            <w:tcMar>
-              <w:top w:w="80" w:type="dxa"/>
-              <w:bottom w:w="80" w:type="dxa"/>
-              <w:left w:w="100" w:type="dxa"/>
-              <w:right w:w="100" w:type="dxa"/>
-            </w:tcMar>
-          </w:tcPr>
-          <w:p>
-            <w:r>
-              <w:rPr>
-                <w:sz w:val="15"/>
-              </w:rPr>
-              <w:t>Backend Lõi (.NET 8 Clean Architecture)</w:t>
-            </w:r>
-          </w:p>
-        </w:tc>
-        <w:tc>
-          <w:tcPr>
-            <w:tcW w:type="dxa" w:w="3312"/>
-            <w:tcMar>
-              <w:top w:w="80" w:type="dxa"/>
-              <w:bottom w:w="80" w:type="dxa"/>
-              <w:left w:w="100" w:type="dxa"/>
-              <w:right w:w="100" w:type="dxa"/>
-            </w:tcMar>
-          </w:tcPr>
-          <w:p>
-            <w:r>
-              <w:rPr>
-                <w:sz w:val="15"/>
-              </w:rPr>
-              <w:t>Kiến trúc CQRS MediatR, SignalR Hubs, Distributed Locks, Auth JWT/RBAC, 10 nhóm Resource RESTful APIs, State Machine 4 kênh bán</w:t>
-            </w:r>
-          </w:p>
-        </w:tc>
-        <w:tc>
-          <w:tcPr>
-            <w:tcW w:type="dxa" w:w="576"/>
-            <w:tcMar>
-              <w:top w:w="80" w:type="dxa"/>
-              <w:bottom w:w="80" w:type="dxa"/>
-              <w:left w:w="100" w:type="dxa"/>
-              <w:right w:w="100" w:type="dxa"/>
-            </w:tcMar>
-          </w:tcPr>
-          <w:p>
-            <w:pPr>
-              <w:jc w:val="center"/>
-            </w:pPr>
-            <w:r>
-              <w:rPr>
-                <w:sz w:val="15"/>
-              </w:rPr>
-              <w:t>Gói</w:t>
-            </w:r>
-          </w:p>
-        </w:tc>
-        <w:tc>
-          <w:tcPr>
-            <w:tcW w:type="dxa" w:w="432"/>
-            <w:tcMar>
-              <w:top w:w="80" w:type="dxa"/>
-              <w:bottom w:w="80" w:type="dxa"/>
-              <w:left w:w="100" w:type="dxa"/>
-              <w:right w:w="100" w:type="dxa"/>
-            </w:tcMar>
-          </w:tcPr>
-          <w:p>
-            <w:pPr>
-              <w:jc w:val="center"/>
-            </w:pPr>
-            <w:r>
-              <w:rPr>
-                <w:sz w:val="15"/>
-              </w:rPr>
-              <w:t>1</w:t>
-            </w:r>
-          </w:p>
-        </w:tc>
-        <w:tc>
-          <w:tcPr>
-            <w:tcW w:type="dxa" w:w="1296"/>
-            <w:tcMar>
-              <w:top w:w="80" w:type="dxa"/>
-              <w:bottom w:w="80" w:type="dxa"/>
-              <w:left w:w="100" w:type="dxa"/>
-              <w:right w:w="100" w:type="dxa"/>
-            </w:tcMar>
-          </w:tcPr>
-          <w:p>
-            <w:pPr>
-              <w:jc w:val="right"/>
-            </w:pPr>
-            <w:r>
-              <w:rPr>
-                <w:b w:val="0"/>
-                <w:sz w:val="15"/>
-              </w:rPr>
-              <w:t>5.000.000</w:t>
-            </w:r>
-          </w:p>
-        </w:tc>
-        <w:tc>
-          <w:tcPr>
-            <w:tcW w:type="dxa" w:w="1296"/>
-            <w:tcMar>
-              <w:top w:w="80" w:type="dxa"/>
-              <w:bottom w:w="80" w:type="dxa"/>
-              <w:left w:w="100" w:type="dxa"/>
-              <w:right w:w="100" w:type="dxa"/>
-            </w:tcMar>
-          </w:tcPr>
-          <w:p>
-            <w:pPr>
-              <w:jc w:val="right"/>
-            </w:pPr>
-            <w:r>
-              <w:rPr>
-                <w:b/>
-                <w:sz w:val="15"/>
-              </w:rPr>
-              <w:t>5.000.000</w:t>
-            </w:r>
-          </w:p>
-        </w:tc>
-      </w:tr>
-      <w:tr>
-        <w:tc>
-          <w:tcPr>
-            <w:tcW w:type="dxa" w:w="576"/>
-            <w:shd w:fill="FAFAFC"/>
-            <w:tcMar>
-              <w:top w:w="80" w:type="dxa"/>
-              <w:bottom w:w="80" w:type="dxa"/>
-              <w:left w:w="100" w:type="dxa"/>
-              <w:right w:w="100" w:type="dxa"/>
-            </w:tcMar>
-          </w:tcPr>
-          <w:p>
-            <w:pPr>
-              <w:jc w:val="center"/>
-            </w:pPr>
-            <w:r>
-              <w:rPr>
-                <w:sz w:val="15"/>
-              </w:rPr>
-              <w:t>2</w:t>
-            </w:r>
-          </w:p>
-        </w:tc>
-        <w:tc>
-          <w:tcPr>
-            <w:tcW w:type="dxa" w:w="2592"/>
-            <w:shd w:fill="FAFAFC"/>
-            <w:tcMar>
-              <w:top w:w="80" w:type="dxa"/>
-              <w:bottom w:w="80" w:type="dxa"/>
-              <w:left w:w="100" w:type="dxa"/>
-              <w:right w:w="100" w:type="dxa"/>
-            </w:tcMar>
-          </w:tcPr>
-          <w:p>
-            <w:r>
-              <w:rPr>
-                <w:sz w:val="15"/>
-              </w:rPr>
-              <w:t>Frontend Toàn Diện (Next.js 14 Monorepo)</w:t>
-            </w:r>
-          </w:p>
-        </w:tc>
-        <w:tc>
-          <w:tcPr>
-            <w:tcW w:type="dxa" w:w="3312"/>
-            <w:shd w:fill="FAFAFC"/>
-            <w:tcMar>
-              <w:top w:w="80" w:type="dxa"/>
-              <w:bottom w:w="80" w:type="dxa"/>
-              <w:left w:w="100" w:type="dxa"/>
-              <w:right w:w="100" w:type="dxa"/>
-            </w:tcMar>
-          </w:tcPr>
-          <w:p>
-            <w:r>
-              <w:rPr>
-                <w:sz w:val="15"/>
-              </w:rPr>
-              <w:t>5 Route Groups: (customer) Mobile PWA, (kds) Bếp Dark Mode, (staff) POS Thu ngân, (manager) Portal Quản lý, (admin) Dashboard Chuỗi</w:t>
-            </w:r>
-          </w:p>
-        </w:tc>
-        <w:tc>
-          <w:tcPr>
-            <w:tcW w:type="dxa" w:w="576"/>
-            <w:shd w:fill="FAFAFC"/>
-            <w:tcMar>
-              <w:top w:w="80" w:type="dxa"/>
-              <w:bottom w:w="80" w:type="dxa"/>
-              <w:left w:w="100" w:type="dxa"/>
-              <w:right w:w="100" w:type="dxa"/>
-            </w:tcMar>
-          </w:tcPr>
-          <w:p>
-            <w:pPr>
-              <w:jc w:val="center"/>
-            </w:pPr>
-            <w:r>
-              <w:rPr>
-                <w:sz w:val="15"/>
-              </w:rPr>
-              <w:t>Gói</w:t>
-            </w:r>
-          </w:p>
-        </w:tc>
-        <w:tc>
-          <w:tcPr>
-            <w:tcW w:type="dxa" w:w="432"/>
-            <w:shd w:fill="FAFAFC"/>
-            <w:tcMar>
-              <w:top w:w="80" w:type="dxa"/>
-              <w:bottom w:w="80" w:type="dxa"/>
-              <w:left w:w="100" w:type="dxa"/>
-              <w:right w:w="100" w:type="dxa"/>
-            </w:tcMar>
-          </w:tcPr>
-          <w:p>
-            <w:pPr>
-              <w:jc w:val="center"/>
-            </w:pPr>
-            <w:r>
-              <w:rPr>
-                <w:sz w:val="15"/>
-              </w:rPr>
-              <w:t>1</w:t>
-            </w:r>
-          </w:p>
-        </w:tc>
-        <w:tc>
-          <w:tcPr>
-            <w:tcW w:type="dxa" w:w="1296"/>
-            <w:shd w:fill="FAFAFC"/>
-            <w:tcMar>
-              <w:top w:w="80" w:type="dxa"/>
-              <w:bottom w:w="80" w:type="dxa"/>
-              <w:left w:w="100" w:type="dxa"/>
-              <w:right w:w="100" w:type="dxa"/>
-            </w:tcMar>
-          </w:tcPr>
-          <w:p>
-            <w:pPr>
-              <w:jc w:val="right"/>
-            </w:pPr>
-            <w:r>
-              <w:rPr>
-                <w:b w:val="0"/>
-                <w:sz w:val="15"/>
-              </w:rPr>
-              <w:t>4.000.000</w:t>
-            </w:r>
-          </w:p>
-        </w:tc>
-        <w:tc>
-          <w:tcPr>
-            <w:tcW w:type="dxa" w:w="1296"/>
-            <w:shd w:fill="FAFAFC"/>
-            <w:tcMar>
-              <w:top w:w="80" w:type="dxa"/>
-              <w:bottom w:w="80" w:type="dxa"/>
-              <w:left w:w="100" w:type="dxa"/>
-              <w:right w:w="100" w:type="dxa"/>
-            </w:tcMar>
-          </w:tcPr>
-          <w:p>
-            <w:pPr>
-              <w:jc w:val="right"/>
-            </w:pPr>
-            <w:r>
-              <w:rPr>
-                <w:b/>
-                <w:sz w:val="15"/>
-              </w:rPr>
-              <w:t>4.000.000</w:t>
-            </w:r>
-          </w:p>
-        </w:tc>
-      </w:tr>
-      <w:tr>
-        <w:tc>
-          <w:tcPr>
-            <w:tcW w:type="dxa" w:w="576"/>
-            <w:tcMar>
-              <w:top w:w="80" w:type="dxa"/>
-              <w:bottom w:w="80" w:type="dxa"/>
-              <w:left w:w="100" w:type="dxa"/>
-              <w:right w:w="100" w:type="dxa"/>
-            </w:tcMar>
-          </w:tcPr>
-          <w:p>
-            <w:pPr>
-              <w:jc w:val="center"/>
-            </w:pPr>
-            <w:r>
-              <w:rPr>
-                <w:sz w:val="15"/>
-              </w:rPr>
-              <w:t>3</w:t>
-            </w:r>
-          </w:p>
-        </w:tc>
-        <w:tc>
-          <w:tcPr>
-            <w:tcW w:type="dxa" w:w="2592"/>
-            <w:tcMar>
-              <w:top w:w="80" w:type="dxa"/>
-              <w:bottom w:w="80" w:type="dxa"/>
-              <w:left w:w="100" w:type="dxa"/>
-              <w:right w:w="100" w:type="dxa"/>
-            </w:tcMar>
-          </w:tcPr>
-          <w:p>
-            <w:r>
-              <w:rPr>
-                <w:sz w:val="15"/>
-              </w:rPr>
-              <w:t>Cơ Sở Dữ Liệu (PostgreSQL 16 &amp; DDL 3NF)</w:t>
-            </w:r>
-          </w:p>
-        </w:tc>
-        <w:tc>
-          <w:tcPr>
-            <w:tcW w:type="dxa" w:w="3312"/>
-            <w:tcMar>
-              <w:top w:w="80" w:type="dxa"/>
-              <w:bottom w:w="80" w:type="dxa"/>
-              <w:left w:w="100" w:type="dxa"/>
-              <w:right w:w="100" w:type="dxa"/>
-            </w:tcMar>
-          </w:tcPr>
-          <w:p>
-            <w:r>
-              <w:rPr>
-                <w:sz w:val="15"/>
-              </w:rPr>
-              <w:t>30 Bảng thực thể chuẩn hóa 3NF (bao gồm seasonal_menus, cash_shifts Z-Report), Composite Indexes, Triggers trừ tồn kho BOM</w:t>
-            </w:r>
-          </w:p>
-        </w:tc>
-        <w:tc>
-          <w:tcPr>
-            <w:tcW w:type="dxa" w:w="576"/>
-            <w:tcMar>
-              <w:top w:w="80" w:type="dxa"/>
-              <w:bottom w:w="80" w:type="dxa"/>
-              <w:left w:w="100" w:type="dxa"/>
-              <w:right w:w="100" w:type="dxa"/>
-            </w:tcMar>
-          </w:tcPr>
-          <w:p>
-            <w:pPr>
-              <w:jc w:val="center"/>
-            </w:pPr>
-            <w:r>
-              <w:rPr>
-                <w:sz w:val="15"/>
-              </w:rPr>
-              <w:t>Gói</w:t>
-            </w:r>
-          </w:p>
-        </w:tc>
-        <w:tc>
-          <w:tcPr>
-            <w:tcW w:type="dxa" w:w="432"/>
-            <w:tcMar>
-              <w:top w:w="80" w:type="dxa"/>
-              <w:bottom w:w="80" w:type="dxa"/>
-              <w:left w:w="100" w:type="dxa"/>
-              <w:right w:w="100" w:type="dxa"/>
-            </w:tcMar>
-          </w:tcPr>
-          <w:p>
-            <w:pPr>
-              <w:jc w:val="center"/>
-            </w:pPr>
-            <w:r>
-              <w:rPr>
-                <w:sz w:val="15"/>
-              </w:rPr>
-              <w:t>1</w:t>
-            </w:r>
-          </w:p>
-        </w:tc>
-        <w:tc>
-          <w:tcPr>
-            <w:tcW w:type="dxa" w:w="1296"/>
-            <w:tcMar>
-              <w:top w:w="80" w:type="dxa"/>
-              <w:bottom w:w="80" w:type="dxa"/>
-              <w:left w:w="100" w:type="dxa"/>
-              <w:right w:w="100" w:type="dxa"/>
-            </w:tcMar>
-          </w:tcPr>
-          <w:p>
-            <w:pPr>
-              <w:jc w:val="right"/>
-            </w:pPr>
-            <w:r>
-              <w:rPr>
-                <w:b w:val="0"/>
-                <w:sz w:val="15"/>
-              </w:rPr>
-              <w:t>1.000.000</w:t>
-            </w:r>
-          </w:p>
-        </w:tc>
-        <w:tc>
-          <w:tcPr>
-            <w:tcW w:type="dxa" w:w="1296"/>
-            <w:tcMar>
-              <w:top w:w="80" w:type="dxa"/>
-              <w:bottom w:w="80" w:type="dxa"/>
-              <w:left w:w="100" w:type="dxa"/>
-              <w:right w:w="100" w:type="dxa"/>
-            </w:tcMar>
-          </w:tcPr>
-          <w:p>
-            <w:pPr>
-              <w:jc w:val="right"/>
-            </w:pPr>
-            <w:r>
-              <w:rPr>
-                <w:b/>
-                <w:sz w:val="15"/>
-              </w:rPr>
-              <w:t>1.000.000</w:t>
-            </w:r>
-          </w:p>
-        </w:tc>
-      </w:tr>
-      <w:tr>
-        <w:tc>
-          <w:tcPr>
-            <w:tcW w:type="dxa" w:w="576"/>
-            <w:shd w:fill="FAFAFC"/>
-            <w:tcMar>
-              <w:top w:w="80" w:type="dxa"/>
-              <w:bottom w:w="80" w:type="dxa"/>
-              <w:left w:w="100" w:type="dxa"/>
-              <w:right w:w="100" w:type="dxa"/>
-            </w:tcMar>
-          </w:tcPr>
-          <w:p>
-            <w:pPr>
-              <w:jc w:val="center"/>
-            </w:pPr>
-            <w:r>
-              <w:rPr>
-                <w:sz w:val="15"/>
-              </w:rPr>
-              <w:t>4</w:t>
-            </w:r>
-          </w:p>
-        </w:tc>
-        <w:tc>
-          <w:tcPr>
-            <w:tcW w:type="dxa" w:w="2592"/>
-            <w:shd w:fill="FAFAFC"/>
-            <w:tcMar>
-              <w:top w:w="80" w:type="dxa"/>
-              <w:bottom w:w="80" w:type="dxa"/>
-              <w:left w:w="100" w:type="dxa"/>
-              <w:right w:w="100" w:type="dxa"/>
-            </w:tcMar>
-          </w:tcPr>
-          <w:p>
-            <w:r>
-              <w:rPr>
-                <w:sz w:val="15"/>
-              </w:rPr>
-              <w:t>Tích Hợp Cổng VietQR (PayOS Gateway)</w:t>
-            </w:r>
-          </w:p>
-        </w:tc>
-        <w:tc>
-          <w:tcPr>
-            <w:tcW w:type="dxa" w:w="3312"/>
-            <w:shd w:fill="FAFAFC"/>
-            <w:tcMar>
-              <w:top w:w="80" w:type="dxa"/>
-              <w:bottom w:w="80" w:type="dxa"/>
-              <w:left w:w="100" w:type="dxa"/>
-              <w:right w:w="100" w:type="dxa"/>
-            </w:tcMar>
-          </w:tcPr>
-          <w:p>
-            <w:r>
-              <w:rPr>
-                <w:sz w:val="15"/>
-              </w:rPr>
-              <w:t>Sinh mã VietQR động theo đơn (Dine-in Nhánh A/B, Delivery), Webhook HMAC-SHA256 xác thực tự động, cơ chế Idempotency chống trùng</w:t>
-            </w:r>
-          </w:p>
-        </w:tc>
-        <w:tc>
-          <w:tcPr>
-            <w:tcW w:type="dxa" w:w="576"/>
-            <w:shd w:fill="FAFAFC"/>
-            <w:tcMar>
-              <w:top w:w="80" w:type="dxa"/>
-              <w:bottom w:w="80" w:type="dxa"/>
-              <w:left w:w="100" w:type="dxa"/>
-              <w:right w:w="100" w:type="dxa"/>
-            </w:tcMar>
-          </w:tcPr>
-          <w:p>
-            <w:pPr>
-              <w:jc w:val="center"/>
-            </w:pPr>
-            <w:r>
-              <w:rPr>
-                <w:sz w:val="15"/>
-              </w:rPr>
-              <w:t>Gói</w:t>
-            </w:r>
-          </w:p>
-        </w:tc>
-        <w:tc>
-          <w:tcPr>
-            <w:tcW w:type="dxa" w:w="432"/>
-            <w:shd w:fill="FAFAFC"/>
-            <w:tcMar>
-              <w:top w:w="80" w:type="dxa"/>
-              <w:bottom w:w="80" w:type="dxa"/>
-              <w:left w:w="100" w:type="dxa"/>
-              <w:right w:w="100" w:type="dxa"/>
-            </w:tcMar>
-          </w:tcPr>
-          <w:p>
-            <w:pPr>
-              <w:jc w:val="center"/>
-            </w:pPr>
-            <w:r>
-              <w:rPr>
-                <w:sz w:val="15"/>
-              </w:rPr>
-              <w:t>1</w:t>
-            </w:r>
-          </w:p>
-        </w:tc>
-        <w:tc>
-          <w:tcPr>
-            <w:tcW w:type="dxa" w:w="1296"/>
-            <w:shd w:fill="FAFAFC"/>
-            <w:tcMar>
-              <w:top w:w="80" w:type="dxa"/>
-              <w:bottom w:w="80" w:type="dxa"/>
-              <w:left w:w="100" w:type="dxa"/>
-              <w:right w:w="100" w:type="dxa"/>
-            </w:tcMar>
-          </w:tcPr>
-          <w:p>
-            <w:pPr>
-              <w:jc w:val="right"/>
-            </w:pPr>
-            <w:r>
-              <w:rPr>
-                <w:b w:val="0"/>
-                <w:sz w:val="15"/>
-              </w:rPr>
-              <w:t>1.000.000</w:t>
-            </w:r>
-          </w:p>
-        </w:tc>
-        <w:tc>
-          <w:tcPr>
-            <w:tcW w:type="dxa" w:w="1296"/>
-            <w:shd w:fill="FAFAFC"/>
-            <w:tcMar>
-              <w:top w:w="80" w:type="dxa"/>
-              <w:bottom w:w="80" w:type="dxa"/>
-              <w:left w:w="100" w:type="dxa"/>
-              <w:right w:w="100" w:type="dxa"/>
-            </w:tcMar>
-          </w:tcPr>
-          <w:p>
-            <w:pPr>
-              <w:jc w:val="right"/>
-            </w:pPr>
-            <w:r>
-              <w:rPr>
-                <w:b/>
-                <w:sz w:val="15"/>
-              </w:rPr>
-              <w:t>1.000.000</w:t>
-            </w:r>
-          </w:p>
-        </w:tc>
-      </w:tr>
-      <w:tr>
-        <w:tc>
-          <w:tcPr>
-            <w:tcW w:type="dxa" w:w="576"/>
-            <w:tcMar>
-              <w:top w:w="80" w:type="dxa"/>
-              <w:bottom w:w="80" w:type="dxa"/>
-              <w:left w:w="100" w:type="dxa"/>
-              <w:right w:w="100" w:type="dxa"/>
-            </w:tcMar>
-          </w:tcPr>
-          <w:p>
-            <w:pPr>
-              <w:jc w:val="center"/>
-            </w:pPr>
-            <w:r>
-              <w:rPr>
-                <w:sz w:val="15"/>
-              </w:rPr>
-              <w:t>5</w:t>
-            </w:r>
-          </w:p>
-        </w:tc>
-        <w:tc>
-          <w:tcPr>
-            <w:tcW w:type="dxa" w:w="2592"/>
-            <w:tcMar>
-              <w:top w:w="80" w:type="dxa"/>
-              <w:bottom w:w="80" w:type="dxa"/>
-              <w:left w:w="100" w:type="dxa"/>
-              <w:right w:w="100" w:type="dxa"/>
-            </w:tcMar>
-          </w:tcPr>
-          <w:p>
-            <w:r>
-              <w:rPr>
-                <w:sz w:val="15"/>
-              </w:rPr>
-              <w:t>Module AI-1: Chatbot Tư Vấn Món (Gemini RAG)</w:t>
-            </w:r>
-          </w:p>
-        </w:tc>
-        <w:tc>
-          <w:tcPr>
-            <w:tcW w:type="dxa" w:w="3312"/>
-            <w:tcMar>
-              <w:top w:w="80" w:type="dxa"/>
-              <w:bottom w:w="80" w:type="dxa"/>
-              <w:left w:w="100" w:type="dxa"/>
-              <w:right w:w="100" w:type="dxa"/>
-            </w:tcMar>
-          </w:tcPr>
-          <w:p>
-            <w:r>
-              <w:rPr>
-                <w:sz w:val="15"/>
-              </w:rPr>
-              <w:t>Tích hợp Google Gemini 1.5 Flash SDK qua C# API Gateway, RAG Pipeline đọc thực đơn, khẩu vị, cảnh báo dị ứng, thời tiết thời gian thực</w:t>
-            </w:r>
-          </w:p>
-        </w:tc>
-        <w:tc>
-          <w:tcPr>
-            <w:tcW w:type="dxa" w:w="576"/>
-            <w:tcMar>
-              <w:top w:w="80" w:type="dxa"/>
-              <w:bottom w:w="80" w:type="dxa"/>
-              <w:left w:w="100" w:type="dxa"/>
-              <w:right w:w="100" w:type="dxa"/>
-            </w:tcMar>
-          </w:tcPr>
-          <w:p>
-            <w:pPr>
-              <w:jc w:val="center"/>
-            </w:pPr>
-            <w:r>
-              <w:rPr>
-                <w:sz w:val="15"/>
-              </w:rPr>
-              <w:t>Gói</w:t>
-            </w:r>
-          </w:p>
-        </w:tc>
-        <w:tc>
-          <w:tcPr>
-            <w:tcW w:type="dxa" w:w="432"/>
-            <w:tcMar>
-              <w:top w:w="80" w:type="dxa"/>
-              <w:bottom w:w="80" w:type="dxa"/>
-              <w:left w:w="100" w:type="dxa"/>
-              <w:right w:w="100" w:type="dxa"/>
-            </w:tcMar>
-          </w:tcPr>
-          <w:p>
-            <w:pPr>
-              <w:jc w:val="center"/>
-            </w:pPr>
-            <w:r>
-              <w:rPr>
-                <w:sz w:val="15"/>
-              </w:rPr>
-              <w:t>1</w:t>
-            </w:r>
-          </w:p>
-        </w:tc>
-        <w:tc>
-          <w:tcPr>
-            <w:tcW w:type="dxa" w:w="1296"/>
-            <w:tcMar>
-              <w:top w:w="80" w:type="dxa"/>
-              <w:bottom w:w="80" w:type="dxa"/>
-              <w:left w:w="100" w:type="dxa"/>
-              <w:right w:w="100" w:type="dxa"/>
-            </w:tcMar>
-          </w:tcPr>
-          <w:p>
-            <w:pPr>
-              <w:jc w:val="right"/>
-            </w:pPr>
-            <w:r>
-              <w:rPr>
-                <w:b w:val="0"/>
-                <w:sz w:val="15"/>
-              </w:rPr>
-              <w:t>1.000.000</w:t>
-            </w:r>
-          </w:p>
-        </w:tc>
-        <w:tc>
-          <w:tcPr>
-            <w:tcW w:type="dxa" w:w="1296"/>
-            <w:tcMar>
-              <w:top w:w="80" w:type="dxa"/>
-              <w:bottom w:w="80" w:type="dxa"/>
-              <w:left w:w="100" w:type="dxa"/>
-              <w:right w:w="100" w:type="dxa"/>
-            </w:tcMar>
-          </w:tcPr>
-          <w:p>
-            <w:pPr>
-              <w:jc w:val="right"/>
-            </w:pPr>
-            <w:r>
-              <w:rPr>
-                <w:b/>
-                <w:sz w:val="15"/>
-              </w:rPr>
-              <w:t>1.000.000</w:t>
-            </w:r>
-          </w:p>
-        </w:tc>
-      </w:tr>
-      <w:tr>
-        <w:tc>
-          <w:tcPr>
-            <w:tcW w:type="dxa" w:w="576"/>
-            <w:shd w:fill="FAFAFC"/>
-            <w:tcMar>
-              <w:top w:w="80" w:type="dxa"/>
-              <w:bottom w:w="80" w:type="dxa"/>
-              <w:left w:w="100" w:type="dxa"/>
-              <w:right w:w="100" w:type="dxa"/>
-            </w:tcMar>
-          </w:tcPr>
-          <w:p>
-            <w:pPr>
-              <w:jc w:val="center"/>
-            </w:pPr>
-            <w:r>
-              <w:rPr>
-                <w:sz w:val="15"/>
-              </w:rPr>
-              <w:t>6</w:t>
-            </w:r>
-          </w:p>
-        </w:tc>
-        <w:tc>
-          <w:tcPr>
-            <w:tcW w:type="dxa" w:w="2592"/>
-            <w:shd w:fill="FAFAFC"/>
-            <w:tcMar>
-              <w:top w:w="80" w:type="dxa"/>
-              <w:bottom w:w="80" w:type="dxa"/>
-              <w:left w:w="100" w:type="dxa"/>
-              <w:right w:w="100" w:type="dxa"/>
-            </w:tcMar>
-          </w:tcPr>
-          <w:p>
-            <w:r>
-              <w:rPr>
-                <w:sz w:val="15"/>
-              </w:rPr>
-              <w:t>Module AI-2: Đề Xuất Combo (Apriori Engine)</w:t>
-            </w:r>
-          </w:p>
-        </w:tc>
-        <w:tc>
-          <w:tcPr>
-            <w:tcW w:type="dxa" w:w="3312"/>
-            <w:shd w:fill="FAFAFC"/>
-            <w:tcMar>
-              <w:top w:w="80" w:type="dxa"/>
-              <w:bottom w:w="80" w:type="dxa"/>
-              <w:left w:w="100" w:type="dxa"/>
-              <w:right w:w="100" w:type="dxa"/>
-            </w:tcMar>
-          </w:tcPr>
-          <w:p>
-            <w:r>
-              <w:rPr>
-                <w:sz w:val="15"/>
-              </w:rPr>
-              <w:t>Thuật toán khai phá luật kết hợp Apriori/FP-Growth trên lịch sử giỏ hàng, đánh giá Support/Confidence/Lift, UI duyệt combo cho Admin</w:t>
-            </w:r>
-          </w:p>
-        </w:tc>
-        <w:tc>
-          <w:tcPr>
-            <w:tcW w:type="dxa" w:w="576"/>
-            <w:shd w:fill="FAFAFC"/>
-            <w:tcMar>
-              <w:top w:w="80" w:type="dxa"/>
-              <w:bottom w:w="80" w:type="dxa"/>
-              <w:left w:w="100" w:type="dxa"/>
-              <w:right w:w="100" w:type="dxa"/>
-            </w:tcMar>
-          </w:tcPr>
-          <w:p>
-            <w:pPr>
-              <w:jc w:val="center"/>
-            </w:pPr>
-            <w:r>
-              <w:rPr>
-                <w:sz w:val="15"/>
-              </w:rPr>
-              <w:t>Gói</w:t>
-            </w:r>
-          </w:p>
-        </w:tc>
-        <w:tc>
-          <w:tcPr>
-            <w:tcW w:type="dxa" w:w="432"/>
-            <w:shd w:fill="FAFAFC"/>
-            <w:tcMar>
-              <w:top w:w="80" w:type="dxa"/>
-              <w:bottom w:w="80" w:type="dxa"/>
-              <w:left w:w="100" w:type="dxa"/>
-              <w:right w:w="100" w:type="dxa"/>
-            </w:tcMar>
-          </w:tcPr>
-          <w:p>
-            <w:pPr>
-              <w:jc w:val="center"/>
-            </w:pPr>
-            <w:r>
-              <w:rPr>
-                <w:sz w:val="15"/>
-              </w:rPr>
-              <w:t>1</w:t>
-            </w:r>
-          </w:p>
-        </w:tc>
-        <w:tc>
-          <w:tcPr>
-            <w:tcW w:type="dxa" w:w="1296"/>
-            <w:shd w:fill="FAFAFC"/>
-            <w:tcMar>
-              <w:top w:w="80" w:type="dxa"/>
-              <w:bottom w:w="80" w:type="dxa"/>
-              <w:left w:w="100" w:type="dxa"/>
-              <w:right w:w="100" w:type="dxa"/>
-            </w:tcMar>
-          </w:tcPr>
-          <w:p>
-            <w:pPr>
-              <w:jc w:val="right"/>
-            </w:pPr>
-            <w:r>
-              <w:rPr>
-                <w:b w:val="0"/>
-                <w:sz w:val="15"/>
-              </w:rPr>
-              <w:t>1.000.000</w:t>
-            </w:r>
-          </w:p>
-        </w:tc>
-        <w:tc>
-          <w:tcPr>
-            <w:tcW w:type="dxa" w:w="1296"/>
-            <w:shd w:fill="FAFAFC"/>
-            <w:tcMar>
-              <w:top w:w="80" w:type="dxa"/>
-              <w:bottom w:w="80" w:type="dxa"/>
-              <w:left w:w="100" w:type="dxa"/>
-              <w:right w:w="100" w:type="dxa"/>
-            </w:tcMar>
-          </w:tcPr>
-          <w:p>
-            <w:pPr>
-              <w:jc w:val="right"/>
-            </w:pPr>
-            <w:r>
-              <w:rPr>
-                <w:b/>
-                <w:sz w:val="15"/>
-              </w:rPr>
-              <w:t>1.000.000</w:t>
-            </w:r>
-          </w:p>
-        </w:tc>
-      </w:tr>
-      <w:tr>
-        <w:tc>
-          <w:tcPr>
-            <w:tcW w:type="dxa" w:w="576"/>
-            <w:tcMar>
-              <w:top w:w="80" w:type="dxa"/>
-              <w:bottom w:w="80" w:type="dxa"/>
-              <w:left w:w="100" w:type="dxa"/>
-              <w:right w:w="100" w:type="dxa"/>
-            </w:tcMar>
-          </w:tcPr>
-          <w:p>
-            <w:pPr>
-              <w:jc w:val="center"/>
-            </w:pPr>
-            <w:r>
-              <w:rPr>
-                <w:sz w:val="15"/>
-              </w:rPr>
-              <w:t>7</w:t>
-            </w:r>
-          </w:p>
-        </w:tc>
-        <w:tc>
-          <w:tcPr>
-            <w:tcW w:type="dxa" w:w="2592"/>
-            <w:tcMar>
-              <w:top w:w="80" w:type="dxa"/>
-              <w:bottom w:w="80" w:type="dxa"/>
-              <w:left w:w="100" w:type="dxa"/>
-              <w:right w:w="100" w:type="dxa"/>
-            </w:tcMar>
-          </w:tcPr>
-          <w:p>
-            <w:r>
-              <w:rPr>
-                <w:sz w:val="15"/>
-              </w:rPr>
-              <w:t>Chấm Công Khóa Mạng WiFi (WiFi-Locked HRM)</w:t>
-            </w:r>
-          </w:p>
-        </w:tc>
-        <w:tc>
-          <w:tcPr>
-            <w:tcW w:type="dxa" w:w="3312"/>
-            <w:tcMar>
-              <w:top w:w="80" w:type="dxa"/>
-              <w:bottom w:w="80" w:type="dxa"/>
-              <w:left w:w="100" w:type="dxa"/>
-              <w:right w:w="100" w:type="dxa"/>
-            </w:tcMar>
-          </w:tcPr>
-          <w:p>
-            <w:r>
-              <w:rPr>
-                <w:sz w:val="15"/>
-              </w:rPr>
-              <w:t>Xác thực 2 lớp: BSSID Access Point / IP Subnet nội bộ chi nhánh + Mã số nhân viên, chặn mạng 4G/5G, xuất báo cáo công Excel</w:t>
-            </w:r>
-          </w:p>
-        </w:tc>
-        <w:tc>
-          <w:tcPr>
-            <w:tcW w:type="dxa" w:w="576"/>
-            <w:tcMar>
-              <w:top w:w="80" w:type="dxa"/>
-              <w:bottom w:w="80" w:type="dxa"/>
-              <w:left w:w="100" w:type="dxa"/>
-              <w:right w:w="100" w:type="dxa"/>
-            </w:tcMar>
-          </w:tcPr>
-          <w:p>
-            <w:pPr>
-              <w:jc w:val="center"/>
-            </w:pPr>
-            <w:r>
-              <w:rPr>
-                <w:sz w:val="15"/>
-              </w:rPr>
-              <w:t>Gói</w:t>
-            </w:r>
-          </w:p>
-        </w:tc>
-        <w:tc>
-          <w:tcPr>
-            <w:tcW w:type="dxa" w:w="432"/>
-            <w:tcMar>
-              <w:top w:w="80" w:type="dxa"/>
-              <w:bottom w:w="80" w:type="dxa"/>
-              <w:left w:w="100" w:type="dxa"/>
-              <w:right w:w="100" w:type="dxa"/>
-            </w:tcMar>
-          </w:tcPr>
-          <w:p>
-            <w:pPr>
-              <w:jc w:val="center"/>
-            </w:pPr>
-            <w:r>
-              <w:rPr>
-                <w:sz w:val="15"/>
-              </w:rPr>
-              <w:t>1</w:t>
-            </w:r>
-          </w:p>
-        </w:tc>
-        <w:tc>
-          <w:tcPr>
-            <w:tcW w:type="dxa" w:w="1296"/>
-            <w:tcMar>
-              <w:top w:w="80" w:type="dxa"/>
-              <w:bottom w:w="80" w:type="dxa"/>
-              <w:left w:w="100" w:type="dxa"/>
-              <w:right w:w="100" w:type="dxa"/>
-            </w:tcMar>
-          </w:tcPr>
-          <w:p>
-            <w:pPr>
-              <w:jc w:val="right"/>
-            </w:pPr>
-            <w:r>
-              <w:rPr>
-                <w:b w:val="0"/>
-                <w:sz w:val="15"/>
-              </w:rPr>
-              <w:t>500.000</w:t>
-            </w:r>
-          </w:p>
-        </w:tc>
-        <w:tc>
-          <w:tcPr>
-            <w:tcW w:type="dxa" w:w="1296"/>
-            <w:tcMar>
-              <w:top w:w="80" w:type="dxa"/>
-              <w:bottom w:w="80" w:type="dxa"/>
-              <w:left w:w="100" w:type="dxa"/>
-              <w:right w:w="100" w:type="dxa"/>
-            </w:tcMar>
-          </w:tcPr>
-          <w:p>
-            <w:pPr>
-              <w:jc w:val="right"/>
-            </w:pPr>
-            <w:r>
-              <w:rPr>
-                <w:b/>
-                <w:sz w:val="15"/>
-              </w:rPr>
-              <w:t>500.000</w:t>
-            </w:r>
-          </w:p>
-        </w:tc>
-      </w:tr>
-      <w:tr>
-        <w:tc>
-          <w:tcPr>
-            <w:tcW w:type="dxa" w:w="576"/>
-            <w:shd w:fill="FAFAFC"/>
-            <w:tcMar>
-              <w:top w:w="80" w:type="dxa"/>
-              <w:bottom w:w="80" w:type="dxa"/>
-              <w:left w:w="100" w:type="dxa"/>
-              <w:right w:w="100" w:type="dxa"/>
-            </w:tcMar>
-          </w:tcPr>
-          <w:p>
-            <w:pPr>
-              <w:jc w:val="center"/>
-            </w:pPr>
-            <w:r>
-              <w:rPr>
-                <w:sz w:val="15"/>
-              </w:rPr>
-              <w:t>8</w:t>
-            </w:r>
-          </w:p>
-        </w:tc>
-        <w:tc>
-          <w:tcPr>
-            <w:tcW w:type="dxa" w:w="2592"/>
-            <w:shd w:fill="FAFAFC"/>
-            <w:tcMar>
-              <w:top w:w="80" w:type="dxa"/>
-              <w:bottom w:w="80" w:type="dxa"/>
-              <w:left w:w="100" w:type="dxa"/>
-              <w:right w:w="100" w:type="dxa"/>
-            </w:tcMar>
-          </w:tcPr>
-          <w:p>
-            <w:r>
-              <w:rPr>
-                <w:sz w:val="15"/>
-              </w:rPr>
-              <w:t>Thiết Kế UI/UX Design System &amp; Wireframes</w:t>
-            </w:r>
-          </w:p>
-        </w:tc>
-        <w:tc>
-          <w:tcPr>
-            <w:tcW w:type="dxa" w:w="3312"/>
-            <w:shd w:fill="FAFAFC"/>
-            <w:tcMar>
-              <w:top w:w="80" w:type="dxa"/>
-              <w:bottom w:w="80" w:type="dxa"/>
-              <w:left w:w="100" w:type="dxa"/>
-              <w:right w:w="100" w:type="dxa"/>
-            </w:tcMar>
-          </w:tcPr>
-          <w:p>
-            <w:r>
-              <w:rPr>
-                <w:sz w:val="15"/>
-              </w:rPr>
-              <w:t>Bộ Design Tokens F&amp;B, WCAG AA Contrast, 15 Wireframes chi tiết cho 4 phân hệ (Menu PWA, KDS BOM Drawer, Z-Report Modal, POS...)</w:t>
-            </w:r>
-          </w:p>
-        </w:tc>
-        <w:tc>
-          <w:tcPr>
-            <w:tcW w:type="dxa" w:w="576"/>
-            <w:shd w:fill="FAFAFC"/>
-            <w:tcMar>
-              <w:top w:w="80" w:type="dxa"/>
-              <w:bottom w:w="80" w:type="dxa"/>
-              <w:left w:w="100" w:type="dxa"/>
-              <w:right w:w="100" w:type="dxa"/>
-            </w:tcMar>
-          </w:tcPr>
-          <w:p>
-            <w:pPr>
-              <w:jc w:val="center"/>
-            </w:pPr>
-            <w:r>
-              <w:rPr>
-                <w:sz w:val="15"/>
-              </w:rPr>
-              <w:t>Gói</w:t>
-            </w:r>
-          </w:p>
-        </w:tc>
-        <w:tc>
-          <w:tcPr>
-            <w:tcW w:type="dxa" w:w="432"/>
-            <w:shd w:fill="FAFAFC"/>
-            <w:tcMar>
-              <w:top w:w="80" w:type="dxa"/>
-              <w:bottom w:w="80" w:type="dxa"/>
-              <w:left w:w="100" w:type="dxa"/>
-              <w:right w:w="100" w:type="dxa"/>
-            </w:tcMar>
-          </w:tcPr>
-          <w:p>
-            <w:pPr>
-              <w:jc w:val="center"/>
-            </w:pPr>
-            <w:r>
-              <w:rPr>
-                <w:sz w:val="15"/>
-              </w:rPr>
-              <w:t>1</w:t>
-            </w:r>
-          </w:p>
-        </w:tc>
-        <w:tc>
-          <w:tcPr>
-            <w:tcW w:type="dxa" w:w="1296"/>
-            <w:shd w:fill="FAFAFC"/>
-            <w:tcMar>
-              <w:top w:w="80" w:type="dxa"/>
-              <w:bottom w:w="80" w:type="dxa"/>
-              <w:left w:w="100" w:type="dxa"/>
-              <w:right w:w="100" w:type="dxa"/>
-            </w:tcMar>
-          </w:tcPr>
-          <w:p>
-            <w:pPr>
-              <w:jc w:val="right"/>
-            </w:pPr>
-            <w:r>
-              <w:rPr>
-                <w:b w:val="0"/>
-                <w:sz w:val="15"/>
-              </w:rPr>
-              <w:t>500.000</w:t>
-            </w:r>
-          </w:p>
-        </w:tc>
-        <w:tc>
-          <w:tcPr>
-            <w:tcW w:type="dxa" w:w="1296"/>
-            <w:shd w:fill="FAFAFC"/>
-            <w:tcMar>
-              <w:top w:w="80" w:type="dxa"/>
-              <w:bottom w:w="80" w:type="dxa"/>
-              <w:left w:w="100" w:type="dxa"/>
-              <w:right w:w="100" w:type="dxa"/>
-            </w:tcMar>
-          </w:tcPr>
-          <w:p>
-            <w:pPr>
-              <w:jc w:val="right"/>
-            </w:pPr>
-            <w:r>
-              <w:rPr>
-                <w:b/>
-                <w:sz w:val="15"/>
-              </w:rPr>
-              <w:t>500.000</w:t>
-            </w:r>
-          </w:p>
-        </w:tc>
-      </w:tr>
-      <w:tr>
-        <w:tc>
-          <w:tcPr>
-            <w:tcW w:type="dxa" w:w="576"/>
-            <w:tcMar>
-              <w:top w:w="80" w:type="dxa"/>
-              <w:bottom w:w="80" w:type="dxa"/>
-              <w:left w:w="100" w:type="dxa"/>
-              <w:right w:w="100" w:type="dxa"/>
-            </w:tcMar>
-          </w:tcPr>
-          <w:p>
-            <w:pPr>
-              <w:jc w:val="center"/>
-            </w:pPr>
-            <w:r>
-              <w:rPr>
-                <w:sz w:val="15"/>
-              </w:rPr>
-              <w:t>9</w:t>
-            </w:r>
-          </w:p>
-        </w:tc>
-        <w:tc>
-          <w:tcPr>
-            <w:tcW w:type="dxa" w:w="2592"/>
-            <w:tcMar>
-              <w:top w:w="80" w:type="dxa"/>
-              <w:bottom w:w="80" w:type="dxa"/>
-              <w:left w:w="100" w:type="dxa"/>
-              <w:right w:w="100" w:type="dxa"/>
-            </w:tcMar>
-          </w:tcPr>
-          <w:p>
-            <w:r>
-              <w:rPr>
-                <w:sz w:val="15"/>
-              </w:rPr>
-              <w:t>Kiểm Thử Chất Lượng (QA &amp; Testing Suite)</w:t>
-            </w:r>
-          </w:p>
-        </w:tc>
-        <w:tc>
-          <w:tcPr>
-            <w:tcW w:type="dxa" w:w="3312"/>
-            <w:tcMar>
-              <w:top w:w="80" w:type="dxa"/>
-              <w:bottom w:w="80" w:type="dxa"/>
-              <w:left w:w="100" w:type="dxa"/>
-              <w:right w:w="100" w:type="dxa"/>
-            </w:tcMar>
-          </w:tcPr>
-          <w:p>
-            <w:r>
-              <w:rPr>
-                <w:sz w:val="15"/>
-              </w:rPr>
-              <w:t>38+ Test Cases UAT cho 5 Luồng cốt lõi, Unit Tests xUnit, Integration Tests WebApplicationFactory, kịch bản tải k6 (500 VUs)</w:t>
-            </w:r>
-          </w:p>
-        </w:tc>
-        <w:tc>
-          <w:tcPr>
-            <w:tcW w:type="dxa" w:w="576"/>
-            <w:tcMar>
-              <w:top w:w="80" w:type="dxa"/>
-              <w:bottom w:w="80" w:type="dxa"/>
-              <w:left w:w="100" w:type="dxa"/>
-              <w:right w:w="100" w:type="dxa"/>
-            </w:tcMar>
-          </w:tcPr>
-          <w:p>
-            <w:pPr>
-              <w:jc w:val="center"/>
-            </w:pPr>
-            <w:r>
-              <w:rPr>
-                <w:sz w:val="15"/>
-              </w:rPr>
-              <w:t>Gói</w:t>
-            </w:r>
-          </w:p>
-        </w:tc>
-        <w:tc>
-          <w:tcPr>
-            <w:tcW w:type="dxa" w:w="432"/>
-            <w:tcMar>
-              <w:top w:w="80" w:type="dxa"/>
-              <w:bottom w:w="80" w:type="dxa"/>
-              <w:left w:w="100" w:type="dxa"/>
-              <w:right w:w="100" w:type="dxa"/>
-            </w:tcMar>
-          </w:tcPr>
-          <w:p>
-            <w:pPr>
-              <w:jc w:val="center"/>
-            </w:pPr>
-            <w:r>
-              <w:rPr>
-                <w:sz w:val="15"/>
-              </w:rPr>
-              <w:t>1</w:t>
-            </w:r>
-          </w:p>
-        </w:tc>
-        <w:tc>
-          <w:tcPr>
-            <w:tcW w:type="dxa" w:w="1296"/>
-            <w:tcMar>
-              <w:top w:w="80" w:type="dxa"/>
-              <w:bottom w:w="80" w:type="dxa"/>
-              <w:left w:w="100" w:type="dxa"/>
-              <w:right w:w="100" w:type="dxa"/>
-            </w:tcMar>
-          </w:tcPr>
-          <w:p>
-            <w:pPr>
-              <w:jc w:val="right"/>
-            </w:pPr>
-            <w:r>
-              <w:rPr>
-                <w:b w:val="0"/>
-                <w:sz w:val="15"/>
-              </w:rPr>
-              <w:t>500.000</w:t>
-            </w:r>
-          </w:p>
-        </w:tc>
-        <w:tc>
-          <w:tcPr>
-            <w:tcW w:type="dxa" w:w="1296"/>
-            <w:tcMar>
-              <w:top w:w="80" w:type="dxa"/>
-              <w:bottom w:w="80" w:type="dxa"/>
-              <w:left w:w="100" w:type="dxa"/>
-              <w:right w:w="100" w:type="dxa"/>
-            </w:tcMar>
-          </w:tcPr>
-          <w:p>
-            <w:pPr>
-              <w:jc w:val="right"/>
-            </w:pPr>
-            <w:r>
-              <w:rPr>
-                <w:b/>
-                <w:sz w:val="15"/>
-              </w:rPr>
-              <w:t>500.000</w:t>
-            </w:r>
-          </w:p>
-        </w:tc>
-      </w:tr>
-      <w:tr>
-        <w:tc>
-          <w:tcPr>
-            <w:tcW w:type="dxa" w:w="576"/>
-            <w:shd w:fill="FAFAFC"/>
-            <w:tcMar>
-              <w:top w:w="80" w:type="dxa"/>
-              <w:bottom w:w="80" w:type="dxa"/>
-              <w:left w:w="100" w:type="dxa"/>
-              <w:right w:w="100" w:type="dxa"/>
-            </w:tcMar>
-          </w:tcPr>
-          <w:p>
-            <w:pPr>
-              <w:jc w:val="center"/>
-            </w:pPr>
-            <w:r>
-              <w:rPr>
-                <w:sz w:val="15"/>
-              </w:rPr>
-              <w:t>10</w:t>
-            </w:r>
-          </w:p>
-        </w:tc>
-        <w:tc>
-          <w:tcPr>
-            <w:tcW w:type="dxa" w:w="2592"/>
-            <w:shd w:fill="FAFAFC"/>
-            <w:tcMar>
-              <w:top w:w="80" w:type="dxa"/>
-              <w:bottom w:w="80" w:type="dxa"/>
-              <w:left w:w="100" w:type="dxa"/>
-              <w:right w:w="100" w:type="dxa"/>
-            </w:tcMar>
-          </w:tcPr>
-          <w:p>
-            <w:r>
-              <w:rPr>
-                <w:sz w:val="15"/>
-              </w:rPr>
-              <w:t>Đóng Gói Docker &amp; CI/CD Deployment</w:t>
-            </w:r>
-          </w:p>
-        </w:tc>
-        <w:tc>
-          <w:tcPr>
-            <w:tcW w:type="dxa" w:w="3312"/>
-            <w:shd w:fill="FAFAFC"/>
-            <w:tcMar>
-              <w:top w:w="80" w:type="dxa"/>
-              <w:bottom w:w="80" w:type="dxa"/>
-              <w:left w:w="100" w:type="dxa"/>
-              <w:right w:w="100" w:type="dxa"/>
-            </w:tcMar>
-          </w:tcPr>
-          <w:p>
-            <w:r>
-              <w:rPr>
-                <w:sz w:val="15"/>
-              </w:rPr>
-              <w:t>Dockerfile đa tầng &amp; Docker Compose 4 containers, Nginx Reverse Proxy, SSL Let's Encrypt tự động, GitHub Actions CI/CD pipeline</w:t>
-            </w:r>
-          </w:p>
-        </w:tc>
-        <w:tc>
-          <w:tcPr>
-            <w:tcW w:type="dxa" w:w="576"/>
-            <w:shd w:fill="FAFAFC"/>
-            <w:tcMar>
-              <w:top w:w="80" w:type="dxa"/>
-              <w:bottom w:w="80" w:type="dxa"/>
-              <w:left w:w="100" w:type="dxa"/>
-              <w:right w:w="100" w:type="dxa"/>
-            </w:tcMar>
-          </w:tcPr>
-          <w:p>
-            <w:pPr>
-              <w:jc w:val="center"/>
-            </w:pPr>
-            <w:r>
-              <w:rPr>
-                <w:sz w:val="15"/>
-              </w:rPr>
-              <w:t>Gói</w:t>
-            </w:r>
-          </w:p>
-        </w:tc>
-        <w:tc>
-          <w:tcPr>
-            <w:tcW w:type="dxa" w:w="432"/>
-            <w:shd w:fill="FAFAFC"/>
-            <w:tcMar>
-              <w:top w:w="80" w:type="dxa"/>
-              <w:bottom w:w="80" w:type="dxa"/>
-              <w:left w:w="100" w:type="dxa"/>
-              <w:right w:w="100" w:type="dxa"/>
-            </w:tcMar>
-          </w:tcPr>
-          <w:p>
-            <w:pPr>
-              <w:jc w:val="center"/>
-            </w:pPr>
-            <w:r>
-              <w:rPr>
-                <w:sz w:val="15"/>
-              </w:rPr>
-              <w:t>1</w:t>
-            </w:r>
-          </w:p>
-        </w:tc>
-        <w:tc>
-          <w:tcPr>
-            <w:tcW w:type="dxa" w:w="1296"/>
-            <w:shd w:fill="FAFAFC"/>
-            <w:tcMar>
-              <w:top w:w="80" w:type="dxa"/>
-              <w:bottom w:w="80" w:type="dxa"/>
-              <w:left w:w="100" w:type="dxa"/>
-              <w:right w:w="100" w:type="dxa"/>
-            </w:tcMar>
-          </w:tcPr>
-          <w:p>
-            <w:pPr>
-              <w:jc w:val="right"/>
-            </w:pPr>
-            <w:r>
-              <w:rPr>
-                <w:b w:val="0"/>
-                <w:sz w:val="15"/>
-              </w:rPr>
-              <w:t>500.000</w:t>
-            </w:r>
-          </w:p>
-        </w:tc>
-        <w:tc>
-          <w:tcPr>
-            <w:tcW w:type="dxa" w:w="1296"/>
-            <w:shd w:fill="FAFAFC"/>
-            <w:tcMar>
-              <w:top w:w="80" w:type="dxa"/>
-              <w:bottom w:w="80" w:type="dxa"/>
-              <w:left w:w="100" w:type="dxa"/>
-              <w:right w:w="100" w:type="dxa"/>
-            </w:tcMar>
-          </w:tcPr>
-          <w:p>
-            <w:pPr>
-              <w:jc w:val="right"/>
-            </w:pPr>
-            <w:r>
-              <w:rPr>
-                <w:b/>
-                <w:sz w:val="15"/>
-              </w:rPr>
-              <w:t>500.000</w:t>
-            </w:r>
-          </w:p>
-        </w:tc>
-      </w:tr>
-      <w:tr>
-        <w:tc>
-          <w:tcPr>
-            <w:tcW w:type="dxa" w:w="1434"/>
-            <w:shd w:fill="FEF3C7"/>
-          </w:tcPr>
-          <w:p/>
-        </w:tc>
-        <w:tc>
-          <w:tcPr>
-            <w:tcW w:type="dxa" w:w="1434"/>
-            <w:shd w:fill="FEF3C7"/>
-          </w:tcPr>
-          <w:p>
-            <w:r>
-              <w:rPr>
-                <w:b/>
-              </w:rPr>
-              <w:t>TỔNG CỘNG CHI PHÍ PHÁT TRIỂN (CAPEX)</w:t>
-            </w:r>
-          </w:p>
-        </w:tc>
-        <w:tc>
-          <w:tcPr>
-            <w:tcW w:type="dxa" w:w="1434"/>
-            <w:shd w:fill="FEF3C7"/>
-          </w:tcPr>
-          <w:p/>
-        </w:tc>
-        <w:tc>
-          <w:tcPr>
-            <w:tcW w:type="dxa" w:w="1434"/>
-            <w:shd w:fill="FEF3C7"/>
-          </w:tcPr>
-          <w:p/>
-        </w:tc>
-        <w:tc>
-          <w:tcPr>
-            <w:tcW w:type="dxa" w:w="1434"/>
-            <w:shd w:fill="FEF3C7"/>
-          </w:tcPr>
-          <w:p/>
-        </w:tc>
-        <w:tc>
-          <w:tcPr>
-            <w:tcW w:type="dxa" w:w="1434"/>
-            <w:shd w:fill="FEF3C7"/>
-          </w:tcPr>
-          <w:p/>
-        </w:tc>
-        <w:tc>
-          <w:tcPr>
-            <w:tcW w:type="dxa" w:w="1434"/>
-            <w:shd w:fill="FEF3C7"/>
-          </w:tcPr>
-          <w:p>
-            <w:pPr>
-              <w:jc w:val="right"/>
-            </w:pPr>
-            <w:r>
-              <w:rPr>
-                <w:b/>
-              </w:rPr>
-              <w:t>15.000.000 VNĐ</w:t>
-            </w:r>
-          </w:p>
-        </w:tc>
-      </w:tr>
-    </w:tbl>
     <w:p>
       <w:r>
         <w:rPr>
+          <w:b/>
+          <w:sz w:val="22"/>
+        </w:rPr>
+        <w:t xml:space="preserve">💰 TỔNG CHI PHÍ PHÁT TRIỂN PHẦN MỀM TRỌN GÓI: </w:t>
+      </w:r>
+      <w:r>
+        <w:rPr>
+          <w:b/>
+          <w:color w:val="B45309"/>
+          <w:sz w:val="24"/>
+        </w:rPr>
+        <w:t>15.000.000 VNĐ</w:t>
+        <w:br/>
+      </w:r>
+      <w:r>
+        <w:rPr>
           <w:i/>
+          <w:sz w:val="19"/>
+        </w:rPr>
+        <w:t>(Bằng chữ: Mười lăm triệu đồng chẵn — Trả một lần duy nhất, sở hữu vĩnh viễn 100% mã nguồn).</w:t>
+      </w:r>
+    </w:p>
+    <w:p>
+      <w:r>
+        <w:rPr>
+          <w:b/>
+        </w:rPr>
+        <w:t>Gói phát triển bao gồm đầy đủ toàn bộ các phân hệ và hạng mục kỹ thuật:</w:t>
+        <w:br/>
+      </w:r>
+    </w:p>
+    <w:p>
+      <w:pPr>
+        <w:ind w:left="288"/>
+      </w:pPr>
+      <w:r>
+        <w:rPr>
+          <w:b/>
           <w:sz w:val="18"/>
         </w:rPr>
-        <w:t>(Bằng chữ: Mười lăm triệu đồng chẵn).</w:t>
+        <w:t xml:space="preserve">1. Hệ thống Backend Lõi: </w:t>
+      </w:r>
+      <w:r>
+        <w:rPr>
+          <w:sz w:val="18"/>
+        </w:rPr>
+        <w:t>Kiến trúc .NET 8 Clean Architecture, CQRS MediatR, SignalR Real-time Hubs, Distributed Locks, phân quyền JWT/RBAC, 10 nhóm Resource RESTful APIs, State Machine 4 kênh bán (Dine-in A/B, Takeaway, Delivery).</w:t>
+      </w:r>
+    </w:p>
+    <w:p>
+      <w:pPr>
+        <w:ind w:left="288"/>
+      </w:pPr>
+      <w:r>
+        <w:rPr>
+          <w:b/>
+          <w:sz w:val="18"/>
+        </w:rPr>
+        <w:t xml:space="preserve">2. Hệ thống Frontend Toàn Diện: </w:t>
+      </w:r>
+      <w:r>
+        <w:rPr>
+          <w:sz w:val="18"/>
+        </w:rPr>
+        <w:t>Next.js 14 Monorepo gồm 5 Route Groups: Khách hàng gọi món PWA (customer), Màn hình Bếp Dark Mode (kds), POS Thu ngân (staff), Cổng Quản lý (manager), Bảng điều khiển Chuỗi (admin).</w:t>
+      </w:r>
+    </w:p>
+    <w:p>
+      <w:pPr>
+        <w:ind w:left="288"/>
+      </w:pPr>
+      <w:r>
+        <w:rPr>
+          <w:b/>
+          <w:sz w:val="18"/>
+        </w:rPr>
+        <w:t xml:space="preserve">3. Cơ Sở Dữ Liệu: </w:t>
+      </w:r>
+      <w:r>
+        <w:rPr>
+          <w:sz w:val="18"/>
+        </w:rPr>
+        <w:t>PostgreSQL 16 với 30 bảng thực thể chuẩn hóa 3NF, hỗ trợ Thực đơn theo mùa (seasonal_menus), Quản lý ca &amp; chốt sổ Z-Report (cash_shifts), tự động trừ tồn kho theo định mức BOM.</w:t>
+      </w:r>
+    </w:p>
+    <w:p>
+      <w:pPr>
+        <w:ind w:left="288"/>
+      </w:pPr>
+      <w:r>
+        <w:rPr>
+          <w:b/>
+          <w:sz w:val="18"/>
+        </w:rPr>
+        <w:t xml:space="preserve">4. Tích Hợp Cổng VietQR: </w:t>
+      </w:r>
+      <w:r>
+        <w:rPr>
+          <w:sz w:val="18"/>
+        </w:rPr>
+        <w:t>Tích hợp cổng PayOS tạo mã VietQR động theo đơn, xác thực thanh toán tức thì qua Webhook HMAC-SHA256, tiền chuyển thẳng 100% vào tài khoản quán (0% phí hoa hồng).</w:t>
+      </w:r>
+    </w:p>
+    <w:p>
+      <w:pPr>
+        <w:ind w:left="288"/>
+      </w:pPr>
+      <w:r>
+        <w:rPr>
+          <w:b/>
+          <w:sz w:val="18"/>
+        </w:rPr>
+        <w:t xml:space="preserve">5. Bộ Đôi Trí Tuệ Nhân Tạo (AI Modules): </w:t>
+      </w:r>
+      <w:r>
+        <w:rPr>
+          <w:sz w:val="18"/>
+        </w:rPr>
+        <w:t>AI-1 Chatbot Gemini 1.5 Flash tư vấn đồ uống cá nhân hóa theo khẩu vị/dị ứng/thời tiết + AI-2 Gợi ý Combo tự động bằng thuật toán Apriori/FP-Growth.</w:t>
+      </w:r>
+    </w:p>
+    <w:p>
+      <w:pPr>
+        <w:ind w:left="288"/>
+      </w:pPr>
+      <w:r>
+        <w:rPr>
+          <w:b/>
+          <w:sz w:val="18"/>
+        </w:rPr>
+        <w:t xml:space="preserve">6. Chấm Công Khóa Mạng WiFi (WiFi-Locked HRM): </w:t>
+      </w:r>
+      <w:r>
+        <w:rPr>
+          <w:sz w:val="18"/>
+        </w:rPr>
+        <w:t>Xác thực 2 lớp BSSID/IP Subnet nội bộ chi nhánh + Mã số nhân viên, chống chấm công hộ và xuất báo cáo công Excel.</w:t>
+      </w:r>
+    </w:p>
+    <w:p>
+      <w:pPr>
+        <w:ind w:left="288"/>
+      </w:pPr>
+      <w:r>
+        <w:rPr>
+          <w:b/>
+          <w:sz w:val="18"/>
+        </w:rPr>
+        <w:t xml:space="preserve">7. Thiết Kế UI/UX &amp; Bộ Kiểm Thử QA: </w:t>
+      </w:r>
+      <w:r>
+        <w:rPr>
+          <w:sz w:val="18"/>
+        </w:rPr>
+        <w:t>Bộ Design Tokens F&amp;B, chuẩn tương phản WCAG AA, bộ kịch bản kiểm thử UAT 38+ Test Cases và kiểm tra chịu tải k6 (500 VUs).</w:t>
+      </w:r>
+    </w:p>
+    <w:p>
+      <w:pPr>
+        <w:ind w:left="288"/>
+      </w:pPr>
+      <w:r>
+        <w:rPr>
+          <w:b/>
+          <w:sz w:val="18"/>
+        </w:rPr>
+        <w:t xml:space="preserve">8. Đóng Gói Docker &amp; CI/CD: </w:t>
+      </w:r>
+      <w:r>
+        <w:rPr>
+          <w:sz w:val="18"/>
+        </w:rPr>
+        <w:t>Docker Compose 4 containers, Nginx Reverse Proxy, SSL Let's Encrypt tự động, sẵn sàng triển khai trên môi trường máy chủ.</w:t>
       </w:r>
     </w:p>
     <w:p/>
@@ -4565,7 +2295,7 @@
           <w:color w:val="1E293B"/>
           <w:sz w:val="22"/>
         </w:rPr>
-        <w:t>So Sánh Chi Phí Vận Hành Theo Quy Mô Mở Rộng Chuỗi</w:t>
+        <w:t>So Sánh Chi Phí Vận Hành Theo Quy Mô Chuỗi</w:t>
       </w:r>
     </w:p>
     <w:tbl>
@@ -4669,7 +2399,7 @@
                 <w:b/>
                 <w:sz w:val="17"/>
               </w:rPr>
-              <w:t>5 Quán (Mở Rộng)</w:t>
+              <w:t>5 Quán (Mở Rộng Chuỗi)</w:t>
             </w:r>
           </w:p>
         </w:tc>
@@ -5117,10 +2847,10 @@
             </w:tcBorders>
             <w:shd w:fill="F0FDF4"/>
             <w:tcMar>
-              <w:top w:w="120" w:type="dxa"/>
-              <w:bottom w:w="120" w:type="dxa"/>
-              <w:left w:w="150" w:type="dxa"/>
-              <w:right w:w="150" w:type="dxa"/>
+              <w:top w:w="100" w:type="dxa"/>
+              <w:bottom w:w="100" w:type="dxa"/>
+              <w:left w:w="140" w:type="dxa"/>
+              <w:right w:w="140" w:type="dxa"/>
             </w:tcMar>
           </w:tcPr>
           <w:p>
@@ -5731,7 +3461,7 @@
           <w:color w:val="8B4513"/>
           <w:sz w:val="26"/>
         </w:rPr>
-        <w:t>PHẦN 4. DANH MỤC THIẾT BỊ PHẦN CỨNG TẠI QUÁN (THAM KHẢO)</w:t>
+        <w:t>PHẦN 4. DANH MỤC THIẾT BỊ PHẦN CỨNG CẦN THIẾT TẠI QUÁN (THAM KHẢO)</w:t>
       </w:r>
     </w:p>
     <w:tbl>
@@ -5756,10 +3486,10 @@
             </w:tcBorders>
             <w:shd w:fill="FFFBEB"/>
             <w:tcMar>
-              <w:top w:w="120" w:type="dxa"/>
-              <w:bottom w:w="120" w:type="dxa"/>
-              <w:left w:w="150" w:type="dxa"/>
-              <w:right w:w="150" w:type="dxa"/>
+              <w:top w:w="100" w:type="dxa"/>
+              <w:bottom w:w="100" w:type="dxa"/>
+              <w:left w:w="140" w:type="dxa"/>
+              <w:right w:w="140" w:type="dxa"/>
             </w:tcMar>
           </w:tcPr>
           <w:p>
@@ -5777,1835 +3507,7 @@
                 <w:color w:val="0F172A"/>
                 <w:sz w:val="18"/>
               </w:rPr>
-              <w:t>Bảng dưới đây chỉ mang tính chất liệt kê danh mục phần cứng cần có tại mỗi điểm bán để quán chủ động chuẩn bị. Chi phí phần cứng này KHÔNG tính vào ngân sách triển khai phần mềm của dự án. Nhờ kiến trúc 100% Web-First, quán hoàn toàn có thể tận dụng Smart TV, Laptop cũ, iPad, Tablet, Điện thoại mà không cần mua mới.</w:t>
-            </w:r>
-          </w:p>
-        </w:tc>
-      </w:tr>
-    </w:tbl>
-    <w:p/>
-    <w:tbl>
-      <w:tblPr>
-        <w:tblW w:type="auto" w:w="0"/>
-        <w:jc w:val="center"/>
-        <w:tblLook w:firstColumn="1" w:firstRow="1" w:lastColumn="0" w:lastRow="0" w:noHBand="0" w:noVBand="1" w:val="04A0"/>
-        <w:tblBorders>
-          <w:top w:val="single" w:sz="4" w:space="0" w:color="CBD5E1"/>
-          <w:bottom w:val="single" w:sz="4" w:space="0" w:color="CBD5E1"/>
-          <w:left w:val="single" w:sz="4" w:space="0" w:color="CBD5E1"/>
-          <w:right w:val="single" w:sz="4" w:space="0" w:color="CBD5E1"/>
-          <w:insideH w:val="single" w:sz="4" w:space="0" w:color="CBD5E1"/>
-          <w:insideV w:val="single" w:sz="4" w:space="0" w:color="CBD5E1"/>
-        </w:tblBorders>
-      </w:tblPr>
-      <w:tblGrid>
-        <w:gridCol w:w="1434"/>
-        <w:gridCol w:w="1434"/>
-        <w:gridCol w:w="1434"/>
-        <w:gridCol w:w="1434"/>
-        <w:gridCol w:w="1434"/>
-        <w:gridCol w:w="1434"/>
-        <w:gridCol w:w="1434"/>
-      </w:tblGrid>
-      <w:tr>
-        <w:tc>
-          <w:tcPr>
-            <w:tcW w:type="dxa" w:w="576"/>
-            <w:shd w:fill="F1F5F9"/>
-            <w:tcMar>
-              <w:top w:w="80" w:type="dxa"/>
-              <w:bottom w:w="80" w:type="dxa"/>
-              <w:left w:w="100" w:type="dxa"/>
-              <w:right w:w="100" w:type="dxa"/>
-            </w:tcMar>
-          </w:tcPr>
-          <w:p>
-            <w:r>
-              <w:rPr>
-                <w:b/>
-                <w:sz w:val="16"/>
-              </w:rPr>
-              <w:t>STT</w:t>
-            </w:r>
-          </w:p>
-        </w:tc>
-        <w:tc>
-          <w:tcPr>
-            <w:tcW w:type="dxa" w:w="2016"/>
-            <w:shd w:fill="F1F5F9"/>
-            <w:tcMar>
-              <w:top w:w="80" w:type="dxa"/>
-              <w:bottom w:w="80" w:type="dxa"/>
-              <w:left w:w="100" w:type="dxa"/>
-              <w:right w:w="100" w:type="dxa"/>
-            </w:tcMar>
-          </w:tcPr>
-          <w:p>
-            <w:r>
-              <w:rPr>
-                <w:b/>
-                <w:sz w:val="16"/>
-              </w:rPr>
-              <w:t>Tên Thiết Bị</w:t>
-            </w:r>
-          </w:p>
-        </w:tc>
-        <w:tc>
-          <w:tcPr>
-            <w:tcW w:type="dxa" w:w="720"/>
-            <w:shd w:fill="F1F5F9"/>
-            <w:tcMar>
-              <w:top w:w="80" w:type="dxa"/>
-              <w:bottom w:w="80" w:type="dxa"/>
-              <w:left w:w="100" w:type="dxa"/>
-              <w:right w:w="100" w:type="dxa"/>
-            </w:tcMar>
-          </w:tcPr>
-          <w:p>
-            <w:r>
-              <w:rPr>
-                <w:b/>
-                <w:sz w:val="16"/>
-              </w:rPr>
-              <w:t>SL/Quán</w:t>
-            </w:r>
-          </w:p>
-        </w:tc>
-        <w:tc>
-          <w:tcPr>
-            <w:tcW w:type="dxa" w:w="864"/>
-            <w:shd w:fill="F1F5F9"/>
-            <w:tcMar>
-              <w:top w:w="80" w:type="dxa"/>
-              <w:bottom w:w="80" w:type="dxa"/>
-              <w:left w:w="100" w:type="dxa"/>
-              <w:right w:w="100" w:type="dxa"/>
-            </w:tcMar>
-          </w:tcPr>
-          <w:p>
-            <w:r>
-              <w:rPr>
-                <w:b/>
-                <w:sz w:val="16"/>
-              </w:rPr>
-              <w:t>Tổng 3 Quán</w:t>
-            </w:r>
-          </w:p>
-        </w:tc>
-        <w:tc>
-          <w:tcPr>
-            <w:tcW w:type="dxa" w:w="2016"/>
-            <w:shd w:fill="F1F5F9"/>
-            <w:tcMar>
-              <w:top w:w="80" w:type="dxa"/>
-              <w:bottom w:w="80" w:type="dxa"/>
-              <w:left w:w="100" w:type="dxa"/>
-              <w:right w:w="100" w:type="dxa"/>
-            </w:tcMar>
-          </w:tcPr>
-          <w:p>
-            <w:r>
-              <w:rPr>
-                <w:b/>
-                <w:sz w:val="16"/>
-              </w:rPr>
-              <w:t>Vị Trí &amp; Mục Đích</w:t>
-            </w:r>
-          </w:p>
-        </w:tc>
-        <w:tc>
-          <w:tcPr>
-            <w:tcW w:type="dxa" w:w="2016"/>
-            <w:shd w:fill="F1F5F9"/>
-            <w:tcMar>
-              <w:top w:w="80" w:type="dxa"/>
-              <w:bottom w:w="80" w:type="dxa"/>
-              <w:left w:w="100" w:type="dxa"/>
-              <w:right w:w="100" w:type="dxa"/>
-            </w:tcMar>
-          </w:tcPr>
-          <w:p>
-            <w:r>
-              <w:rPr>
-                <w:b/>
-                <w:sz w:val="16"/>
-              </w:rPr>
-              <w:t>Cấu Hình Tối Thiểu</w:t>
-            </w:r>
-          </w:p>
-        </w:tc>
-        <w:tc>
-          <w:tcPr>
-            <w:tcW w:type="dxa" w:w="1872"/>
-            <w:shd w:fill="F1F5F9"/>
-            <w:tcMar>
-              <w:top w:w="80" w:type="dxa"/>
-              <w:bottom w:w="80" w:type="dxa"/>
-              <w:left w:w="100" w:type="dxa"/>
-              <w:right w:w="100" w:type="dxa"/>
-            </w:tcMar>
-          </w:tcPr>
-          <w:p>
-            <w:r>
-              <w:rPr>
-                <w:b/>
-                <w:sz w:val="16"/>
-              </w:rPr>
-              <w:t>Dự Toán Mua Mới (Tham Khảo)</w:t>
-            </w:r>
-          </w:p>
-        </w:tc>
-      </w:tr>
-      <w:tr>
-        <w:tc>
-          <w:tcPr>
-            <w:tcW w:type="dxa" w:w="576"/>
-            <w:tcMar>
-              <w:top w:w="80" w:type="dxa"/>
-              <w:bottom w:w="80" w:type="dxa"/>
-              <w:left w:w="100" w:type="dxa"/>
-              <w:right w:w="100" w:type="dxa"/>
-            </w:tcMar>
-          </w:tcPr>
-          <w:p>
-            <w:pPr>
-              <w:jc w:val="center"/>
-            </w:pPr>
-            <w:r>
-              <w:rPr>
-                <w:sz w:val="15"/>
-              </w:rPr>
-              <w:t>1</w:t>
-            </w:r>
-          </w:p>
-        </w:tc>
-        <w:tc>
-          <w:tcPr>
-            <w:tcW w:type="dxa" w:w="2016"/>
-            <w:tcMar>
-              <w:top w:w="80" w:type="dxa"/>
-              <w:bottom w:w="80" w:type="dxa"/>
-              <w:left w:w="100" w:type="dxa"/>
-              <w:right w:w="100" w:type="dxa"/>
-            </w:tcMar>
-          </w:tcPr>
-          <w:p>
-            <w:r>
-              <w:rPr>
-                <w:sz w:val="15"/>
-              </w:rPr>
-              <w:t>Màn hình KDS Bếp</w:t>
-            </w:r>
-          </w:p>
-        </w:tc>
-        <w:tc>
-          <w:tcPr>
-            <w:tcW w:type="dxa" w:w="720"/>
-            <w:tcMar>
-              <w:top w:w="80" w:type="dxa"/>
-              <w:bottom w:w="80" w:type="dxa"/>
-              <w:left w:w="100" w:type="dxa"/>
-              <w:right w:w="100" w:type="dxa"/>
-            </w:tcMar>
-          </w:tcPr>
-          <w:p>
-            <w:pPr>
-              <w:jc w:val="center"/>
-            </w:pPr>
-            <w:r>
-              <w:rPr>
-                <w:sz w:val="15"/>
-              </w:rPr>
-              <w:t>1</w:t>
-            </w:r>
-          </w:p>
-        </w:tc>
-        <w:tc>
-          <w:tcPr>
-            <w:tcW w:type="dxa" w:w="864"/>
-            <w:tcMar>
-              <w:top w:w="80" w:type="dxa"/>
-              <w:bottom w:w="80" w:type="dxa"/>
-              <w:left w:w="100" w:type="dxa"/>
-              <w:right w:w="100" w:type="dxa"/>
-            </w:tcMar>
-          </w:tcPr>
-          <w:p>
-            <w:pPr>
-              <w:jc w:val="center"/>
-            </w:pPr>
-            <w:r>
-              <w:rPr>
-                <w:sz w:val="15"/>
-              </w:rPr>
-              <w:t>3 cái</w:t>
-            </w:r>
-          </w:p>
-        </w:tc>
-        <w:tc>
-          <w:tcPr>
-            <w:tcW w:type="dxa" w:w="2016"/>
-            <w:tcMar>
-              <w:top w:w="80" w:type="dxa"/>
-              <w:bottom w:w="80" w:type="dxa"/>
-              <w:left w:w="100" w:type="dxa"/>
-              <w:right w:w="100" w:type="dxa"/>
-            </w:tcMar>
-          </w:tcPr>
-          <w:p>
-            <w:r>
-              <w:rPr>
-                <w:sz w:val="15"/>
-              </w:rPr>
-              <w:t>Quầy Bar: xem đơn, BOM, 86-toggle</w:t>
-            </w:r>
-          </w:p>
-        </w:tc>
-        <w:tc>
-          <w:tcPr>
-            <w:tcW w:type="dxa" w:w="2016"/>
-            <w:tcMar>
-              <w:top w:w="80" w:type="dxa"/>
-              <w:bottom w:w="80" w:type="dxa"/>
-              <w:left w:w="100" w:type="dxa"/>
-              <w:right w:w="100" w:type="dxa"/>
-            </w:tcMar>
-          </w:tcPr>
-          <w:p>
-            <w:r>
-              <w:rPr>
-                <w:sz w:val="15"/>
-              </w:rPr>
-              <w:t>Smart TV 32"-43" Web Browser / Tablet 10"+</w:t>
-            </w:r>
-          </w:p>
-        </w:tc>
-        <w:tc>
-          <w:tcPr>
-            <w:tcW w:type="dxa" w:w="1872"/>
-            <w:tcMar>
-              <w:top w:w="80" w:type="dxa"/>
-              <w:bottom w:w="80" w:type="dxa"/>
-              <w:left w:w="100" w:type="dxa"/>
-              <w:right w:w="100" w:type="dxa"/>
-            </w:tcMar>
-          </w:tcPr>
-          <w:p>
-            <w:r>
-              <w:rPr>
-                <w:sz w:val="15"/>
-              </w:rPr>
-              <w:t>3.500.000 – 5.000.000 VNĐ</w:t>
-            </w:r>
-          </w:p>
-        </w:tc>
-      </w:tr>
-      <w:tr>
-        <w:tc>
-          <w:tcPr>
-            <w:tcW w:type="dxa" w:w="576"/>
-            <w:shd w:fill="FAFAFC"/>
-            <w:tcMar>
-              <w:top w:w="80" w:type="dxa"/>
-              <w:bottom w:w="80" w:type="dxa"/>
-              <w:left w:w="100" w:type="dxa"/>
-              <w:right w:w="100" w:type="dxa"/>
-            </w:tcMar>
-          </w:tcPr>
-          <w:p>
-            <w:pPr>
-              <w:jc w:val="center"/>
-            </w:pPr>
-            <w:r>
-              <w:rPr>
-                <w:sz w:val="15"/>
-              </w:rPr>
-              <w:t>2</w:t>
-            </w:r>
-          </w:p>
-        </w:tc>
-        <w:tc>
-          <w:tcPr>
-            <w:tcW w:type="dxa" w:w="2016"/>
-            <w:shd w:fill="FAFAFC"/>
-            <w:tcMar>
-              <w:top w:w="80" w:type="dxa"/>
-              <w:bottom w:w="80" w:type="dxa"/>
-              <w:left w:w="100" w:type="dxa"/>
-              <w:right w:w="100" w:type="dxa"/>
-            </w:tcMar>
-          </w:tcPr>
-          <w:p>
-            <w:r>
-              <w:rPr>
-                <w:sz w:val="15"/>
-              </w:rPr>
-              <w:t>Thiết bị Web POS</w:t>
-            </w:r>
-          </w:p>
-        </w:tc>
-        <w:tc>
-          <w:tcPr>
-            <w:tcW w:type="dxa" w:w="720"/>
-            <w:shd w:fill="FAFAFC"/>
-            <w:tcMar>
-              <w:top w:w="80" w:type="dxa"/>
-              <w:bottom w:w="80" w:type="dxa"/>
-              <w:left w:w="100" w:type="dxa"/>
-              <w:right w:w="100" w:type="dxa"/>
-            </w:tcMar>
-          </w:tcPr>
-          <w:p>
-            <w:pPr>
-              <w:jc w:val="center"/>
-            </w:pPr>
-            <w:r>
-              <w:rPr>
-                <w:sz w:val="15"/>
-              </w:rPr>
-              <w:t>1</w:t>
-            </w:r>
-          </w:p>
-        </w:tc>
-        <w:tc>
-          <w:tcPr>
-            <w:tcW w:type="dxa" w:w="864"/>
-            <w:shd w:fill="FAFAFC"/>
-            <w:tcMar>
-              <w:top w:w="80" w:type="dxa"/>
-              <w:bottom w:w="80" w:type="dxa"/>
-              <w:left w:w="100" w:type="dxa"/>
-              <w:right w:w="100" w:type="dxa"/>
-            </w:tcMar>
-          </w:tcPr>
-          <w:p>
-            <w:pPr>
-              <w:jc w:val="center"/>
-            </w:pPr>
-            <w:r>
-              <w:rPr>
-                <w:sz w:val="15"/>
-              </w:rPr>
-              <w:t>3 cái</w:t>
-            </w:r>
-          </w:p>
-        </w:tc>
-        <w:tc>
-          <w:tcPr>
-            <w:tcW w:type="dxa" w:w="2016"/>
-            <w:shd w:fill="FAFAFC"/>
-            <w:tcMar>
-              <w:top w:w="80" w:type="dxa"/>
-              <w:bottom w:w="80" w:type="dxa"/>
-              <w:left w:w="100" w:type="dxa"/>
-              <w:right w:w="100" w:type="dxa"/>
-            </w:tcMar>
-          </w:tcPr>
-          <w:p>
-            <w:r>
-              <w:rPr>
-                <w:sz w:val="15"/>
-              </w:rPr>
-              <w:t>Thu ngân tạo đơn Takeaway, tra CRM</w:t>
-            </w:r>
-          </w:p>
-        </w:tc>
-        <w:tc>
-          <w:tcPr>
-            <w:tcW w:type="dxa" w:w="2016"/>
-            <w:shd w:fill="FAFAFC"/>
-            <w:tcMar>
-              <w:top w:w="80" w:type="dxa"/>
-              <w:bottom w:w="80" w:type="dxa"/>
-              <w:left w:w="100" w:type="dxa"/>
-              <w:right w:w="100" w:type="dxa"/>
-            </w:tcMar>
-          </w:tcPr>
-          <w:p>
-            <w:r>
-              <w:rPr>
-                <w:sz w:val="15"/>
-              </w:rPr>
-              <w:t>Laptop / PC / Tablet Android có Chrome</w:t>
-            </w:r>
-          </w:p>
-        </w:tc>
-        <w:tc>
-          <w:tcPr>
-            <w:tcW w:type="dxa" w:w="1872"/>
-            <w:shd w:fill="FAFAFC"/>
-            <w:tcMar>
-              <w:top w:w="80" w:type="dxa"/>
-              <w:bottom w:w="80" w:type="dxa"/>
-              <w:left w:w="100" w:type="dxa"/>
-              <w:right w:w="100" w:type="dxa"/>
-            </w:tcMar>
-          </w:tcPr>
-          <w:p>
-            <w:r>
-              <w:rPr>
-                <w:sz w:val="15"/>
-              </w:rPr>
-              <w:t>3.000.000 – 6.000.000 VNĐ</w:t>
-            </w:r>
-          </w:p>
-        </w:tc>
-      </w:tr>
-      <w:tr>
-        <w:tc>
-          <w:tcPr>
-            <w:tcW w:type="dxa" w:w="576"/>
-            <w:tcMar>
-              <w:top w:w="80" w:type="dxa"/>
-              <w:bottom w:w="80" w:type="dxa"/>
-              <w:left w:w="100" w:type="dxa"/>
-              <w:right w:w="100" w:type="dxa"/>
-            </w:tcMar>
-          </w:tcPr>
-          <w:p>
-            <w:pPr>
-              <w:jc w:val="center"/>
-            </w:pPr>
-            <w:r>
-              <w:rPr>
-                <w:sz w:val="15"/>
-              </w:rPr>
-              <w:t>3</w:t>
-            </w:r>
-          </w:p>
-        </w:tc>
-        <w:tc>
-          <w:tcPr>
-            <w:tcW w:type="dxa" w:w="2016"/>
-            <w:tcMar>
-              <w:top w:w="80" w:type="dxa"/>
-              <w:bottom w:w="80" w:type="dxa"/>
-              <w:left w:w="100" w:type="dxa"/>
-              <w:right w:w="100" w:type="dxa"/>
-            </w:tcMar>
-          </w:tcPr>
-          <w:p>
-            <w:r>
-              <w:rPr>
-                <w:sz w:val="15"/>
-              </w:rPr>
-              <w:t>Máy in nhiệt K80</w:t>
-            </w:r>
-          </w:p>
-        </w:tc>
-        <w:tc>
-          <w:tcPr>
-            <w:tcW w:type="dxa" w:w="720"/>
-            <w:tcMar>
-              <w:top w:w="80" w:type="dxa"/>
-              <w:bottom w:w="80" w:type="dxa"/>
-              <w:left w:w="100" w:type="dxa"/>
-              <w:right w:w="100" w:type="dxa"/>
-            </w:tcMar>
-          </w:tcPr>
-          <w:p>
-            <w:pPr>
-              <w:jc w:val="center"/>
-            </w:pPr>
-            <w:r>
-              <w:rPr>
-                <w:sz w:val="15"/>
-              </w:rPr>
-              <w:t>1</w:t>
-            </w:r>
-          </w:p>
-        </w:tc>
-        <w:tc>
-          <w:tcPr>
-            <w:tcW w:type="dxa" w:w="864"/>
-            <w:tcMar>
-              <w:top w:w="80" w:type="dxa"/>
-              <w:bottom w:w="80" w:type="dxa"/>
-              <w:left w:w="100" w:type="dxa"/>
-              <w:right w:w="100" w:type="dxa"/>
-            </w:tcMar>
-          </w:tcPr>
-          <w:p>
-            <w:pPr>
-              <w:jc w:val="center"/>
-            </w:pPr>
-            <w:r>
-              <w:rPr>
-                <w:sz w:val="15"/>
-              </w:rPr>
-              <w:t>3 máy</w:t>
-            </w:r>
-          </w:p>
-        </w:tc>
-        <w:tc>
-          <w:tcPr>
-            <w:tcW w:type="dxa" w:w="2016"/>
-            <w:tcMar>
-              <w:top w:w="80" w:type="dxa"/>
-              <w:bottom w:w="80" w:type="dxa"/>
-              <w:left w:w="100" w:type="dxa"/>
-              <w:right w:w="100" w:type="dxa"/>
-            </w:tcMar>
-          </w:tcPr>
-          <w:p>
-            <w:r>
-              <w:rPr>
-                <w:sz w:val="15"/>
-              </w:rPr>
-              <w:t>In hóa đơn VietQR Nhánh B &amp; tem dán ly</w:t>
-            </w:r>
-          </w:p>
-        </w:tc>
-        <w:tc>
-          <w:tcPr>
-            <w:tcW w:type="dxa" w:w="2016"/>
-            <w:tcMar>
-              <w:top w:w="80" w:type="dxa"/>
-              <w:bottom w:w="80" w:type="dxa"/>
-              <w:left w:w="100" w:type="dxa"/>
-              <w:right w:w="100" w:type="dxa"/>
-            </w:tcMar>
-          </w:tcPr>
-          <w:p>
-            <w:r>
-              <w:rPr>
-                <w:sz w:val="15"/>
-              </w:rPr>
-              <w:t>Máy in bill K80 cổng LAN/USB (Xprinter)</w:t>
-            </w:r>
-          </w:p>
-        </w:tc>
-        <w:tc>
-          <w:tcPr>
-            <w:tcW w:type="dxa" w:w="1872"/>
-            <w:tcMar>
-              <w:top w:w="80" w:type="dxa"/>
-              <w:bottom w:w="80" w:type="dxa"/>
-              <w:left w:w="100" w:type="dxa"/>
-              <w:right w:w="100" w:type="dxa"/>
-            </w:tcMar>
-          </w:tcPr>
-          <w:p>
-            <w:r>
-              <w:rPr>
-                <w:sz w:val="15"/>
-              </w:rPr>
-              <w:t>1.200.000 – 1.800.000 VNĐ</w:t>
-            </w:r>
-          </w:p>
-        </w:tc>
-      </w:tr>
-      <w:tr>
-        <w:tc>
-          <w:tcPr>
-            <w:tcW w:type="dxa" w:w="576"/>
-            <w:shd w:fill="FAFAFC"/>
-            <w:tcMar>
-              <w:top w:w="80" w:type="dxa"/>
-              <w:bottom w:w="80" w:type="dxa"/>
-              <w:left w:w="100" w:type="dxa"/>
-              <w:right w:w="100" w:type="dxa"/>
-            </w:tcMar>
-          </w:tcPr>
-          <w:p>
-            <w:pPr>
-              <w:jc w:val="center"/>
-            </w:pPr>
-            <w:r>
-              <w:rPr>
-                <w:sz w:val="15"/>
-              </w:rPr>
-              <w:t>4</w:t>
-            </w:r>
-          </w:p>
-        </w:tc>
-        <w:tc>
-          <w:tcPr>
-            <w:tcW w:type="dxa" w:w="2016"/>
-            <w:shd w:fill="FAFAFC"/>
-            <w:tcMar>
-              <w:top w:w="80" w:type="dxa"/>
-              <w:bottom w:w="80" w:type="dxa"/>
-              <w:left w:w="100" w:type="dxa"/>
-              <w:right w:w="100" w:type="dxa"/>
-            </w:tcMar>
-          </w:tcPr>
-          <w:p>
-            <w:r>
-              <w:rPr>
-                <w:sz w:val="15"/>
-              </w:rPr>
-              <w:t>Router WiFi</w:t>
-            </w:r>
-          </w:p>
-        </w:tc>
-        <w:tc>
-          <w:tcPr>
-            <w:tcW w:type="dxa" w:w="720"/>
-            <w:shd w:fill="FAFAFC"/>
-            <w:tcMar>
-              <w:top w:w="80" w:type="dxa"/>
-              <w:bottom w:w="80" w:type="dxa"/>
-              <w:left w:w="100" w:type="dxa"/>
-              <w:right w:w="100" w:type="dxa"/>
-            </w:tcMar>
-          </w:tcPr>
-          <w:p>
-            <w:pPr>
-              <w:jc w:val="center"/>
-            </w:pPr>
-            <w:r>
-              <w:rPr>
-                <w:sz w:val="15"/>
-              </w:rPr>
-              <w:t>1-2</w:t>
-            </w:r>
-          </w:p>
-        </w:tc>
-        <w:tc>
-          <w:tcPr>
-            <w:tcW w:type="dxa" w:w="864"/>
-            <w:shd w:fill="FAFAFC"/>
-            <w:tcMar>
-              <w:top w:w="80" w:type="dxa"/>
-              <w:bottom w:w="80" w:type="dxa"/>
-              <w:left w:w="100" w:type="dxa"/>
-              <w:right w:w="100" w:type="dxa"/>
-            </w:tcMar>
-          </w:tcPr>
-          <w:p>
-            <w:pPr>
-              <w:jc w:val="center"/>
-            </w:pPr>
-            <w:r>
-              <w:rPr>
-                <w:sz w:val="15"/>
-              </w:rPr>
-              <w:t>3-6 bộ</w:t>
-            </w:r>
-          </w:p>
-        </w:tc>
-        <w:tc>
-          <w:tcPr>
-            <w:tcW w:type="dxa" w:w="2016"/>
-            <w:shd w:fill="FAFAFC"/>
-            <w:tcMar>
-              <w:top w:w="80" w:type="dxa"/>
-              <w:bottom w:w="80" w:type="dxa"/>
-              <w:left w:w="100" w:type="dxa"/>
-              <w:right w:w="100" w:type="dxa"/>
-            </w:tcMar>
-          </w:tcPr>
-          <w:p>
-            <w:r>
-              <w:rPr>
-                <w:sz w:val="15"/>
-              </w:rPr>
-              <w:t>Cung cấp mạng &amp; xác thực BSSID chấm công</w:t>
-            </w:r>
-          </w:p>
-        </w:tc>
-        <w:tc>
-          <w:tcPr>
-            <w:tcW w:type="dxa" w:w="2016"/>
-            <w:shd w:fill="FAFAFC"/>
-            <w:tcMar>
-              <w:top w:w="80" w:type="dxa"/>
-              <w:bottom w:w="80" w:type="dxa"/>
-              <w:left w:w="100" w:type="dxa"/>
-              <w:right w:w="100" w:type="dxa"/>
-            </w:tcMar>
-          </w:tcPr>
-          <w:p>
-            <w:r>
-              <w:rPr>
-                <w:sz w:val="15"/>
-              </w:rPr>
-              <w:t>Router WiFi có BSSID cố định, mạng ổn định</w:t>
-            </w:r>
-          </w:p>
-        </w:tc>
-        <w:tc>
-          <w:tcPr>
-            <w:tcW w:type="dxa" w:w="1872"/>
-            <w:shd w:fill="FAFAFC"/>
-            <w:tcMar>
-              <w:top w:w="80" w:type="dxa"/>
-              <w:bottom w:w="80" w:type="dxa"/>
-              <w:left w:w="100" w:type="dxa"/>
-              <w:right w:w="100" w:type="dxa"/>
-            </w:tcMar>
-          </w:tcPr>
-          <w:p>
-            <w:r>
-              <w:rPr>
-                <w:sz w:val="15"/>
-              </w:rPr>
-              <w:t>Đã có sẵn tại quán</w:t>
-            </w:r>
-          </w:p>
-        </w:tc>
-      </w:tr>
-      <w:tr>
-        <w:tc>
-          <w:tcPr>
-            <w:tcW w:type="dxa" w:w="576"/>
-            <w:tcMar>
-              <w:top w:w="80" w:type="dxa"/>
-              <w:bottom w:w="80" w:type="dxa"/>
-              <w:left w:w="100" w:type="dxa"/>
-              <w:right w:w="100" w:type="dxa"/>
-            </w:tcMar>
-          </w:tcPr>
-          <w:p>
-            <w:pPr>
-              <w:jc w:val="center"/>
-            </w:pPr>
-            <w:r>
-              <w:rPr>
-                <w:sz w:val="15"/>
-              </w:rPr>
-              <w:t>5</w:t>
-            </w:r>
-          </w:p>
-        </w:tc>
-        <w:tc>
-          <w:tcPr>
-            <w:tcW w:type="dxa" w:w="2016"/>
-            <w:tcMar>
-              <w:top w:w="80" w:type="dxa"/>
-              <w:bottom w:w="80" w:type="dxa"/>
-              <w:left w:w="100" w:type="dxa"/>
-              <w:right w:w="100" w:type="dxa"/>
-            </w:tcMar>
-          </w:tcPr>
-          <w:p>
-            <w:r>
-              <w:rPr>
-                <w:sz w:val="15"/>
-              </w:rPr>
-              <w:t>Standee QR Delivery</w:t>
-            </w:r>
-          </w:p>
-        </w:tc>
-        <w:tc>
-          <w:tcPr>
-            <w:tcW w:type="dxa" w:w="720"/>
-            <w:tcMar>
-              <w:top w:w="80" w:type="dxa"/>
-              <w:bottom w:w="80" w:type="dxa"/>
-              <w:left w:w="100" w:type="dxa"/>
-              <w:right w:w="100" w:type="dxa"/>
-            </w:tcMar>
-          </w:tcPr>
-          <w:p>
-            <w:pPr>
-              <w:jc w:val="center"/>
-            </w:pPr>
-            <w:r>
-              <w:rPr>
-                <w:sz w:val="15"/>
-              </w:rPr>
-              <w:t>1-2</w:t>
-            </w:r>
-          </w:p>
-        </w:tc>
-        <w:tc>
-          <w:tcPr>
-            <w:tcW w:type="dxa" w:w="864"/>
-            <w:tcMar>
-              <w:top w:w="80" w:type="dxa"/>
-              <w:bottom w:w="80" w:type="dxa"/>
-              <w:left w:w="100" w:type="dxa"/>
-              <w:right w:w="100" w:type="dxa"/>
-            </w:tcMar>
-          </w:tcPr>
-          <w:p>
-            <w:pPr>
-              <w:jc w:val="center"/>
-            </w:pPr>
-            <w:r>
-              <w:rPr>
-                <w:sz w:val="15"/>
-              </w:rPr>
-              <w:t>3-6 tấm</w:t>
-            </w:r>
-          </w:p>
-        </w:tc>
-        <w:tc>
-          <w:tcPr>
-            <w:tcW w:type="dxa" w:w="2016"/>
-            <w:tcMar>
-              <w:top w:w="80" w:type="dxa"/>
-              <w:bottom w:w="80" w:type="dxa"/>
-              <w:left w:w="100" w:type="dxa"/>
-              <w:right w:w="100" w:type="dxa"/>
-            </w:tcMar>
-          </w:tcPr>
-          <w:p>
-            <w:r>
-              <w:rPr>
-                <w:sz w:val="15"/>
-              </w:rPr>
-              <w:t>Đặt tại cửa/quầy để khách quét giao tận nơi</w:t>
-            </w:r>
-          </w:p>
-        </w:tc>
-        <w:tc>
-          <w:tcPr>
-            <w:tcW w:type="dxa" w:w="2016"/>
-            <w:tcMar>
-              <w:top w:w="80" w:type="dxa"/>
-              <w:bottom w:w="80" w:type="dxa"/>
-              <w:left w:w="100" w:type="dxa"/>
-              <w:right w:w="100" w:type="dxa"/>
-            </w:tcMar>
-          </w:tcPr>
-          <w:p>
-            <w:r>
-              <w:rPr>
-                <w:sz w:val="15"/>
-              </w:rPr>
-              <w:t>Standee mica A4 hoặc poster in mã QR</w:t>
-            </w:r>
-          </w:p>
-        </w:tc>
-        <w:tc>
-          <w:tcPr>
-            <w:tcW w:type="dxa" w:w="1872"/>
-            <w:tcMar>
-              <w:top w:w="80" w:type="dxa"/>
-              <w:bottom w:w="80" w:type="dxa"/>
-              <w:left w:w="100" w:type="dxa"/>
-              <w:right w:w="100" w:type="dxa"/>
-            </w:tcMar>
-          </w:tcPr>
-          <w:p>
-            <w:r>
-              <w:rPr>
-                <w:sz w:val="15"/>
-              </w:rPr>
-              <w:t>100.000 – 200.000 VNĐ</w:t>
-            </w:r>
-          </w:p>
-        </w:tc>
-      </w:tr>
-      <w:tr>
-        <w:tc>
-          <w:tcPr>
-            <w:tcW w:type="dxa" w:w="576"/>
-            <w:shd w:fill="FAFAFC"/>
-            <w:tcMar>
-              <w:top w:w="80" w:type="dxa"/>
-              <w:bottom w:w="80" w:type="dxa"/>
-              <w:left w:w="100" w:type="dxa"/>
-              <w:right w:w="100" w:type="dxa"/>
-            </w:tcMar>
-          </w:tcPr>
-          <w:p>
-            <w:pPr>
-              <w:jc w:val="center"/>
-            </w:pPr>
-            <w:r>
-              <w:rPr>
-                <w:sz w:val="15"/>
-              </w:rPr>
-              <w:t>6</w:t>
-            </w:r>
-          </w:p>
-        </w:tc>
-        <w:tc>
-          <w:tcPr>
-            <w:tcW w:type="dxa" w:w="2016"/>
-            <w:shd w:fill="FAFAFC"/>
-            <w:tcMar>
-              <w:top w:w="80" w:type="dxa"/>
-              <w:bottom w:w="80" w:type="dxa"/>
-              <w:left w:w="100" w:type="dxa"/>
-              <w:right w:w="100" w:type="dxa"/>
-            </w:tcMar>
-          </w:tcPr>
-          <w:p>
-            <w:r>
-              <w:rPr>
-                <w:sz w:val="15"/>
-              </w:rPr>
-              <w:t>Nhãn QR dán bàn</w:t>
-            </w:r>
-          </w:p>
-        </w:tc>
-        <w:tc>
-          <w:tcPr>
-            <w:tcW w:type="dxa" w:w="720"/>
-            <w:shd w:fill="FAFAFC"/>
-            <w:tcMar>
-              <w:top w:w="80" w:type="dxa"/>
-              <w:bottom w:w="80" w:type="dxa"/>
-              <w:left w:w="100" w:type="dxa"/>
-              <w:right w:w="100" w:type="dxa"/>
-            </w:tcMar>
-          </w:tcPr>
-          <w:p>
-            <w:pPr>
-              <w:jc w:val="center"/>
-            </w:pPr>
-            <w:r>
-              <w:rPr>
-                <w:sz w:val="15"/>
-              </w:rPr>
-              <w:t>Theo bàn</w:t>
-            </w:r>
-          </w:p>
-        </w:tc>
-        <w:tc>
-          <w:tcPr>
-            <w:tcW w:type="dxa" w:w="864"/>
-            <w:shd w:fill="FAFAFC"/>
-            <w:tcMar>
-              <w:top w:w="80" w:type="dxa"/>
-              <w:bottom w:w="80" w:type="dxa"/>
-              <w:left w:w="100" w:type="dxa"/>
-              <w:right w:w="100" w:type="dxa"/>
-            </w:tcMar>
-          </w:tcPr>
-          <w:p>
-            <w:pPr>
-              <w:jc w:val="center"/>
-            </w:pPr>
-            <w:r>
-              <w:rPr>
-                <w:sz w:val="15"/>
-              </w:rPr>
-              <w:t>100% bàn</w:t>
-            </w:r>
-          </w:p>
-        </w:tc>
-        <w:tc>
-          <w:tcPr>
-            <w:tcW w:type="dxa" w:w="2016"/>
-            <w:shd w:fill="FAFAFC"/>
-            <w:tcMar>
-              <w:top w:w="80" w:type="dxa"/>
-              <w:bottom w:w="80" w:type="dxa"/>
-              <w:left w:w="100" w:type="dxa"/>
-              <w:right w:w="100" w:type="dxa"/>
-            </w:tcMar>
-          </w:tcPr>
-          <w:p>
-            <w:r>
-              <w:rPr>
-                <w:sz w:val="15"/>
-              </w:rPr>
-              <w:t>Dán cố định từng bàn để khách quét đặt món</w:t>
-            </w:r>
-          </w:p>
-        </w:tc>
-        <w:tc>
-          <w:tcPr>
-            <w:tcW w:type="dxa" w:w="2016"/>
-            <w:shd w:fill="FAFAFC"/>
-            <w:tcMar>
-              <w:top w:w="80" w:type="dxa"/>
-              <w:bottom w:w="80" w:type="dxa"/>
-              <w:left w:w="100" w:type="dxa"/>
-              <w:right w:w="100" w:type="dxa"/>
-            </w:tcMar>
-          </w:tcPr>
-          <w:p>
-            <w:r>
-              <w:rPr>
-                <w:sz w:val="15"/>
-              </w:rPr>
-              <w:t>Decal in mã QR bàn ép màng chống nước</w:t>
-            </w:r>
-          </w:p>
-        </w:tc>
-        <w:tc>
-          <w:tcPr>
-            <w:tcW w:type="dxa" w:w="1872"/>
-            <w:shd w:fill="FAFAFC"/>
-            <w:tcMar>
-              <w:top w:w="80" w:type="dxa"/>
-              <w:bottom w:w="80" w:type="dxa"/>
-              <w:left w:w="100" w:type="dxa"/>
-              <w:right w:w="100" w:type="dxa"/>
-            </w:tcMar>
-          </w:tcPr>
-          <w:p>
-            <w:r>
-              <w:rPr>
-                <w:sz w:val="15"/>
-              </w:rPr>
-              <w:t>~10.000 VNĐ / bàn</w:t>
-            </w:r>
-          </w:p>
-        </w:tc>
-      </w:tr>
-    </w:tbl>
-    <w:p/>
-    <w:p>
-      <w:pPr>
-        <w:pStyle w:val="Heading1"/>
-      </w:pPr>
-      <w:r>
-        <w:rPr>
-          <w:b/>
-          <w:color w:val="8B4513"/>
-          <w:sz w:val="26"/>
-        </w:rPr>
-        <w:t>PHẦN 5. PHÂN TÍCH HIỆU QUẢ ĐẦU TƯ (ROI) &amp; TỰ CÂN ĐỐI DÒNG TIỀN</w:t>
-      </w:r>
-    </w:p>
-    <w:tbl>
-      <w:tblPr>
-        <w:tblW w:type="auto" w:w="0"/>
-        <w:jc w:val="center"/>
-        <w:tblLook w:firstColumn="1" w:firstRow="1" w:lastColumn="0" w:lastRow="0" w:noHBand="0" w:noVBand="1" w:val="04A0"/>
-      </w:tblPr>
-      <w:tblGrid>
-        <w:gridCol w:w="10037"/>
-      </w:tblGrid>
-      <w:tr>
-        <w:tc>
-          <w:tcPr>
-            <w:tcW w:type="dxa" w:w="10080"/>
-            <w:shd w:fill="0F172A"/>
-            <w:tcMar>
-              <w:top w:w="100" w:type="dxa"/>
-              <w:bottom w:w="100" w:type="dxa"/>
-              <w:left w:w="120" w:type="dxa"/>
-              <w:right w:w="120" w:type="dxa"/>
-            </w:tcMar>
-          </w:tcPr>
-          <w:p>
-            <w:r>
-              <w:rPr>
-                <w:rFonts w:ascii="Consolas" w:hAnsi="Consolas"/>
-                <w:color w:val="F8FAFC"/>
-                <w:sz w:val="16"/>
-              </w:rPr>
-              <w:t>┌────────────────────────────────────────────────────────────────────────┐</w:t>
-              <w:br/>
-            </w:r>
-            <w:r>
-              <w:rPr>
-                <w:rFonts w:ascii="Consolas" w:hAnsi="Consolas"/>
-                <w:color w:val="F8FAFC"/>
-                <w:sz w:val="16"/>
-              </w:rPr>
-              <w:t>│              BÀI TOÁN TỰ CÂN ĐỐI DÒNG TIỀN VẬN HÀNH TỪ PHÍ SHIP DELIVERY      │</w:t>
-              <w:br/>
-            </w:r>
-            <w:r>
-              <w:rPr>
-                <w:rFonts w:ascii="Consolas" w:hAnsi="Consolas"/>
-                <w:color w:val="F8FAFC"/>
-                <w:sz w:val="16"/>
-              </w:rPr>
-              <w:t>├────────────────────────────────────────────────────────────────────────┤</w:t>
-              <w:br/>
-            </w:r>
-            <w:r>
-              <w:rPr>
-                <w:rFonts w:ascii="Consolas" w:hAnsi="Consolas"/>
-                <w:color w:val="F8FAFC"/>
-                <w:sz w:val="16"/>
-              </w:rPr>
-              <w:t>│  • Tổng chi phí vận hành &amp; bảo trì hàng tháng (cả 3 quán): 1.940.000 VNĐ/tháng │</w:t>
-              <w:br/>
-            </w:r>
-            <w:r>
-              <w:rPr>
-                <w:rFonts w:ascii="Consolas" w:hAnsi="Consolas"/>
-                <w:color w:val="F8FAFC"/>
-                <w:sz w:val="16"/>
-              </w:rPr>
-              <w:t>│  • Phí giao hàng thu cố định trên mỗi đơn QR Delivery:     20.000 VNĐ / đơn    │</w:t>
-              <w:br/>
-            </w:r>
-            <w:r>
-              <w:rPr>
-                <w:rFonts w:ascii="Consolas" w:hAnsi="Consolas"/>
-                <w:color w:val="F8FAFC"/>
-                <w:sz w:val="16"/>
-              </w:rPr>
-              <w:t>│  ───────────────────────────────────────────────────────────────────  │</w:t>
-              <w:br/>
-            </w:r>
-            <w:r>
-              <w:rPr>
-                <w:rFonts w:ascii="Consolas" w:hAnsi="Consolas"/>
-                <w:color w:val="F8FAFC"/>
-                <w:sz w:val="16"/>
-              </w:rPr>
-              <w:t>│  👉 SỐ ĐƠN DELIVERY CẦN ĐỂ BÙ ĐẮP 100% CHI PHÍ VẬN HÀNH:   97 ĐƠN / THÁNG      │</w:t>
-              <w:br/>
-            </w:r>
-            <w:r>
-              <w:rPr>
-                <w:rFonts w:ascii="Consolas" w:hAnsi="Consolas"/>
-                <w:color w:val="F8FAFC"/>
-                <w:sz w:val="16"/>
-              </w:rPr>
-              <w:t>│     (Tương đương: ~32 đơn/quán/tháng ➔ CHỈ CẦN ~1 ĐƠN SHIP / QUÁN / NGÀY!)    │</w:t>
-              <w:br/>
-            </w:r>
-            <w:r>
-              <w:rPr>
-                <w:rFonts w:ascii="Consolas" w:hAnsi="Consolas"/>
-                <w:color w:val="F8FAFC"/>
-                <w:sz w:val="16"/>
-              </w:rPr>
-              <w:t>│                                                                        │</w:t>
-              <w:br/>
-            </w:r>
-            <w:r>
-              <w:rPr>
-                <w:rFonts w:ascii="Consolas" w:hAnsi="Consolas"/>
-                <w:color w:val="F8FAFC"/>
-                <w:sz w:val="16"/>
-              </w:rPr>
-              <w:t>│  🏆 KẾT LUẬN: Chỉ cần mỗi quán phát sinh 1 đơn ship/ngày, toàn bộ chi  │</w:t>
-              <w:br/>
-            </w:r>
-            <w:r>
-              <w:rPr>
-                <w:rFonts w:ascii="Consolas" w:hAnsi="Consolas"/>
-                <w:color w:val="F8FAFC"/>
-                <w:sz w:val="16"/>
-              </w:rPr>
-              <w:t>│     phí máy chủ, AI, giấy in và bảo trì của chuỗi ĐƯỢC TỰ BÙ ĐẮP 100%. │</w:t>
-              <w:br/>
-            </w:r>
-            <w:r>
-              <w:rPr>
-                <w:rFonts w:ascii="Consolas" w:hAnsi="Consolas"/>
-                <w:color w:val="F8FAFC"/>
-                <w:sz w:val="16"/>
-              </w:rPr>
-              <w:t>└────────────────────────────────────────────────────────────────────────┘</w:t>
-              <w:br/>
-            </w:r>
-          </w:p>
-        </w:tc>
-      </w:tr>
-    </w:tbl>
-    <w:p/>
-    <w:tbl>
-      <w:tblPr>
-        <w:tblW w:type="auto" w:w="0"/>
-        <w:jc w:val="center"/>
-        <w:tblLook w:firstColumn="1" w:firstRow="1" w:lastColumn="0" w:lastRow="0" w:noHBand="0" w:noVBand="1" w:val="04A0"/>
-      </w:tblPr>
-      <w:tblGrid>
-        <w:gridCol w:w="10037"/>
-      </w:tblGrid>
-      <w:tr>
-        <w:tc>
-          <w:tcPr>
-            <w:tcW w:type="dxa" w:w="10080"/>
-            <w:shd w:fill="0F172A"/>
-            <w:tcMar>
-              <w:top w:w="100" w:type="dxa"/>
-              <w:bottom w:w="100" w:type="dxa"/>
-              <w:left w:w="120" w:type="dxa"/>
-              <w:right w:w="120" w:type="dxa"/>
-            </w:tcMar>
-          </w:tcPr>
-          <w:p>
-            <w:r>
-              <w:rPr>
-                <w:rFonts w:ascii="Consolas" w:hAnsi="Consolas"/>
-                <w:color w:val="F8FAFC"/>
-                <w:sz w:val="16"/>
-              </w:rPr>
-              <w:t>┌────────────────────────────────────────────────────────────────────────┐</w:t>
-              <w:br/>
-            </w:r>
-            <w:r>
-              <w:rPr>
-                <w:rFonts w:ascii="Consolas" w:hAnsi="Consolas"/>
-                <w:color w:val="F8FAFC"/>
-                <w:sz w:val="16"/>
-              </w:rPr>
-              <w:t>│                        TÍNH TOÁN THỜI GIAN THU HỒI VỐN ĐẦU TƯ (PAYBACK)       │</w:t>
-              <w:br/>
-            </w:r>
-            <w:r>
-              <w:rPr>
-                <w:rFonts w:ascii="Consolas" w:hAnsi="Consolas"/>
-                <w:color w:val="F8FAFC"/>
-                <w:sz w:val="16"/>
-              </w:rPr>
-              <w:t>├────────────────────────────────────────────────────────────────────────┤</w:t>
-              <w:br/>
-            </w:r>
-            <w:r>
-              <w:rPr>
-                <w:rFonts w:ascii="Consolas" w:hAnsi="Consolas"/>
-                <w:color w:val="F8FAFC"/>
-                <w:sz w:val="16"/>
-              </w:rPr>
-              <w:t>│  • Tổng chi phí đầu tư phát triển ban đầu (CAPEX):         15.000.000 VNĐ      │</w:t>
-              <w:br/>
-            </w:r>
-            <w:r>
-              <w:rPr>
-                <w:rFonts w:ascii="Consolas" w:hAnsi="Consolas"/>
-                <w:color w:val="F8FAFC"/>
-                <w:sz w:val="16"/>
-              </w:rPr>
-              <w:t>│  • Tổng tiền tiết kiệm ròng hàng tháng:                    35.000.000 VNĐ/tháng│</w:t>
-              <w:br/>
-            </w:r>
-            <w:r>
-              <w:rPr>
-                <w:rFonts w:ascii="Consolas" w:hAnsi="Consolas"/>
-                <w:color w:val="F8FAFC"/>
-                <w:sz w:val="16"/>
-              </w:rPr>
-              <w:t>│  • Chi phí vận hành &amp; bảo trì hàng tháng (OPEX):            1.940.000 VNĐ/tháng│</w:t>
-              <w:br/>
-            </w:r>
-            <w:r>
-              <w:rPr>
-                <w:rFonts w:ascii="Consolas" w:hAnsi="Consolas"/>
-                <w:color w:val="F8FAFC"/>
-                <w:sz w:val="16"/>
-              </w:rPr>
-              <w:t>│  • Dòng tiền thặng dư ròng mỗi tháng:                      33.060.000 VNĐ/tháng│</w:t>
-              <w:br/>
-            </w:r>
-            <w:r>
-              <w:rPr>
-                <w:rFonts w:ascii="Consolas" w:hAnsi="Consolas"/>
-                <w:color w:val="F8FAFC"/>
-                <w:sz w:val="16"/>
-              </w:rPr>
-              <w:t>│  ───────────────────────────────────────────────────────────────────  │</w:t>
-              <w:br/>
-            </w:r>
-            <w:r>
-              <w:rPr>
-                <w:rFonts w:ascii="Consolas" w:hAnsi="Consolas"/>
-                <w:color w:val="F8FAFC"/>
-                <w:sz w:val="16"/>
-              </w:rPr>
-              <w:t>│  👉 THỜI GIAN THU HỒI VỐN ĐẦU TƯ:                         0.45 THÁNG (~14 NGÀY)│</w:t>
-              <w:br/>
-            </w:r>
-            <w:r>
-              <w:rPr>
-                <w:rFonts w:ascii="Consolas" w:hAnsi="Consolas"/>
-                <w:color w:val="F8FAFC"/>
-                <w:sz w:val="16"/>
-              </w:rPr>
-              <w:t>│                                                                        │</w:t>
-              <w:br/>
-            </w:r>
-            <w:r>
-              <w:rPr>
-                <w:rFonts w:ascii="Consolas" w:hAnsi="Consolas"/>
-                <w:color w:val="F8FAFC"/>
-                <w:sz w:val="16"/>
-              </w:rPr>
-              <w:t>│  🏆 KẾT LUẬN: Chỉ sau 14 ngày vận hành, chuỗi đã thu hồi 100% vốn đầu tư!     │</w:t>
-              <w:br/>
-            </w:r>
-            <w:r>
-              <w:rPr>
-                <w:rFonts w:ascii="Consolas" w:hAnsi="Consolas"/>
-                <w:color w:val="F8FAFC"/>
-                <w:sz w:val="16"/>
-              </w:rPr>
-              <w:t>└────────────────────────────────────────────────────────────────────────┘</w:t>
-              <w:br/>
-            </w:r>
-          </w:p>
-        </w:tc>
-      </w:tr>
-    </w:tbl>
-    <w:p/>
-    <w:p/>
-    <w:p>
-      <w:pPr>
-        <w:pStyle w:val="Heading1"/>
-      </w:pPr>
-      <w:r>
-        <w:rPr>
-          <w:b/>
-          <w:color w:val="8B4513"/>
-          <w:sz w:val="26"/>
-        </w:rPr>
-        <w:t>PHẦN 6. TIẾN ĐỘ THANH TOÁN &amp; ĐIỀU KHOẢN CHUYỂN GIAO</w:t>
-      </w:r>
-    </w:p>
-    <w:tbl>
-      <w:tblPr>
-        <w:tblW w:type="auto" w:w="0"/>
-        <w:jc w:val="center"/>
-        <w:tblLook w:firstColumn="1" w:firstRow="1" w:lastColumn="0" w:lastRow="0" w:noHBand="0" w:noVBand="1" w:val="04A0"/>
-        <w:tblBorders>
-          <w:top w:val="single" w:sz="4" w:space="0" w:color="CBD5E1"/>
-          <w:bottom w:val="single" w:sz="4" w:space="0" w:color="CBD5E1"/>
-          <w:left w:val="single" w:sz="4" w:space="0" w:color="CBD5E1"/>
-          <w:right w:val="single" w:sz="4" w:space="0" w:color="CBD5E1"/>
-          <w:insideH w:val="single" w:sz="4" w:space="0" w:color="CBD5E1"/>
-          <w:insideV w:val="single" w:sz="4" w:space="0" w:color="CBD5E1"/>
-        </w:tblBorders>
-      </w:tblPr>
-      <w:tblGrid>
-        <w:gridCol w:w="2509"/>
-        <w:gridCol w:w="2509"/>
-        <w:gridCol w:w="2509"/>
-        <w:gridCol w:w="2509"/>
-      </w:tblGrid>
-      <w:tr>
-        <w:tc>
-          <w:tcPr>
-            <w:tcW w:type="dxa" w:w="2592"/>
-            <w:shd w:fill="F1F5F9"/>
-            <w:tcMar>
-              <w:top w:w="80" w:type="dxa"/>
-              <w:bottom w:w="80" w:type="dxa"/>
-              <w:left w:w="100" w:type="dxa"/>
-              <w:right w:w="100" w:type="dxa"/>
-            </w:tcMar>
-          </w:tcPr>
-          <w:p>
-            <w:r>
-              <w:rPr>
-                <w:b/>
-                <w:sz w:val="17"/>
-              </w:rPr>
-              <w:t>Đợt Thanh Toán</w:t>
-            </w:r>
-          </w:p>
-        </w:tc>
-        <w:tc>
-          <w:tcPr>
-            <w:tcW w:type="dxa" w:w="1152"/>
-            <w:shd w:fill="F1F5F9"/>
-            <w:tcMar>
-              <w:top w:w="80" w:type="dxa"/>
-              <w:bottom w:w="80" w:type="dxa"/>
-              <w:left w:w="100" w:type="dxa"/>
-              <w:right w:w="100" w:type="dxa"/>
-            </w:tcMar>
-          </w:tcPr>
-          <w:p>
-            <w:r>
-              <w:rPr>
-                <w:b/>
-                <w:sz w:val="17"/>
-              </w:rPr>
-              <w:t>Tỷ Lệ</w:t>
-            </w:r>
-          </w:p>
-        </w:tc>
-        <w:tc>
-          <w:tcPr>
-            <w:tcW w:type="dxa" w:w="2160"/>
-            <w:shd w:fill="F1F5F9"/>
-            <w:tcMar>
-              <w:top w:w="80" w:type="dxa"/>
-              <w:bottom w:w="80" w:type="dxa"/>
-              <w:left w:w="100" w:type="dxa"/>
-              <w:right w:w="100" w:type="dxa"/>
-            </w:tcMar>
-          </w:tcPr>
-          <w:p>
-            <w:r>
-              <w:rPr>
-                <w:b/>
-                <w:sz w:val="17"/>
-              </w:rPr>
-              <w:t>Số Tiền (VNĐ)</w:t>
-            </w:r>
-          </w:p>
-        </w:tc>
-        <w:tc>
-          <w:tcPr>
-            <w:tcW w:type="dxa" w:w="4176"/>
-            <w:shd w:fill="F1F5F9"/>
-            <w:tcMar>
-              <w:top w:w="80" w:type="dxa"/>
-              <w:bottom w:w="80" w:type="dxa"/>
-              <w:left w:w="100" w:type="dxa"/>
-              <w:right w:w="100" w:type="dxa"/>
-            </w:tcMar>
-          </w:tcPr>
-          <w:p>
-            <w:r>
-              <w:rPr>
-                <w:b/>
-                <w:sz w:val="17"/>
-              </w:rPr>
-              <w:t>Cột Mốc Kích Hoạt</w:t>
-            </w:r>
-          </w:p>
-        </w:tc>
-      </w:tr>
-      <w:tr>
-        <w:tc>
-          <w:tcPr>
-            <w:tcW w:type="dxa" w:w="2592"/>
-            <w:tcMar>
-              <w:top w:w="80" w:type="dxa"/>
-              <w:bottom w:w="80" w:type="dxa"/>
-              <w:left w:w="100" w:type="dxa"/>
-              <w:right w:w="100" w:type="dxa"/>
-            </w:tcMar>
-          </w:tcPr>
-          <w:p>
-            <w:pPr>
-              <w:jc w:val="center"/>
-            </w:pPr>
-            <w:r>
-              <w:rPr>
-                <w:b/>
-                <w:sz w:val="17"/>
-              </w:rPr>
-              <w:t>Đợt 1 (Tạm ứng)</w:t>
-            </w:r>
-          </w:p>
-        </w:tc>
-        <w:tc>
-          <w:tcPr>
-            <w:tcW w:type="dxa" w:w="1152"/>
-            <w:tcMar>
-              <w:top w:w="80" w:type="dxa"/>
-              <w:bottom w:w="80" w:type="dxa"/>
-              <w:left w:w="100" w:type="dxa"/>
-              <w:right w:w="100" w:type="dxa"/>
-            </w:tcMar>
-          </w:tcPr>
-          <w:p>
-            <w:pPr>
-              <w:jc w:val="center"/>
-            </w:pPr>
-            <w:r>
-              <w:rPr>
-                <w:b/>
-                <w:sz w:val="17"/>
-              </w:rPr>
-              <w:t>30%</w:t>
-            </w:r>
-          </w:p>
-        </w:tc>
-        <w:tc>
-          <w:tcPr>
-            <w:tcW w:type="dxa" w:w="2160"/>
-            <w:tcMar>
-              <w:top w:w="80" w:type="dxa"/>
-              <w:bottom w:w="80" w:type="dxa"/>
-              <w:left w:w="100" w:type="dxa"/>
-              <w:right w:w="100" w:type="dxa"/>
-            </w:tcMar>
-          </w:tcPr>
-          <w:p>
-            <w:pPr>
-              <w:jc w:val="right"/>
-            </w:pPr>
-            <w:r>
-              <w:rPr>
-                <w:b/>
-                <w:sz w:val="17"/>
-              </w:rPr>
-              <w:t>4.500.000</w:t>
-            </w:r>
-          </w:p>
-        </w:tc>
-        <w:tc>
-          <w:tcPr>
-            <w:tcW w:type="dxa" w:w="4176"/>
-            <w:tcMar>
-              <w:top w:w="80" w:type="dxa"/>
-              <w:bottom w:w="80" w:type="dxa"/>
-              <w:left w:w="100" w:type="dxa"/>
-              <w:right w:w="100" w:type="dxa"/>
-            </w:tcMar>
-          </w:tcPr>
-          <w:p>
-            <w:r>
-              <w:rPr>
-                <w:sz w:val="17"/>
-              </w:rPr>
-              <w:t>Ký kết hợp đồng và phê duyệt Bản đặc tả kỹ thuật (SRS &amp; API Spec)</w:t>
-            </w:r>
-          </w:p>
-        </w:tc>
-      </w:tr>
-      <w:tr>
-        <w:tc>
-          <w:tcPr>
-            <w:tcW w:type="dxa" w:w="2592"/>
-            <w:tcMar>
-              <w:top w:w="80" w:type="dxa"/>
-              <w:bottom w:w="80" w:type="dxa"/>
-              <w:left w:w="100" w:type="dxa"/>
-              <w:right w:w="100" w:type="dxa"/>
-            </w:tcMar>
-          </w:tcPr>
-          <w:p>
-            <w:pPr>
-              <w:jc w:val="center"/>
-            </w:pPr>
-            <w:r>
-              <w:rPr>
-                <w:b/>
-                <w:sz w:val="17"/>
-              </w:rPr>
-              <w:t>Đợt 2 (Nghiệm thu UAT)</w:t>
-            </w:r>
-          </w:p>
-        </w:tc>
-        <w:tc>
-          <w:tcPr>
-            <w:tcW w:type="dxa" w:w="1152"/>
-            <w:tcMar>
-              <w:top w:w="80" w:type="dxa"/>
-              <w:bottom w:w="80" w:type="dxa"/>
-              <w:left w:w="100" w:type="dxa"/>
-              <w:right w:w="100" w:type="dxa"/>
-            </w:tcMar>
-          </w:tcPr>
-          <w:p>
-            <w:pPr>
-              <w:jc w:val="center"/>
-            </w:pPr>
-            <w:r>
-              <w:rPr>
-                <w:b/>
-                <w:sz w:val="17"/>
-              </w:rPr>
-              <w:t>40%</w:t>
-            </w:r>
-          </w:p>
-        </w:tc>
-        <w:tc>
-          <w:tcPr>
-            <w:tcW w:type="dxa" w:w="2160"/>
-            <w:tcMar>
-              <w:top w:w="80" w:type="dxa"/>
-              <w:bottom w:w="80" w:type="dxa"/>
-              <w:left w:w="100" w:type="dxa"/>
-              <w:right w:w="100" w:type="dxa"/>
-            </w:tcMar>
-          </w:tcPr>
-          <w:p>
-            <w:pPr>
-              <w:jc w:val="right"/>
-            </w:pPr>
-            <w:r>
-              <w:rPr>
-                <w:b/>
-                <w:sz w:val="17"/>
-              </w:rPr>
-              <w:t>6.000.000</w:t>
-            </w:r>
-          </w:p>
-        </w:tc>
-        <w:tc>
-          <w:tcPr>
-            <w:tcW w:type="dxa" w:w="4176"/>
-            <w:tcMar>
-              <w:top w:w="80" w:type="dxa"/>
-              <w:bottom w:w="80" w:type="dxa"/>
-              <w:left w:w="100" w:type="dxa"/>
-              <w:right w:w="100" w:type="dxa"/>
-            </w:tcMar>
-          </w:tcPr>
-          <w:p>
-            <w:r>
-              <w:rPr>
-                <w:sz w:val="17"/>
-              </w:rPr>
-              <w:t>Hoàn thành bản dựng hệ thống, cấu hình PayOS &amp; chạy thử nghiệm UAT</w:t>
-            </w:r>
-          </w:p>
-        </w:tc>
-      </w:tr>
-      <w:tr>
-        <w:tc>
-          <w:tcPr>
-            <w:tcW w:type="dxa" w:w="2592"/>
-            <w:tcMar>
-              <w:top w:w="80" w:type="dxa"/>
-              <w:bottom w:w="80" w:type="dxa"/>
-              <w:left w:w="100" w:type="dxa"/>
-              <w:right w:w="100" w:type="dxa"/>
-            </w:tcMar>
-          </w:tcPr>
-          <w:p>
-            <w:pPr>
-              <w:jc w:val="center"/>
-            </w:pPr>
-            <w:r>
-              <w:rPr>
-                <w:b/>
-                <w:sz w:val="17"/>
-              </w:rPr>
-              <w:t>Đợt 3 (Quyết toán)</w:t>
-            </w:r>
-          </w:p>
-        </w:tc>
-        <w:tc>
-          <w:tcPr>
-            <w:tcW w:type="dxa" w:w="1152"/>
-            <w:tcMar>
-              <w:top w:w="80" w:type="dxa"/>
-              <w:bottom w:w="80" w:type="dxa"/>
-              <w:left w:w="100" w:type="dxa"/>
-              <w:right w:w="100" w:type="dxa"/>
-            </w:tcMar>
-          </w:tcPr>
-          <w:p>
-            <w:pPr>
-              <w:jc w:val="center"/>
-            </w:pPr>
-            <w:r>
-              <w:rPr>
-                <w:b/>
-                <w:sz w:val="17"/>
-              </w:rPr>
-              <w:t>30%</w:t>
-            </w:r>
-          </w:p>
-        </w:tc>
-        <w:tc>
-          <w:tcPr>
-            <w:tcW w:type="dxa" w:w="2160"/>
-            <w:tcMar>
-              <w:top w:w="80" w:type="dxa"/>
-              <w:bottom w:w="80" w:type="dxa"/>
-              <w:left w:w="100" w:type="dxa"/>
-              <w:right w:w="100" w:type="dxa"/>
-            </w:tcMar>
-          </w:tcPr>
-          <w:p>
-            <w:pPr>
-              <w:jc w:val="right"/>
-            </w:pPr>
-            <w:r>
-              <w:rPr>
-                <w:b/>
-                <w:sz w:val="17"/>
-              </w:rPr>
-              <w:t>4.500.000</w:t>
-            </w:r>
-          </w:p>
-        </w:tc>
-        <w:tc>
-          <w:tcPr>
-            <w:tcW w:type="dxa" w:w="4176"/>
-            <w:tcMar>
-              <w:top w:w="80" w:type="dxa"/>
-              <w:bottom w:w="80" w:type="dxa"/>
-              <w:left w:w="100" w:type="dxa"/>
-              <w:right w:w="100" w:type="dxa"/>
-            </w:tcMar>
-          </w:tcPr>
-          <w:p>
-            <w:r>
-              <w:rPr>
-                <w:sz w:val="17"/>
-              </w:rPr>
-              <w:t>Nghiệm thu chính thức, bàn giao 100% mã nguồn, Docker và tài liệu</w:t>
-            </w:r>
-          </w:p>
-        </w:tc>
-      </w:tr>
-      <w:tr>
-        <w:tc>
-          <w:tcPr>
-            <w:tcW w:type="dxa" w:w="2592"/>
-            <w:shd w:fill="FEF3C7"/>
-            <w:tcMar>
-              <w:top w:w="80" w:type="dxa"/>
-              <w:bottom w:w="80" w:type="dxa"/>
-              <w:left w:w="100" w:type="dxa"/>
-              <w:right w:w="100" w:type="dxa"/>
-            </w:tcMar>
-          </w:tcPr>
-          <w:p>
-            <w:pPr>
-              <w:jc w:val="center"/>
-            </w:pPr>
-            <w:r>
-              <w:rPr>
-                <w:b/>
-                <w:sz w:val="17"/>
-              </w:rPr>
-              <w:t>🏆 TỔNG CỘNG</w:t>
-            </w:r>
-          </w:p>
-        </w:tc>
-        <w:tc>
-          <w:tcPr>
-            <w:tcW w:type="dxa" w:w="1152"/>
-            <w:shd w:fill="FEF3C7"/>
-            <w:tcMar>
-              <w:top w:w="80" w:type="dxa"/>
-              <w:bottom w:w="80" w:type="dxa"/>
-              <w:left w:w="100" w:type="dxa"/>
-              <w:right w:w="100" w:type="dxa"/>
-            </w:tcMar>
-          </w:tcPr>
-          <w:p>
-            <w:pPr>
-              <w:jc w:val="center"/>
-            </w:pPr>
-            <w:r>
-              <w:rPr>
-                <w:b/>
-                <w:sz w:val="17"/>
-              </w:rPr>
-              <w:t>100%</w:t>
-            </w:r>
-          </w:p>
-        </w:tc>
-        <w:tc>
-          <w:tcPr>
-            <w:tcW w:type="dxa" w:w="2160"/>
-            <w:shd w:fill="FEF3C7"/>
-            <w:tcMar>
-              <w:top w:w="80" w:type="dxa"/>
-              <w:bottom w:w="80" w:type="dxa"/>
-              <w:left w:w="100" w:type="dxa"/>
-              <w:right w:w="100" w:type="dxa"/>
-            </w:tcMar>
-          </w:tcPr>
-          <w:p>
-            <w:pPr>
-              <w:jc w:val="right"/>
-            </w:pPr>
-            <w:r>
-              <w:rPr>
-                <w:b/>
-                <w:sz w:val="17"/>
-              </w:rPr>
-              <w:t>15.000.000 VNĐ</w:t>
-            </w:r>
-          </w:p>
-        </w:tc>
-        <w:tc>
-          <w:tcPr>
-            <w:tcW w:type="dxa" w:w="4176"/>
-            <w:shd w:fill="FEF3C7"/>
-            <w:tcMar>
-              <w:top w:w="80" w:type="dxa"/>
-              <w:bottom w:w="80" w:type="dxa"/>
-              <w:left w:w="100" w:type="dxa"/>
-              <w:right w:w="100" w:type="dxa"/>
-            </w:tcMar>
-          </w:tcPr>
-          <w:p>
-            <w:r>
-              <w:rPr>
-                <w:sz w:val="17"/>
-              </w:rPr>
-              <w:t>Thanh toán theo đúng tiến độ bàn giao thực tế</w:t>
+              <w:t>Toàn bộ hệ thống chạy trên nền tảng 100% Web-First, do đó quán hoàn toàn có thể tận dụng thiết bị sẵn có (Smart TV, Laptop cũ, Tablet, Điện thoại) mà KHÔNG bắt buộc phải mua mới. Chi phí thiết bị dưới đây mang tính chất tham khảo chuẩn bị và 0 VNĐ tính vào ngân sách phần mềm của dự án.</w:t>
             </w:r>
           </w:p>
         </w:tc>
@@ -7617,170 +3519,118 @@
         <w:rPr>
           <w:b/>
         </w:rPr>
-        <w:t>Cam Kết Chất Lượng &amp; Hỗ Trợ Kỹ Thuật:</w:t>
+        <w:t>Danh sách thiết bị cần trang bị tại mỗi chi nhánh:</w:t>
         <w:br/>
       </w:r>
+    </w:p>
+    <w:p>
+      <w:pPr>
+        <w:ind w:left="288"/>
+      </w:pPr>
       <w:r>
-        <w:t>1. Cam kết không phát sinh chi phí ẩn: 100% chi phí phát triển và vận hành đều được liệt kê minh bạch.</w:t>
-        <w:br/>
+        <w:rPr>
+          <w:b/>
+          <w:sz w:val="18"/>
+        </w:rPr>
+        <w:t xml:space="preserve">• Màn hình KDS Bếp (01 cái/quán): </w:t>
       </w:r>
       <w:r>
-        <w:t>2. Sở hữu trọn đời &amp; Không phí bản quyền: Khách hàng sở hữu vĩnh viễn hệ thống, không phải trả phí bản quyền hàng tháng.</w:t>
-        <w:br/>
+        <w:rPr>
+          <w:sz w:val="18"/>
+        </w:rPr>
+        <w:t>Smart TV 32"–43" có trình duyệt web, hoặc Tablet Android/iPad 10"+ đặt tại quầy pha chế để Barista nhận đơn, xem định mức BOM và thao tác 86-toggle hết món.</w:t>
+      </w:r>
+    </w:p>
+    <w:p>
+      <w:pPr>
+        <w:ind w:left="288"/>
+      </w:pPr>
+      <w:r>
+        <w:rPr>
+          <w:b/>
+          <w:sz w:val="18"/>
+        </w:rPr>
+        <w:t xml:space="preserve">• Thiết bị Web POS Quầy (01 cái/quán): </w:t>
       </w:r>
       <w:r>
-        <w:t>3. Bảo hành toàn diện 03 tháng: Khắc phục sự cố khẩn cấp trong vòng &lt; 30 phút trong suốt thời gian bảo hành.</w:t>
-        <w:br/>
+        <w:rPr>
+          <w:sz w:val="18"/>
+        </w:rPr>
+        <w:t>Laptop, máy tính PC để bàn hoặc máy tính bảng có trình duyệt Google Chrome để Thu ngân tạo đơn Takeaway, tra cứu tích điểm CRM 10 ly và quản lý ca thu chi.</w:t>
+      </w:r>
+    </w:p>
+    <w:p>
+      <w:pPr>
+        <w:ind w:left="288"/>
+      </w:pPr>
+      <w:r>
+        <w:rPr>
+          <w:b/>
+          <w:sz w:val="18"/>
+        </w:rPr>
+        <w:t xml:space="preserve">• Máy in nhiệt khổ K80 (01 máy/quán): </w:t>
       </w:r>
       <w:r>
-        <w:t>4. Chuyển giao &amp; Đào tạo chuyên sâu: Bàn giao bộ tài liệu kỹ thuật hoàn chỉnh và 01 buổi đào tạo trực tiếp cho ban quản lý.</w:t>
+        <w:rPr>
+          <w:sz w:val="18"/>
+        </w:rPr>
+        <w:t>Máy in bill nhiệt khổ K80 cổng LAN hoặc USB (các dòng phổ biến như Xprinter, Epson) dùng in hóa đơn thanh toán VietQR (Nhánh B) và tem dán ly.</w:t>
       </w:r>
     </w:p>
-    <w:p/>
-    <w:p/>
-    <w:tbl>
-      <w:tblPr>
-        <w:tblW w:type="auto" w:w="0"/>
-        <w:jc w:val="center"/>
-        <w:tblLook w:firstColumn="1" w:firstRow="1" w:lastColumn="0" w:lastRow="0" w:noHBand="0" w:noVBand="1" w:val="04A0"/>
-      </w:tblPr>
-      <w:tblGrid>
-        <w:gridCol w:w="5018"/>
-        <w:gridCol w:w="5018"/>
-      </w:tblGrid>
-      <w:tr>
-        <w:tc>
-          <w:tcPr>
-            <w:tcW w:type="dxa" w:w="5018"/>
-          </w:tcPr>
-          <w:p>
-            <w:pPr>
-              <w:jc w:val="center"/>
-            </w:pPr>
-            <w:r>
-              <w:rPr>
-                <w:b/>
-              </w:rPr>
-              <w:t>ĐẠI DIỆN KHÁCH HÀNG</w:t>
-            </w:r>
-          </w:p>
-        </w:tc>
-        <w:tc>
-          <w:tcPr>
-            <w:tcW w:type="dxa" w:w="5018"/>
-          </w:tcPr>
-          <w:p>
-            <w:pPr>
-              <w:jc w:val="center"/>
-            </w:pPr>
-            <w:r>
-              <w:rPr>
-                <w:b/>
-              </w:rPr>
-              <w:t>ĐẠI DIỆN ĐỘI NGŨ PHÁT TRIỂN</w:t>
-            </w:r>
-          </w:p>
-        </w:tc>
-      </w:tr>
-      <w:tr>
-        <w:tc>
-          <w:tcPr>
-            <w:tcW w:type="dxa" w:w="5018"/>
-          </w:tcPr>
-          <w:p>
-            <w:pPr>
-              <w:jc w:val="center"/>
-            </w:pPr>
-            <w:r>
-              <w:rPr>
-                <w:i/>
-              </w:rPr>
-              <w:t>(Ký và ghi rõ họ tên)</w:t>
-            </w:r>
-          </w:p>
-        </w:tc>
-        <w:tc>
-          <w:tcPr>
-            <w:tcW w:type="dxa" w:w="5018"/>
-          </w:tcPr>
-          <w:p>
-            <w:pPr>
-              <w:jc w:val="center"/>
-            </w:pPr>
-            <w:r>
-              <w:rPr>
-                <w:i/>
-              </w:rPr>
-              <w:t>(Ký và ghi rõ họ tên)</w:t>
-            </w:r>
-          </w:p>
-        </w:tc>
-      </w:tr>
-      <w:tr>
-        <w:tc>
-          <w:tcPr>
-            <w:tcW w:type="dxa" w:w="5018"/>
-          </w:tcPr>
-          <w:p/>
-        </w:tc>
-        <w:tc>
-          <w:tcPr>
-            <w:tcW w:type="dxa" w:w="5018"/>
-          </w:tcPr>
-          <w:p/>
-        </w:tc>
-      </w:tr>
-      <w:tr>
-        <w:tc>
-          <w:tcPr>
-            <w:tcW w:type="dxa" w:w="5018"/>
-          </w:tcPr>
-          <w:p/>
-        </w:tc>
-        <w:tc>
-          <w:tcPr>
-            <w:tcW w:type="dxa" w:w="5018"/>
-          </w:tcPr>
-          <w:p/>
-        </w:tc>
-      </w:tr>
-      <w:tr>
-        <w:tc>
-          <w:tcPr>
-            <w:tcW w:type="dxa" w:w="5018"/>
-          </w:tcPr>
-          <w:p/>
-        </w:tc>
-        <w:tc>
-          <w:tcPr>
-            <w:tcW w:type="dxa" w:w="5018"/>
-          </w:tcPr>
-          <w:p/>
-        </w:tc>
-      </w:tr>
-      <w:tr>
-        <w:tc>
-          <w:tcPr>
-            <w:tcW w:type="dxa" w:w="5018"/>
-          </w:tcPr>
-          <w:p>
-            <w:r>
-              <w:t>Ngày: ..... / ..... / 2026</w:t>
-            </w:r>
-          </w:p>
-        </w:tc>
-        <w:tc>
-          <w:tcPr>
-            <w:tcW w:type="dxa" w:w="5018"/>
-          </w:tcPr>
-          <w:p>
-            <w:r>
-              <w:t>Ngày: 23 / 08 / 2026</w:t>
-            </w:r>
-          </w:p>
-        </w:tc>
-      </w:tr>
-    </w:tbl>
+    <w:p>
+      <w:pPr>
+        <w:ind w:left="288"/>
+      </w:pPr>
+      <w:r>
+        <w:rPr>
+          <w:b/>
+          <w:sz w:val="18"/>
+        </w:rPr>
+        <w:t xml:space="preserve">• Bộ phát Router WiFi (01–02 bộ/quán): </w:t>
+      </w:r>
+      <w:r>
+        <w:rPr>
+          <w:sz w:val="18"/>
+        </w:rPr>
+        <w:t>Router phát sóng WiFi mạng nội bộ ổn định và có BSSID cố định để phục vụ tính năng chấm công nhân viên khóa theo mạng chi nhánh.</w:t>
+      </w:r>
+    </w:p>
+    <w:p>
+      <w:pPr>
+        <w:ind w:left="288"/>
+      </w:pPr>
+      <w:r>
+        <w:rPr>
+          <w:b/>
+          <w:sz w:val="18"/>
+        </w:rPr>
+        <w:t xml:space="preserve">• Standee QR Delivery (01–02 tấm/quán): </w:t>
+      </w:r>
+      <w:r>
+        <w:rPr>
+          <w:sz w:val="18"/>
+        </w:rPr>
+        <w:t>Standee mica A4 đặt tại quầy hoặc cửa ra vào để khách quét đặt đồ giao tận nơi.</w:t>
+      </w:r>
+    </w:p>
+    <w:p>
+      <w:pPr>
+        <w:ind w:left="288"/>
+      </w:pPr>
+      <w:r>
+        <w:rPr>
+          <w:b/>
+          <w:sz w:val="18"/>
+        </w:rPr>
+        <w:t xml:space="preserve">• Bộ nhãn QR dán mặt bàn (Theo số bàn): </w:t>
+      </w:r>
+      <w:r>
+        <w:rPr>
+          <w:sz w:val="18"/>
+        </w:rPr>
+        <w:t>Decal in mã QR từng bàn ép màng chống nước để khách quét tự gọi món (Self-Ordering).</w:t>
+      </w:r>
+    </w:p>
     <w:sectPr>
       <w:pgSz w:w="11909" w:h="16834"/>
       <w:pgMar w:top="936" w:right="936" w:bottom="936" w:left="936" w:header="720" w:footer="720" w:gutter="0"/>

</xml_diff>

<commit_message>
feat(pricing): update part 2 with 2 hosting scenarios, add on-demand maintenance 300k-500k/incident and negotiable feature requests
</commit_message>
<xml_diff>
--- a/02_Bao_Gia_Chi_Phi/Bao_Gia_Chi_Phi_Smart_FB_OS.docx
+++ b/02_Bao_Gia_Chi_Phi/Bao_Gia_Chi_Phi_Smart_FB_OS.docx
@@ -444,7 +444,7 @@
                 <w:b/>
                 <w:sz w:val="18"/>
               </w:rPr>
-              <w:t>3. DỊCH VỤ BẢO TRÌ (SLA)</w:t>
+              <w:t>3. BẢO TRÌ &amp; TÍNH NĂNG MỚI</w:t>
             </w:r>
           </w:p>
         </w:tc>
@@ -506,7 +506,7 @@
               <w:br/>
               <w:t>• Vật tư giấy in nhiệt 3 quán</w:t>
               <w:br/>
-              <w:t>• Cổng thanh toán VietQR PayOS</w:t>
+              <w:t>• Kịch bản tối ưu chi phí</w:t>
               <w:br/>
               <w:br/>
             </w:r>
@@ -540,9 +540,9 @@
               </w:rPr>
               <w:t>• 03 Tháng đầu: MIỄN PHÍ 100%</w:t>
               <w:br/>
-              <w:t>• Từ tháng 4: Gói Tier 1</w:t>
+              <w:t>• Hỗ trợ theo lần: 300k - 500k/lần</w:t>
               <w:br/>
-              <w:t>• Hỗ trợ kỹ thuật 24/7</w:t>
+              <w:t>• Thêm tính năng mới: Thương lượng</w:t>
               <w:br/>
               <w:br/>
             </w:r>
@@ -552,9 +552,9 @@
                 <w:color w:val="059669"/>
                 <w:sz w:val="19"/>
               </w:rPr>
-              <w:t>💰 1.000.000 VNĐ / THÁNG</w:t>
+              <w:t>💰 300.000 – 500.000 Đ/LẦN</w:t>
               <w:br/>
-              <w:t>(~333.000 đ/quán/tháng)</w:t>
+              <w:t>(Thêm tính năng: Thương lượng)</w:t>
             </w:r>
           </w:p>
         </w:tc>
@@ -646,7 +646,7 @@
           <w:i/>
           <w:sz w:val="19"/>
         </w:rPr>
-        <w:t>(Bằng chữ: Mười lăm triệu đồng chẵn — Trả một lần duy nhất, sở hữu vĩnh viễn 100% mã nguồn).</w:t>
+        <w:t>(Bằng chữ: Mười lăm triệu đồng chẵn — Trả một lần duy nhất, sở hữu vĩnh viễn mã nguồn).</w:t>
       </w:r>
     </w:p>
     <w:p>
@@ -814,6 +814,27 @@
           <w:sz w:val="26"/>
         </w:rPr>
         <w:t>PHẦN 2. DỰ TOÁN CHI PHÍ VẬN HÀNH ĐỊNH KỲ (OPEX HÀNG THÁNG)</w:t>
+      </w:r>
+    </w:p>
+    <w:p>
+      <w:pPr>
+        <w:pStyle w:val="Heading2"/>
+      </w:pPr>
+      <w:r>
+        <w:rPr>
+          <w:b/>
+          <w:color w:val="1E293B"/>
+          <w:sz w:val="22"/>
+        </w:rPr>
+        <w:t>🌟 KỊCH BẢN A: HẠ TẦNG CLOUD VPS VIỆT NAM (KHUYÊN DÙNG — TỐI ƯU CHI PHÍ)</w:t>
+      </w:r>
+    </w:p>
+    <w:p>
+      <w:r>
+        <w:rPr>
+          <w:sz w:val="17"/>
+        </w:rPr>
+        <w:t>Mô hình tự triển khai Docker Compose trên VPS Việt Nam, chi phí tối thiểu, hiệu năng cao và đường truyền nội địa ổn định cho chuỗi 03 quán.</w:t>
       </w:r>
     </w:p>
     <w:tbl>
@@ -2226,7 +2247,7 @@
               <w:rPr>
                 <w:b/>
               </w:rPr>
-              <w:t>TỔNG CHI PHÍ VẬN HÀNH (OPEX / 3 QUÁN)</w:t>
+              <w:t>TỔNG OPEX KỊCH BẢN A (3 QUÁN)</w:t>
             </w:r>
           </w:p>
         </w:tc>
@@ -2295,7 +2316,15 @@
           <w:color w:val="1E293B"/>
           <w:sz w:val="22"/>
         </w:rPr>
-        <w:t>So Sánh Chi Phí Vận Hành Theo Quy Mô Chuỗi</w:t>
+        <w:t>🚀 KỊCH BẢN B: HẠ TẦNG MANAGED CLOUD / SERVERLESS (MỞ RỘNG LINH HOẠT)</w:t>
+      </w:r>
+    </w:p>
+    <w:p>
+      <w:r>
+        <w:rPr>
+          <w:sz w:val="17"/>
+        </w:rPr>
+        <w:t>Mô hình sử dụng các dịch vụ Cloud quốc tế có sẵn tính năng Auto-scaling và Managed Database.</w:t>
       </w:r>
     </w:p>
     <w:tbl>
@@ -2313,422 +2342,18 @@
         </w:tblBorders>
       </w:tblPr>
       <w:tblGrid>
-        <w:gridCol w:w="2509"/>
-        <w:gridCol w:w="2509"/>
-        <w:gridCol w:w="2509"/>
-        <w:gridCol w:w="2509"/>
+        <w:gridCol w:w="1673"/>
+        <w:gridCol w:w="1673"/>
+        <w:gridCol w:w="1673"/>
+        <w:gridCol w:w="1673"/>
+        <w:gridCol w:w="1673"/>
+        <w:gridCol w:w="1673"/>
       </w:tblGrid>
       <w:tr>
         <w:tc>
           <w:tcPr>
-            <w:tcW w:type="dxa" w:w="3600"/>
+            <w:tcW w:type="dxa" w:w="576"/>
             <w:shd w:fill="F1F5F9"/>
-            <w:tcMar>
-              <w:top w:w="80" w:type="dxa"/>
-              <w:bottom w:w="80" w:type="dxa"/>
-              <w:left w:w="100" w:type="dxa"/>
-              <w:right w:w="100" w:type="dxa"/>
-            </w:tcMar>
-          </w:tcPr>
-          <w:p>
-            <w:r>
-              <w:rPr>
-                <w:b/>
-                <w:sz w:val="17"/>
-              </w:rPr>
-              <w:t>Khoản Mục Chi Phí (VNĐ / Tháng)</w:t>
-            </w:r>
-          </w:p>
-        </w:tc>
-        <w:tc>
-          <w:tcPr>
-            <w:tcW w:type="dxa" w:w="2160"/>
-            <w:shd w:fill="F1F5F9"/>
-            <w:tcMar>
-              <w:top w:w="80" w:type="dxa"/>
-              <w:bottom w:w="80" w:type="dxa"/>
-              <w:left w:w="100" w:type="dxa"/>
-              <w:right w:w="100" w:type="dxa"/>
-            </w:tcMar>
-          </w:tcPr>
-          <w:p>
-            <w:r>
-              <w:rPr>
-                <w:b/>
-                <w:sz w:val="17"/>
-              </w:rPr>
-              <w:t>1 Quán Thí Điểm</w:t>
-            </w:r>
-          </w:p>
-        </w:tc>
-        <w:tc>
-          <w:tcPr>
-            <w:tcW w:type="dxa" w:w="2160"/>
-            <w:shd w:fill="F1F5F9"/>
-            <w:tcMar>
-              <w:top w:w="80" w:type="dxa"/>
-              <w:bottom w:w="80" w:type="dxa"/>
-              <w:left w:w="100" w:type="dxa"/>
-              <w:right w:w="100" w:type="dxa"/>
-            </w:tcMar>
-          </w:tcPr>
-          <w:p>
-            <w:r>
-              <w:rPr>
-                <w:b/>
-                <w:sz w:val="17"/>
-              </w:rPr>
-              <w:t>3 Quán (Hiện Tại)</w:t>
-            </w:r>
-          </w:p>
-        </w:tc>
-        <w:tc>
-          <w:tcPr>
-            <w:tcW w:type="dxa" w:w="2160"/>
-            <w:shd w:fill="F1F5F9"/>
-            <w:tcMar>
-              <w:top w:w="80" w:type="dxa"/>
-              <w:bottom w:w="80" w:type="dxa"/>
-              <w:left w:w="100" w:type="dxa"/>
-              <w:right w:w="100" w:type="dxa"/>
-            </w:tcMar>
-          </w:tcPr>
-          <w:p>
-            <w:r>
-              <w:rPr>
-                <w:b/>
-                <w:sz w:val="17"/>
-              </w:rPr>
-              <w:t>5 Quán (Mở Rộng Chuỗi)</w:t>
-            </w:r>
-          </w:p>
-        </w:tc>
-      </w:tr>
-      <w:tr>
-        <w:tc>
-          <w:tcPr>
-            <w:tcW w:type="dxa" w:w="3600"/>
-            <w:tcMar>
-              <w:top w:w="80" w:type="dxa"/>
-              <w:bottom w:w="80" w:type="dxa"/>
-              <w:left w:w="100" w:type="dxa"/>
-              <w:right w:w="100" w:type="dxa"/>
-            </w:tcMar>
-          </w:tcPr>
-          <w:p>
-            <w:r>
-              <w:rPr>
-                <w:sz w:val="16"/>
-              </w:rPr>
-              <w:t>1. Hạ Tầng Cloud VPS &amp; Tên Miền</w:t>
-            </w:r>
-          </w:p>
-        </w:tc>
-        <w:tc>
-          <w:tcPr>
-            <w:tcW w:type="dxa" w:w="2160"/>
-            <w:tcMar>
-              <w:top w:w="80" w:type="dxa"/>
-              <w:bottom w:w="80" w:type="dxa"/>
-              <w:left w:w="100" w:type="dxa"/>
-              <w:right w:w="100" w:type="dxa"/>
-            </w:tcMar>
-          </w:tcPr>
-          <w:p>
-            <w:r>
-              <w:rPr>
-                <w:sz w:val="16"/>
-              </w:rPr>
-              <w:t>490.000</w:t>
-            </w:r>
-          </w:p>
-        </w:tc>
-        <w:tc>
-          <w:tcPr>
-            <w:tcW w:type="dxa" w:w="2160"/>
-            <w:tcMar>
-              <w:top w:w="80" w:type="dxa"/>
-              <w:bottom w:w="80" w:type="dxa"/>
-              <w:left w:w="100" w:type="dxa"/>
-              <w:right w:w="100" w:type="dxa"/>
-            </w:tcMar>
-          </w:tcPr>
-          <w:p>
-            <w:r>
-              <w:rPr>
-                <w:sz w:val="16"/>
-              </w:rPr>
-              <w:t>490.000</w:t>
-            </w:r>
-          </w:p>
-        </w:tc>
-        <w:tc>
-          <w:tcPr>
-            <w:tcW w:type="dxa" w:w="2160"/>
-            <w:tcMar>
-              <w:top w:w="80" w:type="dxa"/>
-              <w:bottom w:w="80" w:type="dxa"/>
-              <w:left w:w="100" w:type="dxa"/>
-              <w:right w:w="100" w:type="dxa"/>
-            </w:tcMar>
-          </w:tcPr>
-          <w:p>
-            <w:r>
-              <w:rPr>
-                <w:sz w:val="16"/>
-              </w:rPr>
-              <w:t>740.000 (VPS 8 vCPU / 16GB)</w:t>
-            </w:r>
-          </w:p>
-        </w:tc>
-      </w:tr>
-      <w:tr>
-        <w:tc>
-          <w:tcPr>
-            <w:tcW w:type="dxa" w:w="3600"/>
-            <w:shd w:fill="FAFAFC"/>
-            <w:tcMar>
-              <w:top w:w="80" w:type="dxa"/>
-              <w:bottom w:w="80" w:type="dxa"/>
-              <w:left w:w="100" w:type="dxa"/>
-              <w:right w:w="100" w:type="dxa"/>
-            </w:tcMar>
-          </w:tcPr>
-          <w:p>
-            <w:r>
-              <w:rPr>
-                <w:sz w:val="16"/>
-              </w:rPr>
-              <w:t>2. Dịch Vụ AI Gemini &amp; API</w:t>
-            </w:r>
-          </w:p>
-        </w:tc>
-        <w:tc>
-          <w:tcPr>
-            <w:tcW w:type="dxa" w:w="2160"/>
-            <w:shd w:fill="FAFAFC"/>
-            <w:tcMar>
-              <w:top w:w="80" w:type="dxa"/>
-              <w:bottom w:w="80" w:type="dxa"/>
-              <w:left w:w="100" w:type="dxa"/>
-              <w:right w:w="100" w:type="dxa"/>
-            </w:tcMar>
-          </w:tcPr>
-          <w:p>
-            <w:r>
-              <w:rPr>
-                <w:sz w:val="16"/>
-              </w:rPr>
-              <w:t>50.000</w:t>
-            </w:r>
-          </w:p>
-        </w:tc>
-        <w:tc>
-          <w:tcPr>
-            <w:tcW w:type="dxa" w:w="2160"/>
-            <w:shd w:fill="FAFAFC"/>
-            <w:tcMar>
-              <w:top w:w="80" w:type="dxa"/>
-              <w:bottom w:w="80" w:type="dxa"/>
-              <w:left w:w="100" w:type="dxa"/>
-              <w:right w:w="100" w:type="dxa"/>
-            </w:tcMar>
-          </w:tcPr>
-          <w:p>
-            <w:r>
-              <w:rPr>
-                <w:sz w:val="16"/>
-              </w:rPr>
-              <w:t>150.000</w:t>
-            </w:r>
-          </w:p>
-        </w:tc>
-        <w:tc>
-          <w:tcPr>
-            <w:tcW w:type="dxa" w:w="2160"/>
-            <w:shd w:fill="FAFAFC"/>
-            <w:tcMar>
-              <w:top w:w="80" w:type="dxa"/>
-              <w:bottom w:w="80" w:type="dxa"/>
-              <w:left w:w="100" w:type="dxa"/>
-              <w:right w:w="100" w:type="dxa"/>
-            </w:tcMar>
-          </w:tcPr>
-          <w:p>
-            <w:r>
-              <w:rPr>
-                <w:sz w:val="16"/>
-              </w:rPr>
-              <w:t>250.000</w:t>
-            </w:r>
-          </w:p>
-        </w:tc>
-      </w:tr>
-      <w:tr>
-        <w:tc>
-          <w:tcPr>
-            <w:tcW w:type="dxa" w:w="3600"/>
-            <w:tcMar>
-              <w:top w:w="80" w:type="dxa"/>
-              <w:bottom w:w="80" w:type="dxa"/>
-              <w:left w:w="100" w:type="dxa"/>
-              <w:right w:w="100" w:type="dxa"/>
-            </w:tcMar>
-          </w:tcPr>
-          <w:p>
-            <w:r>
-              <w:rPr>
-                <w:sz w:val="16"/>
-              </w:rPr>
-              <w:t>3. Vật Tư Tiêu Hao (Giấy In K80)</w:t>
-            </w:r>
-          </w:p>
-        </w:tc>
-        <w:tc>
-          <w:tcPr>
-            <w:tcW w:type="dxa" w:w="2160"/>
-            <w:tcMar>
-              <w:top w:w="80" w:type="dxa"/>
-              <w:bottom w:w="80" w:type="dxa"/>
-              <w:left w:w="100" w:type="dxa"/>
-              <w:right w:w="100" w:type="dxa"/>
-            </w:tcMar>
-          </w:tcPr>
-          <w:p>
-            <w:r>
-              <w:rPr>
-                <w:sz w:val="16"/>
-              </w:rPr>
-              <w:t>100.000</w:t>
-            </w:r>
-          </w:p>
-        </w:tc>
-        <w:tc>
-          <w:tcPr>
-            <w:tcW w:type="dxa" w:w="2160"/>
-            <w:tcMar>
-              <w:top w:w="80" w:type="dxa"/>
-              <w:bottom w:w="80" w:type="dxa"/>
-              <w:left w:w="100" w:type="dxa"/>
-              <w:right w:w="100" w:type="dxa"/>
-            </w:tcMar>
-          </w:tcPr>
-          <w:p>
-            <w:r>
-              <w:rPr>
-                <w:sz w:val="16"/>
-              </w:rPr>
-              <w:t>300.000</w:t>
-            </w:r>
-          </w:p>
-        </w:tc>
-        <w:tc>
-          <w:tcPr>
-            <w:tcW w:type="dxa" w:w="2160"/>
-            <w:tcMar>
-              <w:top w:w="80" w:type="dxa"/>
-              <w:bottom w:w="80" w:type="dxa"/>
-              <w:left w:w="100" w:type="dxa"/>
-              <w:right w:w="100" w:type="dxa"/>
-            </w:tcMar>
-          </w:tcPr>
-          <w:p>
-            <w:r>
-              <w:rPr>
-                <w:sz w:val="16"/>
-              </w:rPr>
-              <w:t>500.000</w:t>
-            </w:r>
-          </w:p>
-        </w:tc>
-      </w:tr>
-      <w:tr>
-        <w:tc>
-          <w:tcPr>
-            <w:tcW w:type="dxa" w:w="3600"/>
-            <w:shd w:fill="FAFAFC"/>
-            <w:tcMar>
-              <w:top w:w="80" w:type="dxa"/>
-              <w:bottom w:w="80" w:type="dxa"/>
-              <w:left w:w="100" w:type="dxa"/>
-              <w:right w:w="100" w:type="dxa"/>
-            </w:tcMar>
-          </w:tcPr>
-          <w:p>
-            <w:r>
-              <w:rPr>
-                <w:sz w:val="16"/>
-              </w:rPr>
-              <w:t>4. Gói Bảo Trì Kỹ Thuật Tier 1</w:t>
-            </w:r>
-          </w:p>
-        </w:tc>
-        <w:tc>
-          <w:tcPr>
-            <w:tcW w:type="dxa" w:w="2160"/>
-            <w:shd w:fill="FAFAFC"/>
-            <w:tcMar>
-              <w:top w:w="80" w:type="dxa"/>
-              <w:bottom w:w="80" w:type="dxa"/>
-              <w:left w:w="100" w:type="dxa"/>
-              <w:right w:w="100" w:type="dxa"/>
-            </w:tcMar>
-          </w:tcPr>
-          <w:p>
-            <w:r>
-              <w:rPr>
-                <w:sz w:val="16"/>
-              </w:rPr>
-              <w:t>600.000</w:t>
-            </w:r>
-          </w:p>
-        </w:tc>
-        <w:tc>
-          <w:tcPr>
-            <w:tcW w:type="dxa" w:w="2160"/>
-            <w:shd w:fill="FAFAFC"/>
-            <w:tcMar>
-              <w:top w:w="80" w:type="dxa"/>
-              <w:bottom w:w="80" w:type="dxa"/>
-              <w:left w:w="100" w:type="dxa"/>
-              <w:right w:w="100" w:type="dxa"/>
-            </w:tcMar>
-          </w:tcPr>
-          <w:p>
-            <w:r>
-              <w:rPr>
-                <w:sz w:val="16"/>
-              </w:rPr>
-              <w:t>1.000.000</w:t>
-            </w:r>
-          </w:p>
-        </w:tc>
-        <w:tc>
-          <w:tcPr>
-            <w:tcW w:type="dxa" w:w="2160"/>
-            <w:shd w:fill="FAFAFC"/>
-            <w:tcMar>
-              <w:top w:w="80" w:type="dxa"/>
-              <w:bottom w:w="80" w:type="dxa"/>
-              <w:left w:w="100" w:type="dxa"/>
-              <w:right w:w="100" w:type="dxa"/>
-            </w:tcMar>
-          </w:tcPr>
-          <w:p>
-            <w:r>
-              <w:rPr>
-                <w:sz w:val="16"/>
-              </w:rPr>
-              <w:t>1.500.000</w:t>
-            </w:r>
-          </w:p>
-        </w:tc>
-      </w:tr>
-      <w:tr>
-        <w:tc>
-          <w:tcPr>
-            <w:tcW w:type="dxa" w:w="3600"/>
-            <w:shd w:fill="FEF3C7"/>
             <w:tcMar>
               <w:top w:w="80" w:type="dxa"/>
               <w:bottom w:w="80" w:type="dxa"/>
@@ -2742,14 +2367,14 @@
                 <w:b/>
                 <w:sz w:val="16"/>
               </w:rPr>
-              <w:t>📊 TỔNG CHI PHÍ VẬN HÀNH / THÁNG</w:t>
+              <w:t>STT</w:t>
             </w:r>
           </w:p>
         </w:tc>
         <w:tc>
           <w:tcPr>
-            <w:tcW w:type="dxa" w:w="2160"/>
-            <w:shd w:fill="FEF3C7"/>
+            <w:tcW w:type="dxa" w:w="2880"/>
+            <w:shd w:fill="F1F5F9"/>
             <w:tcMar>
               <w:top w:w="80" w:type="dxa"/>
               <w:bottom w:w="80" w:type="dxa"/>
@@ -2763,14 +2388,14 @@
                 <w:b/>
                 <w:sz w:val="16"/>
               </w:rPr>
-              <w:t>1.240.000 VNĐ</w:t>
+              <w:t>Hạng Mục Dịch Vụ</w:t>
             </w:r>
           </w:p>
         </w:tc>
         <w:tc>
           <w:tcPr>
-            <w:tcW w:type="dxa" w:w="2160"/>
-            <w:shd w:fill="FEF3C7"/>
+            <w:tcW w:type="dxa" w:w="2880"/>
+            <w:shd w:fill="F1F5F9"/>
             <w:tcMar>
               <w:top w:w="80" w:type="dxa"/>
               <w:bottom w:w="80" w:type="dxa"/>
@@ -2784,14 +2409,14 @@
                 <w:b/>
                 <w:sz w:val="16"/>
               </w:rPr>
-              <w:t>1.940.000 VNĐ</w:t>
+              <w:t>Nhà Cung Cấp &amp; Cấu Hình</w:t>
             </w:r>
           </w:p>
         </w:tc>
         <w:tc>
           <w:tcPr>
-            <w:tcW w:type="dxa" w:w="2160"/>
-            <w:shd w:fill="FEF3C7"/>
+            <w:tcW w:type="dxa" w:w="576"/>
+            <w:shd w:fill="F1F5F9"/>
             <w:tcMar>
               <w:top w:w="80" w:type="dxa"/>
               <w:bottom w:w="80" w:type="dxa"/>
@@ -2805,7 +2430,759 @@
                 <w:b/>
                 <w:sz w:val="16"/>
               </w:rPr>
-              <w:t>2.990.000 VNĐ</w:t>
+              <w:t>ĐVT</w:t>
+            </w:r>
+          </w:p>
+        </w:tc>
+        <w:tc>
+          <w:tcPr>
+            <w:tcW w:type="dxa" w:w="1584"/>
+            <w:shd w:fill="F1F5F9"/>
+            <w:tcMar>
+              <w:top w:w="80" w:type="dxa"/>
+              <w:bottom w:w="80" w:type="dxa"/>
+              <w:left w:w="100" w:type="dxa"/>
+              <w:right w:w="100" w:type="dxa"/>
+            </w:tcMar>
+          </w:tcPr>
+          <w:p>
+            <w:r>
+              <w:rPr>
+                <w:b/>
+                <w:sz w:val="16"/>
+              </w:rPr>
+              <w:t>Chi Phí/Tháng (VNĐ)</w:t>
+            </w:r>
+          </w:p>
+        </w:tc>
+        <w:tc>
+          <w:tcPr>
+            <w:tcW w:type="dxa" w:w="1584"/>
+            <w:shd w:fill="F1F5F9"/>
+            <w:tcMar>
+              <w:top w:w="80" w:type="dxa"/>
+              <w:bottom w:w="80" w:type="dxa"/>
+              <w:left w:w="100" w:type="dxa"/>
+              <w:right w:w="100" w:type="dxa"/>
+            </w:tcMar>
+          </w:tcPr>
+          <w:p>
+            <w:r>
+              <w:rPr>
+                <w:b/>
+                <w:sz w:val="16"/>
+              </w:rPr>
+              <w:t>Ghi Chú &amp; Đặc Điểm</w:t>
+            </w:r>
+          </w:p>
+        </w:tc>
+      </w:tr>
+      <w:tr>
+        <w:tc>
+          <w:tcPr>
+            <w:tcW w:type="dxa" w:w="576"/>
+            <w:tcMar>
+              <w:top w:w="80" w:type="dxa"/>
+              <w:bottom w:w="80" w:type="dxa"/>
+              <w:left w:w="100" w:type="dxa"/>
+              <w:right w:w="100" w:type="dxa"/>
+            </w:tcMar>
+          </w:tcPr>
+          <w:p>
+            <w:pPr>
+              <w:jc w:val="center"/>
+            </w:pPr>
+            <w:r>
+              <w:rPr>
+                <w:sz w:val="15"/>
+              </w:rPr>
+              <w:t>1</w:t>
+            </w:r>
+          </w:p>
+        </w:tc>
+        <w:tc>
+          <w:tcPr>
+            <w:tcW w:type="dxa" w:w="2880"/>
+            <w:tcMar>
+              <w:top w:w="80" w:type="dxa"/>
+              <w:bottom w:w="80" w:type="dxa"/>
+              <w:left w:w="100" w:type="dxa"/>
+              <w:right w:w="100" w:type="dxa"/>
+            </w:tcMar>
+          </w:tcPr>
+          <w:p>
+            <w:r>
+              <w:rPr>
+                <w:sz w:val="15"/>
+              </w:rPr>
+              <w:t>Backend &amp; Frontend App Hosting</w:t>
+            </w:r>
+          </w:p>
+        </w:tc>
+        <w:tc>
+          <w:tcPr>
+            <w:tcW w:type="dxa" w:w="2880"/>
+            <w:tcMar>
+              <w:top w:w="80" w:type="dxa"/>
+              <w:bottom w:w="80" w:type="dxa"/>
+              <w:left w:w="100" w:type="dxa"/>
+              <w:right w:w="100" w:type="dxa"/>
+            </w:tcMar>
+          </w:tcPr>
+          <w:p>
+            <w:r>
+              <w:rPr>
+                <w:sz w:val="15"/>
+              </w:rPr>
+              <w:t>Render.com / Railway Team Tier</w:t>
+            </w:r>
+          </w:p>
+        </w:tc>
+        <w:tc>
+          <w:tcPr>
+            <w:tcW w:type="dxa" w:w="576"/>
+            <w:tcMar>
+              <w:top w:w="80" w:type="dxa"/>
+              <w:bottom w:w="80" w:type="dxa"/>
+              <w:left w:w="100" w:type="dxa"/>
+              <w:right w:w="100" w:type="dxa"/>
+            </w:tcMar>
+          </w:tcPr>
+          <w:p>
+            <w:pPr>
+              <w:jc w:val="center"/>
+            </w:pPr>
+            <w:r>
+              <w:rPr>
+                <w:sz w:val="15"/>
+              </w:rPr>
+              <w:t>Tháng</w:t>
+            </w:r>
+          </w:p>
+        </w:tc>
+        <w:tc>
+          <w:tcPr>
+            <w:tcW w:type="dxa" w:w="1584"/>
+            <w:tcMar>
+              <w:top w:w="80" w:type="dxa"/>
+              <w:bottom w:w="80" w:type="dxa"/>
+              <w:left w:w="100" w:type="dxa"/>
+              <w:right w:w="100" w:type="dxa"/>
+            </w:tcMar>
+          </w:tcPr>
+          <w:p>
+            <w:pPr>
+              <w:jc w:val="right"/>
+            </w:pPr>
+            <w:r>
+              <w:rPr>
+                <w:b/>
+                <w:sz w:val="15"/>
+              </w:rPr>
+              <w:t>750.000</w:t>
+            </w:r>
+          </w:p>
+        </w:tc>
+        <w:tc>
+          <w:tcPr>
+            <w:tcW w:type="dxa" w:w="1584"/>
+            <w:tcMar>
+              <w:top w:w="80" w:type="dxa"/>
+              <w:bottom w:w="80" w:type="dxa"/>
+              <w:left w:w="100" w:type="dxa"/>
+              <w:right w:w="100" w:type="dxa"/>
+            </w:tcMar>
+          </w:tcPr>
+          <w:p>
+            <w:r>
+              <w:rPr>
+                <w:sz w:val="15"/>
+              </w:rPr>
+              <w:t>Tự động cân bằng tải và triển khai không gián đoạn</w:t>
+            </w:r>
+          </w:p>
+        </w:tc>
+      </w:tr>
+      <w:tr>
+        <w:tc>
+          <w:tcPr>
+            <w:tcW w:type="dxa" w:w="576"/>
+            <w:shd w:fill="FAFAFC"/>
+            <w:tcMar>
+              <w:top w:w="80" w:type="dxa"/>
+              <w:bottom w:w="80" w:type="dxa"/>
+              <w:left w:w="100" w:type="dxa"/>
+              <w:right w:w="100" w:type="dxa"/>
+            </w:tcMar>
+          </w:tcPr>
+          <w:p>
+            <w:pPr>
+              <w:jc w:val="center"/>
+            </w:pPr>
+            <w:r>
+              <w:rPr>
+                <w:sz w:val="15"/>
+              </w:rPr>
+              <w:t>2</w:t>
+            </w:r>
+          </w:p>
+        </w:tc>
+        <w:tc>
+          <w:tcPr>
+            <w:tcW w:type="dxa" w:w="2880"/>
+            <w:shd w:fill="FAFAFC"/>
+            <w:tcMar>
+              <w:top w:w="80" w:type="dxa"/>
+              <w:bottom w:w="80" w:type="dxa"/>
+              <w:left w:w="100" w:type="dxa"/>
+              <w:right w:w="100" w:type="dxa"/>
+            </w:tcMar>
+          </w:tcPr>
+          <w:p>
+            <w:r>
+              <w:rPr>
+                <w:sz w:val="15"/>
+              </w:rPr>
+              <w:t>Managed PostgreSQL Database</w:t>
+            </w:r>
+          </w:p>
+        </w:tc>
+        <w:tc>
+          <w:tcPr>
+            <w:tcW w:type="dxa" w:w="2880"/>
+            <w:shd w:fill="FAFAFC"/>
+            <w:tcMar>
+              <w:top w:w="80" w:type="dxa"/>
+              <w:bottom w:w="80" w:type="dxa"/>
+              <w:left w:w="100" w:type="dxa"/>
+              <w:right w:w="100" w:type="dxa"/>
+            </w:tcMar>
+          </w:tcPr>
+          <w:p>
+            <w:r>
+              <w:rPr>
+                <w:sz w:val="15"/>
+              </w:rPr>
+              <w:t>Supabase Pro Tier / Neon DB</w:t>
+            </w:r>
+          </w:p>
+        </w:tc>
+        <w:tc>
+          <w:tcPr>
+            <w:tcW w:type="dxa" w:w="576"/>
+            <w:shd w:fill="FAFAFC"/>
+            <w:tcMar>
+              <w:top w:w="80" w:type="dxa"/>
+              <w:bottom w:w="80" w:type="dxa"/>
+              <w:left w:w="100" w:type="dxa"/>
+              <w:right w:w="100" w:type="dxa"/>
+            </w:tcMar>
+          </w:tcPr>
+          <w:p>
+            <w:pPr>
+              <w:jc w:val="center"/>
+            </w:pPr>
+            <w:r>
+              <w:rPr>
+                <w:sz w:val="15"/>
+              </w:rPr>
+              <w:t>Tháng</w:t>
+            </w:r>
+          </w:p>
+        </w:tc>
+        <w:tc>
+          <w:tcPr>
+            <w:tcW w:type="dxa" w:w="1584"/>
+            <w:shd w:fill="FAFAFC"/>
+            <w:tcMar>
+              <w:top w:w="80" w:type="dxa"/>
+              <w:bottom w:w="80" w:type="dxa"/>
+              <w:left w:w="100" w:type="dxa"/>
+              <w:right w:w="100" w:type="dxa"/>
+            </w:tcMar>
+          </w:tcPr>
+          <w:p>
+            <w:pPr>
+              <w:jc w:val="right"/>
+            </w:pPr>
+            <w:r>
+              <w:rPr>
+                <w:b/>
+                <w:sz w:val="15"/>
+              </w:rPr>
+              <w:t>600.000</w:t>
+            </w:r>
+          </w:p>
+        </w:tc>
+        <w:tc>
+          <w:tcPr>
+            <w:tcW w:type="dxa" w:w="1584"/>
+            <w:shd w:fill="FAFAFC"/>
+            <w:tcMar>
+              <w:top w:w="80" w:type="dxa"/>
+              <w:bottom w:w="80" w:type="dxa"/>
+              <w:left w:w="100" w:type="dxa"/>
+              <w:right w:w="100" w:type="dxa"/>
+            </w:tcMar>
+          </w:tcPr>
+          <w:p>
+            <w:r>
+              <w:rPr>
+                <w:sz w:val="15"/>
+              </w:rPr>
+              <w:t>Tự động sao lưu Point-in-Time, mở rộng dung lượng linh hoạt</w:t>
+            </w:r>
+          </w:p>
+        </w:tc>
+      </w:tr>
+      <w:tr>
+        <w:tc>
+          <w:tcPr>
+            <w:tcW w:type="dxa" w:w="576"/>
+            <w:tcMar>
+              <w:top w:w="80" w:type="dxa"/>
+              <w:bottom w:w="80" w:type="dxa"/>
+              <w:left w:w="100" w:type="dxa"/>
+              <w:right w:w="100" w:type="dxa"/>
+            </w:tcMar>
+          </w:tcPr>
+          <w:p>
+            <w:pPr>
+              <w:jc w:val="center"/>
+            </w:pPr>
+            <w:r>
+              <w:rPr>
+                <w:sz w:val="15"/>
+              </w:rPr>
+              <w:t>3</w:t>
+            </w:r>
+          </w:p>
+        </w:tc>
+        <w:tc>
+          <w:tcPr>
+            <w:tcW w:type="dxa" w:w="2880"/>
+            <w:tcMar>
+              <w:top w:w="80" w:type="dxa"/>
+              <w:bottom w:w="80" w:type="dxa"/>
+              <w:left w:w="100" w:type="dxa"/>
+              <w:right w:w="100" w:type="dxa"/>
+            </w:tcMar>
+          </w:tcPr>
+          <w:p>
+            <w:r>
+              <w:rPr>
+                <w:sz w:val="15"/>
+              </w:rPr>
+              <w:t>Tên Miền &amp; Dịch Vụ Mạng</w:t>
+            </w:r>
+          </w:p>
+        </w:tc>
+        <w:tc>
+          <w:tcPr>
+            <w:tcW w:type="dxa" w:w="2880"/>
+            <w:tcMar>
+              <w:top w:w="80" w:type="dxa"/>
+              <w:bottom w:w="80" w:type="dxa"/>
+              <w:left w:w="100" w:type="dxa"/>
+              <w:right w:w="100" w:type="dxa"/>
+            </w:tcMar>
+          </w:tcPr>
+          <w:p>
+            <w:r>
+              <w:rPr>
+                <w:sz w:val="15"/>
+              </w:rPr>
+              <w:t>Domain .vn + Cloudflare Pro CDN</w:t>
+            </w:r>
+          </w:p>
+        </w:tc>
+        <w:tc>
+          <w:tcPr>
+            <w:tcW w:type="dxa" w:w="576"/>
+            <w:tcMar>
+              <w:top w:w="80" w:type="dxa"/>
+              <w:bottom w:w="80" w:type="dxa"/>
+              <w:left w:w="100" w:type="dxa"/>
+              <w:right w:w="100" w:type="dxa"/>
+            </w:tcMar>
+          </w:tcPr>
+          <w:p>
+            <w:pPr>
+              <w:jc w:val="center"/>
+            </w:pPr>
+            <w:r>
+              <w:rPr>
+                <w:sz w:val="15"/>
+              </w:rPr>
+              <w:t>Tháng</w:t>
+            </w:r>
+          </w:p>
+        </w:tc>
+        <w:tc>
+          <w:tcPr>
+            <w:tcW w:type="dxa" w:w="1584"/>
+            <w:tcMar>
+              <w:top w:w="80" w:type="dxa"/>
+              <w:bottom w:w="80" w:type="dxa"/>
+              <w:left w:w="100" w:type="dxa"/>
+              <w:right w:w="100" w:type="dxa"/>
+            </w:tcMar>
+          </w:tcPr>
+          <w:p>
+            <w:pPr>
+              <w:jc w:val="right"/>
+            </w:pPr>
+            <w:r>
+              <w:rPr>
+                <w:b/>
+                <w:sz w:val="15"/>
+              </w:rPr>
+              <w:t>50.000</w:t>
+            </w:r>
+          </w:p>
+        </w:tc>
+        <w:tc>
+          <w:tcPr>
+            <w:tcW w:type="dxa" w:w="1584"/>
+            <w:tcMar>
+              <w:top w:w="80" w:type="dxa"/>
+              <w:bottom w:w="80" w:type="dxa"/>
+              <w:left w:w="100" w:type="dxa"/>
+              <w:right w:w="100" w:type="dxa"/>
+            </w:tcMar>
+          </w:tcPr>
+          <w:p>
+            <w:r>
+              <w:rPr>
+                <w:sz w:val="15"/>
+              </w:rPr>
+              <w:t>Tên miền thương hiệu + tăng tốc tải hình ảnh toàn cầu</w:t>
+            </w:r>
+          </w:p>
+        </w:tc>
+      </w:tr>
+      <w:tr>
+        <w:tc>
+          <w:tcPr>
+            <w:tcW w:type="dxa" w:w="576"/>
+            <w:shd w:fill="FAFAFC"/>
+            <w:tcMar>
+              <w:top w:w="80" w:type="dxa"/>
+              <w:bottom w:w="80" w:type="dxa"/>
+              <w:left w:w="100" w:type="dxa"/>
+              <w:right w:w="100" w:type="dxa"/>
+            </w:tcMar>
+          </w:tcPr>
+          <w:p>
+            <w:pPr>
+              <w:jc w:val="center"/>
+            </w:pPr>
+            <w:r>
+              <w:rPr>
+                <w:sz w:val="15"/>
+              </w:rPr>
+              <w:t>4</w:t>
+            </w:r>
+          </w:p>
+        </w:tc>
+        <w:tc>
+          <w:tcPr>
+            <w:tcW w:type="dxa" w:w="2880"/>
+            <w:shd w:fill="FAFAFC"/>
+            <w:tcMar>
+              <w:top w:w="80" w:type="dxa"/>
+              <w:bottom w:w="80" w:type="dxa"/>
+              <w:left w:w="100" w:type="dxa"/>
+              <w:right w:w="100" w:type="dxa"/>
+            </w:tcMar>
+          </w:tcPr>
+          <w:p>
+            <w:r>
+              <w:rPr>
+                <w:sz w:val="15"/>
+              </w:rPr>
+              <w:t>Dịch Vụ AI Gemini Flash</w:t>
+            </w:r>
+          </w:p>
+        </w:tc>
+        <w:tc>
+          <w:tcPr>
+            <w:tcW w:type="dxa" w:w="2880"/>
+            <w:shd w:fill="FAFAFC"/>
+            <w:tcMar>
+              <w:top w:w="80" w:type="dxa"/>
+              <w:bottom w:w="80" w:type="dxa"/>
+              <w:left w:w="100" w:type="dxa"/>
+              <w:right w:w="100" w:type="dxa"/>
+            </w:tcMar>
+          </w:tcPr>
+          <w:p>
+            <w:r>
+              <w:rPr>
+                <w:sz w:val="15"/>
+              </w:rPr>
+              <w:t>Google Cloud Gemini API Pay-as-you-go</w:t>
+            </w:r>
+          </w:p>
+        </w:tc>
+        <w:tc>
+          <w:tcPr>
+            <w:tcW w:type="dxa" w:w="576"/>
+            <w:shd w:fill="FAFAFC"/>
+            <w:tcMar>
+              <w:top w:w="80" w:type="dxa"/>
+              <w:bottom w:w="80" w:type="dxa"/>
+              <w:left w:w="100" w:type="dxa"/>
+              <w:right w:w="100" w:type="dxa"/>
+            </w:tcMar>
+          </w:tcPr>
+          <w:p>
+            <w:pPr>
+              <w:jc w:val="center"/>
+            </w:pPr>
+            <w:r>
+              <w:rPr>
+                <w:sz w:val="15"/>
+              </w:rPr>
+              <w:t>Tháng</w:t>
+            </w:r>
+          </w:p>
+        </w:tc>
+        <w:tc>
+          <w:tcPr>
+            <w:tcW w:type="dxa" w:w="1584"/>
+            <w:shd w:fill="FAFAFC"/>
+            <w:tcMar>
+              <w:top w:w="80" w:type="dxa"/>
+              <w:bottom w:w="80" w:type="dxa"/>
+              <w:left w:w="100" w:type="dxa"/>
+              <w:right w:w="100" w:type="dxa"/>
+            </w:tcMar>
+          </w:tcPr>
+          <w:p>
+            <w:pPr>
+              <w:jc w:val="right"/>
+            </w:pPr>
+            <w:r>
+              <w:rPr>
+                <w:b/>
+                <w:sz w:val="15"/>
+              </w:rPr>
+              <w:t>150.000</w:t>
+            </w:r>
+          </w:p>
+        </w:tc>
+        <w:tc>
+          <w:tcPr>
+            <w:tcW w:type="dxa" w:w="1584"/>
+            <w:shd w:fill="FAFAFC"/>
+            <w:tcMar>
+              <w:top w:w="80" w:type="dxa"/>
+              <w:bottom w:w="80" w:type="dxa"/>
+              <w:left w:w="100" w:type="dxa"/>
+              <w:right w:w="100" w:type="dxa"/>
+            </w:tcMar>
+          </w:tcPr>
+          <w:p>
+            <w:r>
+              <w:rPr>
+                <w:sz w:val="15"/>
+              </w:rPr>
+              <w:t>Tư vấn món cá nhân hóa theo lưu lượng thực tế</w:t>
+            </w:r>
+          </w:p>
+        </w:tc>
+      </w:tr>
+      <w:tr>
+        <w:tc>
+          <w:tcPr>
+            <w:tcW w:type="dxa" w:w="576"/>
+            <w:tcMar>
+              <w:top w:w="80" w:type="dxa"/>
+              <w:bottom w:w="80" w:type="dxa"/>
+              <w:left w:w="100" w:type="dxa"/>
+              <w:right w:w="100" w:type="dxa"/>
+            </w:tcMar>
+          </w:tcPr>
+          <w:p>
+            <w:pPr>
+              <w:jc w:val="center"/>
+            </w:pPr>
+            <w:r>
+              <w:rPr>
+                <w:sz w:val="15"/>
+              </w:rPr>
+              <w:t>5</w:t>
+            </w:r>
+          </w:p>
+        </w:tc>
+        <w:tc>
+          <w:tcPr>
+            <w:tcW w:type="dxa" w:w="2880"/>
+            <w:tcMar>
+              <w:top w:w="80" w:type="dxa"/>
+              <w:bottom w:w="80" w:type="dxa"/>
+              <w:left w:w="100" w:type="dxa"/>
+              <w:right w:w="100" w:type="dxa"/>
+            </w:tcMar>
+          </w:tcPr>
+          <w:p>
+            <w:r>
+              <w:rPr>
+                <w:sz w:val="15"/>
+              </w:rPr>
+              <w:t>Vật Tư Giấy In Nhiệt K80</w:t>
+            </w:r>
+          </w:p>
+        </w:tc>
+        <w:tc>
+          <w:tcPr>
+            <w:tcW w:type="dxa" w:w="2880"/>
+            <w:tcMar>
+              <w:top w:w="80" w:type="dxa"/>
+              <w:bottom w:w="80" w:type="dxa"/>
+              <w:left w:w="100" w:type="dxa"/>
+              <w:right w:w="100" w:type="dxa"/>
+            </w:tcMar>
+          </w:tcPr>
+          <w:p>
+            <w:r>
+              <w:rPr>
+                <w:sz w:val="15"/>
+              </w:rPr>
+              <w:t>50 cuộn/tháng cho chuỗi 3 quán</w:t>
+            </w:r>
+          </w:p>
+        </w:tc>
+        <w:tc>
+          <w:tcPr>
+            <w:tcW w:type="dxa" w:w="576"/>
+            <w:tcMar>
+              <w:top w:w="80" w:type="dxa"/>
+              <w:bottom w:w="80" w:type="dxa"/>
+              <w:left w:w="100" w:type="dxa"/>
+              <w:right w:w="100" w:type="dxa"/>
+            </w:tcMar>
+          </w:tcPr>
+          <w:p>
+            <w:pPr>
+              <w:jc w:val="center"/>
+            </w:pPr>
+            <w:r>
+              <w:rPr>
+                <w:sz w:val="15"/>
+              </w:rPr>
+              <w:t>Tháng</w:t>
+            </w:r>
+          </w:p>
+        </w:tc>
+        <w:tc>
+          <w:tcPr>
+            <w:tcW w:type="dxa" w:w="1584"/>
+            <w:tcMar>
+              <w:top w:w="80" w:type="dxa"/>
+              <w:bottom w:w="80" w:type="dxa"/>
+              <w:left w:w="100" w:type="dxa"/>
+              <w:right w:w="100" w:type="dxa"/>
+            </w:tcMar>
+          </w:tcPr>
+          <w:p>
+            <w:pPr>
+              <w:jc w:val="right"/>
+            </w:pPr>
+            <w:r>
+              <w:rPr>
+                <w:b/>
+                <w:sz w:val="15"/>
+              </w:rPr>
+              <w:t>300.000</w:t>
+            </w:r>
+          </w:p>
+        </w:tc>
+        <w:tc>
+          <w:tcPr>
+            <w:tcW w:type="dxa" w:w="1584"/>
+            <w:tcMar>
+              <w:top w:w="80" w:type="dxa"/>
+              <w:bottom w:w="80" w:type="dxa"/>
+              <w:left w:w="100" w:type="dxa"/>
+              <w:right w:w="100" w:type="dxa"/>
+            </w:tcMar>
+          </w:tcPr>
+          <w:p>
+            <w:r>
+              <w:rPr>
+                <w:sz w:val="15"/>
+              </w:rPr>
+              <w:t>In hóa đơn thanh toán và phiếu dán ly pha chế</w:t>
+            </w:r>
+          </w:p>
+        </w:tc>
+      </w:tr>
+      <w:tr>
+        <w:tc>
+          <w:tcPr>
+            <w:tcW w:type="dxa" w:w="1673"/>
+            <w:shd w:fill="FEE2E2"/>
+          </w:tcPr>
+          <w:p/>
+        </w:tc>
+        <w:tc>
+          <w:tcPr>
+            <w:tcW w:type="dxa" w:w="1673"/>
+            <w:shd w:fill="FEE2E2"/>
+          </w:tcPr>
+          <w:p>
+            <w:r>
+              <w:rPr>
+                <w:b/>
+              </w:rPr>
+              <w:t>TỔNG OPEX KỊCH BẢN B (3 QUÁN)</w:t>
+            </w:r>
+          </w:p>
+        </w:tc>
+        <w:tc>
+          <w:tcPr>
+            <w:tcW w:type="dxa" w:w="1673"/>
+            <w:shd w:fill="FEE2E2"/>
+          </w:tcPr>
+          <w:p/>
+        </w:tc>
+        <w:tc>
+          <w:tcPr>
+            <w:tcW w:type="dxa" w:w="1673"/>
+            <w:shd w:fill="FEE2E2"/>
+          </w:tcPr>
+          <w:p/>
+        </w:tc>
+        <w:tc>
+          <w:tcPr>
+            <w:tcW w:type="dxa" w:w="1673"/>
+            <w:shd w:fill="FEE2E2"/>
+          </w:tcPr>
+          <w:p>
+            <w:pPr>
+              <w:jc w:val="right"/>
+            </w:pPr>
+            <w:r>
+              <w:rPr>
+                <w:b/>
+              </w:rPr>
+              <w:t>1.850.000 VNĐ / tháng</w:t>
+            </w:r>
+          </w:p>
+        </w:tc>
+        <w:tc>
+          <w:tcPr>
+            <w:tcW w:type="dxa" w:w="1673"/>
+            <w:shd w:fill="FEE2E2"/>
+          </w:tcPr>
+          <w:p>
+            <w:r>
+              <w:rPr>
+                <w:sz w:val="15"/>
+              </w:rPr>
+              <w:t>Bình quân ~616.000 VNĐ / quán / tháng</w:t>
             </w:r>
           </w:p>
         </w:tc>
@@ -2822,7 +3199,7 @@
           <w:color w:val="8B4513"/>
           <w:sz w:val="26"/>
         </w:rPr>
-        <w:t>PHẦN 3. DỊCH VỤ BẢO TRÌ &amp; HỖ TRỢ KỸ THUẬT (SLA MAINTENANCE)</w:t>
+        <w:t>PHẦN 3. DỊCH VỤ BẢO TRÌ, HỖ TRỢ KỸ THUẬT &amp; PHÁT TRIỂN TÍNH NĂNG</w:t>
       </w:r>
     </w:p>
     <w:tbl>
@@ -2860,7 +3237,7 @@
                 <w:color w:val="059669"/>
                 <w:sz w:val="19"/>
               </w:rPr>
-              <w:t>💡 Chính Sách Ưu Đãi Bảo Hành Miễn Phí</w:t>
+              <w:t>💡 Chính Sách Bảo Hành Miễn Phí Ban Đầu</w:t>
               <w:br/>
             </w:r>
             <w:r>
@@ -2868,588 +3245,109 @@
                 <w:color w:val="0F172A"/>
                 <w:sz w:val="18"/>
               </w:rPr>
-              <w:t>Toàn bộ hệ thống được BẢO HÀNH MIỄN PHÍ 03 THÁNG ĐẦU TIÊN kể từ ngày nghiệm thu bàn giao. Sau thời gian bảo hành, chủ quán có thể lựa chọn 1 trong 2 gói bảo trì định kỳ:</w:t>
+              <w:t>Toàn bộ hệ thống được BẢO HÀNH MIỄN PHÍ 03 THÁNG ĐẦU TIÊN kể từ ngày nghiệm thu (sửa toàn bộ lỗi phát sinh, giám sát hệ thống và hỗ trợ kỹ thuật qua Zalo/Hotline 24/7).</w:t>
             </w:r>
           </w:p>
         </w:tc>
       </w:tr>
     </w:tbl>
     <w:p/>
-    <w:tbl>
-      <w:tblPr>
-        <w:tblW w:type="auto" w:w="0"/>
-        <w:jc w:val="center"/>
-        <w:tblLook w:firstColumn="1" w:firstRow="1" w:lastColumn="0" w:lastRow="0" w:noHBand="0" w:noVBand="1" w:val="04A0"/>
-        <w:tblBorders>
-          <w:top w:val="single" w:sz="4" w:space="0" w:color="CBD5E1"/>
-          <w:bottom w:val="single" w:sz="4" w:space="0" w:color="CBD5E1"/>
-          <w:left w:val="single" w:sz="4" w:space="0" w:color="CBD5E1"/>
-          <w:right w:val="single" w:sz="4" w:space="0" w:color="CBD5E1"/>
-          <w:insideH w:val="single" w:sz="4" w:space="0" w:color="CBD5E1"/>
-          <w:insideV w:val="single" w:sz="4" w:space="0" w:color="CBD5E1"/>
-        </w:tblBorders>
-      </w:tblPr>
-      <w:tblGrid>
-        <w:gridCol w:w="3346"/>
-        <w:gridCol w:w="3346"/>
-        <w:gridCol w:w="3346"/>
-      </w:tblGrid>
-      <w:tr>
-        <w:tc>
-          <w:tcPr>
-            <w:tcW w:type="dxa" w:w="3456"/>
-            <w:shd w:fill="F1F5F9"/>
-            <w:tcMar>
-              <w:top w:w="80" w:type="dxa"/>
-              <w:bottom w:w="80" w:type="dxa"/>
-              <w:left w:w="100" w:type="dxa"/>
-              <w:right w:w="100" w:type="dxa"/>
-            </w:tcMar>
-          </w:tcPr>
-          <w:p>
-            <w:r>
-              <w:rPr>
-                <w:b/>
-                <w:sz w:val="17"/>
-              </w:rPr>
-              <w:t>Tiêu Chí So Sánh</w:t>
-            </w:r>
-          </w:p>
-        </w:tc>
-        <w:tc>
-          <w:tcPr>
-            <w:tcW w:type="dxa" w:w="3312"/>
-            <w:shd w:fill="F1F5F9"/>
-            <w:tcMar>
-              <w:top w:w="80" w:type="dxa"/>
-              <w:bottom w:w="80" w:type="dxa"/>
-              <w:left w:w="100" w:type="dxa"/>
-              <w:right w:w="100" w:type="dxa"/>
-            </w:tcMar>
-          </w:tcPr>
-          <w:p>
-            <w:r>
-              <w:rPr>
-                <w:b/>
-                <w:sz w:val="17"/>
-              </w:rPr>
-              <w:t>GÓI TIER 1: TIÊU CHUẨN (BASIC) — Khuyên Dùng</w:t>
-            </w:r>
-          </w:p>
-        </w:tc>
-        <w:tc>
-          <w:tcPr>
-            <w:tcW w:type="dxa" w:w="3312"/>
-            <w:shd w:fill="F1F5F9"/>
-            <w:tcMar>
-              <w:top w:w="80" w:type="dxa"/>
-              <w:bottom w:w="80" w:type="dxa"/>
-              <w:left w:w="100" w:type="dxa"/>
-              <w:right w:w="100" w:type="dxa"/>
-            </w:tcMar>
-          </w:tcPr>
-          <w:p>
-            <w:r>
-              <w:rPr>
-                <w:b/>
-                <w:sz w:val="17"/>
-              </w:rPr>
-              <w:t>GÓI TIER 2: NÂNG CAO (PRIORITY)</w:t>
-            </w:r>
-          </w:p>
-        </w:tc>
-      </w:tr>
-      <w:tr>
-        <w:tc>
-          <w:tcPr>
-            <w:tcW w:type="dxa" w:w="3456"/>
-            <w:tcMar>
-              <w:top w:w="80" w:type="dxa"/>
-              <w:bottom w:w="80" w:type="dxa"/>
-              <w:left w:w="100" w:type="dxa"/>
-              <w:right w:w="100" w:type="dxa"/>
-            </w:tcMar>
-          </w:tcPr>
-          <w:p>
-            <w:r>
-              <w:rPr>
-                <w:b/>
-                <w:sz w:val="16"/>
-              </w:rPr>
-              <w:t>💵 Phí Dịch Vụ Hàng Tháng</w:t>
-            </w:r>
-          </w:p>
-        </w:tc>
-        <w:tc>
-          <w:tcPr>
-            <w:tcW w:type="dxa" w:w="3312"/>
-            <w:tcMar>
-              <w:top w:w="80" w:type="dxa"/>
-              <w:bottom w:w="80" w:type="dxa"/>
-              <w:left w:w="100" w:type="dxa"/>
-              <w:right w:w="100" w:type="dxa"/>
-            </w:tcMar>
-          </w:tcPr>
-          <w:p>
-            <w:r>
-              <w:rPr>
-                <w:b/>
-                <w:sz w:val="16"/>
-              </w:rPr>
-              <w:t>1.000.000 VNĐ / tháng</w:t>
-            </w:r>
-          </w:p>
-        </w:tc>
-        <w:tc>
-          <w:tcPr>
-            <w:tcW w:type="dxa" w:w="3312"/>
-            <w:tcMar>
-              <w:top w:w="80" w:type="dxa"/>
-              <w:bottom w:w="80" w:type="dxa"/>
-              <w:left w:w="100" w:type="dxa"/>
-              <w:right w:w="100" w:type="dxa"/>
-            </w:tcMar>
-          </w:tcPr>
-          <w:p>
-            <w:r>
-              <w:rPr>
-                <w:b/>
-                <w:sz w:val="16"/>
-              </w:rPr>
-              <w:t>2.500.000 VNĐ / tháng</w:t>
-            </w:r>
-          </w:p>
-        </w:tc>
-      </w:tr>
-      <w:tr>
-        <w:tc>
-          <w:tcPr>
-            <w:tcW w:type="dxa" w:w="3456"/>
-            <w:shd w:fill="FAFAFC"/>
-            <w:tcMar>
-              <w:top w:w="80" w:type="dxa"/>
-              <w:bottom w:w="80" w:type="dxa"/>
-              <w:left w:w="100" w:type="dxa"/>
-              <w:right w:w="100" w:type="dxa"/>
-            </w:tcMar>
-          </w:tcPr>
-          <w:p>
-            <w:r>
-              <w:rPr>
-                <w:b/>
-                <w:sz w:val="16"/>
-              </w:rPr>
-              <w:t>🏢 Phạm Vi Áp Dụng</w:t>
-            </w:r>
-          </w:p>
-        </w:tc>
-        <w:tc>
-          <w:tcPr>
-            <w:tcW w:type="dxa" w:w="3312"/>
-            <w:shd w:fill="FAFAFC"/>
-            <w:tcMar>
-              <w:top w:w="80" w:type="dxa"/>
-              <w:bottom w:w="80" w:type="dxa"/>
-              <w:left w:w="100" w:type="dxa"/>
-              <w:right w:w="100" w:type="dxa"/>
-            </w:tcMar>
-          </w:tcPr>
-          <w:p>
-            <w:r>
-              <w:rPr>
-                <w:b/>
-                <w:sz w:val="16"/>
-              </w:rPr>
-              <w:t>Trọn gói cho cả 3 Chi nhánh (~333k/quán)</w:t>
-            </w:r>
-          </w:p>
-        </w:tc>
-        <w:tc>
-          <w:tcPr>
-            <w:tcW w:type="dxa" w:w="3312"/>
-            <w:shd w:fill="FAFAFC"/>
-            <w:tcMar>
-              <w:top w:w="80" w:type="dxa"/>
-              <w:bottom w:w="80" w:type="dxa"/>
-              <w:left w:w="100" w:type="dxa"/>
-              <w:right w:w="100" w:type="dxa"/>
-            </w:tcMar>
-          </w:tcPr>
-          <w:p>
-            <w:r>
-              <w:rPr>
-                <w:b/>
-                <w:sz w:val="16"/>
-              </w:rPr>
-              <w:t>Trọn gói cho cả 3 Chi nhánh (~833k/quán)</w:t>
-            </w:r>
-          </w:p>
-        </w:tc>
-      </w:tr>
-      <w:tr>
-        <w:tc>
-          <w:tcPr>
-            <w:tcW w:type="dxa" w:w="3456"/>
-            <w:tcMar>
-              <w:top w:w="80" w:type="dxa"/>
-              <w:bottom w:w="80" w:type="dxa"/>
-              <w:left w:w="100" w:type="dxa"/>
-              <w:right w:w="100" w:type="dxa"/>
-            </w:tcMar>
-          </w:tcPr>
-          <w:p>
-            <w:r>
-              <w:rPr>
-                <w:sz w:val="16"/>
-              </w:rPr>
-              <w:t>🛡️ Giám Sát Hệ Thống &amp; Uptime</w:t>
-            </w:r>
-          </w:p>
-        </w:tc>
-        <w:tc>
-          <w:tcPr>
-            <w:tcW w:type="dxa" w:w="3312"/>
-            <w:tcMar>
-              <w:top w:w="80" w:type="dxa"/>
-              <w:bottom w:w="80" w:type="dxa"/>
-              <w:left w:w="100" w:type="dxa"/>
-              <w:right w:w="100" w:type="dxa"/>
-            </w:tcMar>
-          </w:tcPr>
-          <w:p>
-            <w:r>
-              <w:rPr>
-                <w:sz w:val="16"/>
-              </w:rPr>
-              <w:t>Giám sát tự động 24/7 (Cam kết Uptime 99.9%)</w:t>
-            </w:r>
-          </w:p>
-        </w:tc>
-        <w:tc>
-          <w:tcPr>
-            <w:tcW w:type="dxa" w:w="3312"/>
-            <w:tcMar>
-              <w:top w:w="80" w:type="dxa"/>
-              <w:bottom w:w="80" w:type="dxa"/>
-              <w:left w:w="100" w:type="dxa"/>
-              <w:right w:w="100" w:type="dxa"/>
-            </w:tcMar>
-          </w:tcPr>
-          <w:p>
-            <w:r>
-              <w:rPr>
-                <w:sz w:val="16"/>
-              </w:rPr>
-              <w:t>Giám sát chủ động 24/7 + Cảnh báo APM</w:t>
-            </w:r>
-          </w:p>
-        </w:tc>
-      </w:tr>
-      <w:tr>
-        <w:tc>
-          <w:tcPr>
-            <w:tcW w:type="dxa" w:w="3456"/>
-            <w:shd w:fill="FAFAFC"/>
-            <w:tcMar>
-              <w:top w:w="80" w:type="dxa"/>
-              <w:bottom w:w="80" w:type="dxa"/>
-              <w:left w:w="100" w:type="dxa"/>
-              <w:right w:w="100" w:type="dxa"/>
-            </w:tcMar>
-          </w:tcPr>
-          <w:p>
-            <w:r>
-              <w:rPr>
-                <w:sz w:val="16"/>
-              </w:rPr>
-              <w:t>💾 Sao Lưu Dữ Liệu (Backup DB)</w:t>
-            </w:r>
-          </w:p>
-        </w:tc>
-        <w:tc>
-          <w:tcPr>
-            <w:tcW w:type="dxa" w:w="3312"/>
-            <w:shd w:fill="FAFAFC"/>
-            <w:tcMar>
-              <w:top w:w="80" w:type="dxa"/>
-              <w:bottom w:w="80" w:type="dxa"/>
-              <w:left w:w="100" w:type="dxa"/>
-              <w:right w:w="100" w:type="dxa"/>
-            </w:tcMar>
-          </w:tcPr>
-          <w:p>
-            <w:r>
-              <w:rPr>
-                <w:sz w:val="16"/>
-              </w:rPr>
-              <w:t>Tự động sao lưu 01 lần / ngày lên Cloud</w:t>
-            </w:r>
-          </w:p>
-        </w:tc>
-        <w:tc>
-          <w:tcPr>
-            <w:tcW w:type="dxa" w:w="3312"/>
-            <w:shd w:fill="FAFAFC"/>
-            <w:tcMar>
-              <w:top w:w="80" w:type="dxa"/>
-              <w:bottom w:w="80" w:type="dxa"/>
-              <w:left w:w="100" w:type="dxa"/>
-              <w:right w:w="100" w:type="dxa"/>
-            </w:tcMar>
-          </w:tcPr>
-          <w:p>
-            <w:r>
-              <w:rPr>
-                <w:sz w:val="16"/>
-              </w:rPr>
-              <w:t>Sao lưu 02 lần / ngày + Lưu trữ Cold Storage S3</w:t>
-            </w:r>
-          </w:p>
-        </w:tc>
-      </w:tr>
-      <w:tr>
-        <w:tc>
-          <w:tcPr>
-            <w:tcW w:type="dxa" w:w="3456"/>
-            <w:tcMar>
-              <w:top w:w="80" w:type="dxa"/>
-              <w:bottom w:w="80" w:type="dxa"/>
-              <w:left w:w="100" w:type="dxa"/>
-              <w:right w:w="100" w:type="dxa"/>
-            </w:tcMar>
-          </w:tcPr>
-          <w:p>
-            <w:r>
-              <w:rPr>
-                <w:sz w:val="16"/>
-              </w:rPr>
-              <w:t>⏱️ Thời Gian Phản Hồi Sự Cố</w:t>
-            </w:r>
-          </w:p>
-        </w:tc>
-        <w:tc>
-          <w:tcPr>
-            <w:tcW w:type="dxa" w:w="3312"/>
-            <w:tcMar>
-              <w:top w:w="80" w:type="dxa"/>
-              <w:bottom w:w="80" w:type="dxa"/>
-              <w:left w:w="100" w:type="dxa"/>
-              <w:right w:w="100" w:type="dxa"/>
-            </w:tcMar>
-          </w:tcPr>
-          <w:p>
-            <w:r>
-              <w:rPr>
-                <w:sz w:val="16"/>
-              </w:rPr>
-              <w:t>Trong vòng &lt; 02 giờ làm việc</w:t>
-            </w:r>
-          </w:p>
-        </w:tc>
-        <w:tc>
-          <w:tcPr>
-            <w:tcW w:type="dxa" w:w="3312"/>
-            <w:tcMar>
-              <w:top w:w="80" w:type="dxa"/>
-              <w:bottom w:w="80" w:type="dxa"/>
-              <w:left w:w="100" w:type="dxa"/>
-              <w:right w:w="100" w:type="dxa"/>
-            </w:tcMar>
-          </w:tcPr>
-          <w:p>
-            <w:r>
-              <w:rPr>
-                <w:sz w:val="16"/>
-              </w:rPr>
-              <w:t>Trong vòng &lt; 30 phút (Hỗ trợ khẩn cấp 24/7)</w:t>
-            </w:r>
-          </w:p>
-        </w:tc>
-      </w:tr>
-      <w:tr>
-        <w:tc>
-          <w:tcPr>
-            <w:tcW w:type="dxa" w:w="3456"/>
-            <w:shd w:fill="FAFAFC"/>
-            <w:tcMar>
-              <w:top w:w="80" w:type="dxa"/>
-              <w:bottom w:w="80" w:type="dxa"/>
-              <w:left w:w="100" w:type="dxa"/>
-              <w:right w:w="100" w:type="dxa"/>
-            </w:tcMar>
-          </w:tcPr>
-          <w:p>
-            <w:r>
-              <w:rPr>
-                <w:sz w:val="16"/>
-              </w:rPr>
-              <w:t>☕ Hỗ Trợ Cập Nhật Menu &amp; Giá</w:t>
-            </w:r>
-          </w:p>
-        </w:tc>
-        <w:tc>
-          <w:tcPr>
-            <w:tcW w:type="dxa" w:w="3312"/>
-            <w:shd w:fill="FAFAFC"/>
-            <w:tcMar>
-              <w:top w:w="80" w:type="dxa"/>
-              <w:bottom w:w="80" w:type="dxa"/>
-              <w:left w:w="100" w:type="dxa"/>
-              <w:right w:w="100" w:type="dxa"/>
-            </w:tcMar>
-          </w:tcPr>
-          <w:p>
-            <w:r>
-              <w:rPr>
-                <w:sz w:val="16"/>
-              </w:rPr>
-              <w:t>Hỗ trợ cập nhật 01 lần / tháng</w:t>
-            </w:r>
-          </w:p>
-        </w:tc>
-        <w:tc>
-          <w:tcPr>
-            <w:tcW w:type="dxa" w:w="3312"/>
-            <w:shd w:fill="FAFAFC"/>
-            <w:tcMar>
-              <w:top w:w="80" w:type="dxa"/>
-              <w:bottom w:w="80" w:type="dxa"/>
-              <w:left w:w="100" w:type="dxa"/>
-              <w:right w:w="100" w:type="dxa"/>
-            </w:tcMar>
-          </w:tcPr>
-          <w:p>
-            <w:r>
-              <w:rPr>
-                <w:sz w:val="16"/>
-              </w:rPr>
-              <w:t>Không giới hạn số lần hỗ trợ cập nhật</w:t>
-            </w:r>
-          </w:p>
-        </w:tc>
-      </w:tr>
-      <w:tr>
-        <w:tc>
-          <w:tcPr>
-            <w:tcW w:type="dxa" w:w="3456"/>
-            <w:tcMar>
-              <w:top w:w="80" w:type="dxa"/>
-              <w:bottom w:w="80" w:type="dxa"/>
-              <w:left w:w="100" w:type="dxa"/>
-              <w:right w:w="100" w:type="dxa"/>
-            </w:tcMar>
-          </w:tcPr>
-          <w:p>
-            <w:r>
-              <w:rPr>
-                <w:sz w:val="16"/>
-              </w:rPr>
-              <w:t>🧠 Tối Ưu Hóa Dữ Liệu AI</w:t>
-            </w:r>
-          </w:p>
-        </w:tc>
-        <w:tc>
-          <w:tcPr>
-            <w:tcW w:type="dxa" w:w="3312"/>
-            <w:tcMar>
-              <w:top w:w="80" w:type="dxa"/>
-              <w:bottom w:w="80" w:type="dxa"/>
-              <w:left w:w="100" w:type="dxa"/>
-              <w:right w:w="100" w:type="dxa"/>
-            </w:tcMar>
-          </w:tcPr>
-          <w:p>
-            <w:r>
-              <w:rPr>
-                <w:sz w:val="16"/>
-              </w:rPr>
-              <w:t>Tự động theo thuật toán</w:t>
-            </w:r>
-          </w:p>
-        </w:tc>
-        <w:tc>
-          <w:tcPr>
-            <w:tcW w:type="dxa" w:w="3312"/>
-            <w:tcMar>
-              <w:top w:w="80" w:type="dxa"/>
-              <w:bottom w:w="80" w:type="dxa"/>
-              <w:left w:w="100" w:type="dxa"/>
-              <w:right w:w="100" w:type="dxa"/>
-            </w:tcMar>
-          </w:tcPr>
-          <w:p>
-            <w:r>
-              <w:rPr>
-                <w:sz w:val="16"/>
-              </w:rPr>
-              <w:t>Tinh chỉnh định kỳ Prompt &amp; Quy tắc gợi ý AI</w:t>
-            </w:r>
-          </w:p>
-        </w:tc>
-      </w:tr>
-      <w:tr>
-        <w:tc>
-          <w:tcPr>
-            <w:tcW w:type="dxa" w:w="3456"/>
-            <w:shd w:fill="FAFAFC"/>
-            <w:tcMar>
-              <w:top w:w="80" w:type="dxa"/>
-              <w:bottom w:w="80" w:type="dxa"/>
-              <w:left w:w="100" w:type="dxa"/>
-              <w:right w:w="100" w:type="dxa"/>
-            </w:tcMar>
-          </w:tcPr>
-          <w:p>
-            <w:r>
-              <w:rPr>
-                <w:sz w:val="16"/>
-              </w:rPr>
-              <w:t>🧑‍🏫 Đào Tạo Nhân Sự Mới</w:t>
-            </w:r>
-          </w:p>
-        </w:tc>
-        <w:tc>
-          <w:tcPr>
-            <w:tcW w:type="dxa" w:w="3312"/>
-            <w:shd w:fill="FAFAFC"/>
-            <w:tcMar>
-              <w:top w:w="80" w:type="dxa"/>
-              <w:bottom w:w="80" w:type="dxa"/>
-              <w:left w:w="100" w:type="dxa"/>
-              <w:right w:w="100" w:type="dxa"/>
-            </w:tcMar>
-          </w:tcPr>
-          <w:p>
-            <w:r>
-              <w:rPr>
-                <w:sz w:val="16"/>
-              </w:rPr>
-              <w:t>Cung cấp bộ tài liệu &amp; video hướng dẫn</w:t>
-            </w:r>
-          </w:p>
-        </w:tc>
-        <w:tc>
-          <w:tcPr>
-            <w:tcW w:type="dxa" w:w="3312"/>
-            <w:shd w:fill="FAFAFC"/>
-            <w:tcMar>
-              <w:top w:w="80" w:type="dxa"/>
-              <w:bottom w:w="80" w:type="dxa"/>
-              <w:left w:w="100" w:type="dxa"/>
-              <w:right w:w="100" w:type="dxa"/>
-            </w:tcMar>
-          </w:tcPr>
-          <w:p>
-            <w:r>
-              <w:rPr>
-                <w:sz w:val="16"/>
-              </w:rPr>
-              <w:t>Đào tạo trực tiếp 01 buổi / quý cho quản lý mới</w:t>
-            </w:r>
-          </w:p>
-        </w:tc>
-      </w:tr>
-    </w:tbl>
+    <w:p>
+      <w:r>
+        <w:rPr>
+          <w:b/>
+        </w:rPr>
+        <w:t>Sau thời gian bảo hành, khách hàng có thể lựa chọn các hình thức hỗ trợ linh hoạt theo nhu cầu thực tế:</w:t>
+        <w:br/>
+      </w:r>
+    </w:p>
+    <w:p>
+      <w:pPr>
+        <w:ind w:left="288"/>
+      </w:pPr>
+      <w:r>
+        <w:rPr>
+          <w:b/>
+          <w:sz w:val="19"/>
+        </w:rPr>
+        <w:t>• 1. Hỗ Trợ Xử Lý Sự Cố &amp; Bảo Trì Theo Từng Lần (On-Demand Support)</w:t>
+        <w:br/>
+      </w:r>
+      <w:r>
+        <w:rPr>
+          <w:b/>
+          <w:color w:val="B45309"/>
+          <w:sz w:val="18"/>
+        </w:rPr>
+        <w:t xml:space="preserve">  👉 Chi phí: 300.000 – 500.000 VNĐ / lần (tùy mức độ phát sinh).</w:t>
+        <w:br/>
+      </w:r>
+      <w:r>
+        <w:rPr>
+          <w:sz w:val="17"/>
+        </w:rPr>
+        <w:t xml:space="preserve">  👉 Phạm vi: Kiểm tra và tối ưu máy chủ VPS, sửa lỗi phát sinh do môi trường vận hành, hỗ trợ phục hồi dữ liệu từ bản backup, cập nhật cấu hình cổng thanh toán hoặc mạng chi nhánh.</w:t>
+        <w:br/>
+      </w:r>
+    </w:p>
+    <w:p>
+      <w:pPr>
+        <w:ind w:left="288"/>
+      </w:pPr>
+      <w:r>
+        <w:rPr>
+          <w:b/>
+          <w:sz w:val="19"/>
+        </w:rPr>
+        <w:t>• 2. Gói Hỗ Trợ Bảo Trì Định Kỳ Hàng Tháng (Tùy chọn nếu cần)</w:t>
+        <w:br/>
+      </w:r>
+      <w:r>
+        <w:rPr>
+          <w:b/>
+          <w:color w:val="B45309"/>
+          <w:sz w:val="18"/>
+        </w:rPr>
+        <w:t xml:space="preserve">  👉 Chi phí: 1.000.000 VNĐ / tháng (trọn gói cho cả chuỗi 3 chi nhánh ~333.000 đ/quán).</w:t>
+        <w:br/>
+      </w:r>
+      <w:r>
+        <w:rPr>
+          <w:sz w:val="17"/>
+        </w:rPr>
+        <w:t xml:space="preserve">  👉 Phạm vi: Giám sát Uptime 24/7, tự động backup dữ liệu hàng ngày lên Cloud riêng, hỗ trợ kỹ thuật ưu tiên &lt; 30 phút, hỗ trợ đổi giá/menu định kỳ.</w:t>
+        <w:br/>
+      </w:r>
+    </w:p>
+    <w:p>
+      <w:pPr>
+        <w:ind w:left="288"/>
+      </w:pPr>
+      <w:r>
+        <w:rPr>
+          <w:b/>
+          <w:sz w:val="19"/>
+        </w:rPr>
+        <w:t>• 3. Yêu Cầu Nâng Cấp &amp; Phát Triển Tính Năng Mới (New Feature Requests)</w:t>
+        <w:br/>
+      </w:r>
+      <w:r>
+        <w:rPr>
+          <w:b/>
+          <w:color w:val="B45309"/>
+          <w:sz w:val="18"/>
+        </w:rPr>
+        <w:t xml:space="preserve">  👉 Chi phí: Thương lượng theo từng yêu cầu thực tế (Báo giá riêng).</w:t>
+        <w:br/>
+      </w:r>
+      <w:r>
+        <w:rPr>
+          <w:sz w:val="17"/>
+        </w:rPr>
+        <w:t xml:space="preserve">  👉 Quy trình: Khi quán có nhu cầu bổ sung thêm tính năng mới (mở rộng kênh bán, kết nối phần mềm kế toán bên ngoài...), đội ngũ kỹ sư sẽ khảo sát phạm vi, thống nhất giải pháp và báo giá cụ thể theo độ phức tạp.</w:t>
+        <w:br/>
+      </w:r>
+    </w:p>
     <w:p/>
     <w:p>
       <w:pPr>

</xml_diff>

<commit_message>
feat(pricing): add 3-milestone payment schedule (30%-40%-30%) to part 1 in markdown and docx
</commit_message>
<xml_diff>
--- a/02_Bao_Gia_Chi_Phi/Bao_Gia_Chi_Phi_Smart_FB_OS.docx
+++ b/02_Bao_Gia_Chi_Phi/Bao_Gia_Chi_Phi_Smart_FB_OS.docx
@@ -480,9 +480,9 @@
                 <w:color w:val="B45309"/>
                 <w:sz w:val="19"/>
               </w:rPr>
-              <w:t>💰 15.000.000 VNĐ (TRẢ 1 LẦN)</w:t>
+              <w:t>💰 15.000.000 VNĐ (CHIA 3 ĐỢT)</w:t>
               <w:br/>
-              <w:t>(Sở hữu vĩnh viễn)</w:t>
+              <w:t>(30% – 40% – 30%)</w:t>
             </w:r>
           </w:p>
         </w:tc>
@@ -617,7 +617,7 @@
                 <w:color w:val="0F172A"/>
                 <w:sz w:val="18"/>
               </w:rPr>
-              <w:t>Khách hàng thanh toán 01 lần duy nhất, được bàn giao 100% mã nguồn và tài liệu kỹ thuật. Khách hàng sở hữu vĩnh viễn hệ thống, hoàn toàn KHÔNG phải trả phí duy trì bản quyền phần mềm hàng tháng (0 VNĐ Software License Fee).</w:t>
+              <w:t>Khách hàng thanh toán 01 lần theo 3 đợt tiến độ, được bàn giao 100% mã nguồn và tài liệu kỹ thuật. Khách hàng sở hữu vĩnh viễn hệ thống, hoàn toàn KHÔNG phải trả phí duy trì bản quyền phần mềm hàng tháng (0 VNĐ Software License Fee).</w:t>
             </w:r>
           </w:p>
         </w:tc>
@@ -646,9 +646,489 @@
           <w:i/>
           <w:sz w:val="19"/>
         </w:rPr>
-        <w:t>(Bằng chữ: Mười lăm triệu đồng chẵn — Trả một lần duy nhất, sở hữu vĩnh viễn mã nguồn).</w:t>
+        <w:t>(Bằng chữ: Mười lăm triệu đồng chẵn — Trả theo 3 đợt bàn giao, sở hữu vĩnh viễn mã nguồn).</w:t>
       </w:r>
     </w:p>
+    <w:p>
+      <w:r>
+        <w:rPr>
+          <w:b/>
+        </w:rPr>
+        <w:t>💳 Kế Hoạch Phân Kỳ 3 Đợt Thanh Toán:</w:t>
+      </w:r>
+    </w:p>
+    <w:tbl>
+      <w:tblPr>
+        <w:tblW w:type="auto" w:w="0"/>
+        <w:jc w:val="center"/>
+        <w:tblLook w:firstColumn="1" w:firstRow="1" w:lastColumn="0" w:lastRow="0" w:noHBand="0" w:noVBand="1" w:val="04A0"/>
+        <w:tblBorders>
+          <w:top w:val="single" w:sz="4" w:space="0" w:color="CBD5E1"/>
+          <w:bottom w:val="single" w:sz="4" w:space="0" w:color="CBD5E1"/>
+          <w:left w:val="single" w:sz="4" w:space="0" w:color="CBD5E1"/>
+          <w:right w:val="single" w:sz="4" w:space="0" w:color="CBD5E1"/>
+          <w:insideH w:val="single" w:sz="4" w:space="0" w:color="CBD5E1"/>
+          <w:insideV w:val="single" w:sz="4" w:space="0" w:color="CBD5E1"/>
+        </w:tblBorders>
+      </w:tblPr>
+      <w:tblGrid>
+        <w:gridCol w:w="2509"/>
+        <w:gridCol w:w="2509"/>
+        <w:gridCol w:w="2509"/>
+        <w:gridCol w:w="2509"/>
+      </w:tblGrid>
+      <w:tr>
+        <w:tc>
+          <w:tcPr>
+            <w:tcW w:type="dxa" w:w="2592"/>
+            <w:shd w:fill="F1F5F9"/>
+            <w:tcMar>
+              <w:top w:w="80" w:type="dxa"/>
+              <w:bottom w:w="80" w:type="dxa"/>
+              <w:left w:w="100" w:type="dxa"/>
+              <w:right w:w="100" w:type="dxa"/>
+            </w:tcMar>
+          </w:tcPr>
+          <w:p>
+            <w:r>
+              <w:rPr>
+                <w:b/>
+                <w:sz w:val="17"/>
+              </w:rPr>
+              <w:t>Đợt Thanh Toán</w:t>
+            </w:r>
+          </w:p>
+        </w:tc>
+        <w:tc>
+          <w:tcPr>
+            <w:tcW w:type="dxa" w:w="1152"/>
+            <w:shd w:fill="F1F5F9"/>
+            <w:tcMar>
+              <w:top w:w="80" w:type="dxa"/>
+              <w:bottom w:w="80" w:type="dxa"/>
+              <w:left w:w="100" w:type="dxa"/>
+              <w:right w:w="100" w:type="dxa"/>
+            </w:tcMar>
+          </w:tcPr>
+          <w:p>
+            <w:r>
+              <w:rPr>
+                <w:b/>
+                <w:sz w:val="17"/>
+              </w:rPr>
+              <w:t>Tỷ Lệ</w:t>
+            </w:r>
+          </w:p>
+        </w:tc>
+        <w:tc>
+          <w:tcPr>
+            <w:tcW w:type="dxa" w:w="2160"/>
+            <w:shd w:fill="F1F5F9"/>
+            <w:tcMar>
+              <w:top w:w="80" w:type="dxa"/>
+              <w:bottom w:w="80" w:type="dxa"/>
+              <w:left w:w="100" w:type="dxa"/>
+              <w:right w:w="100" w:type="dxa"/>
+            </w:tcMar>
+          </w:tcPr>
+          <w:p>
+            <w:r>
+              <w:rPr>
+                <w:b/>
+                <w:sz w:val="17"/>
+              </w:rPr>
+              <w:t>Số Tiền (VNĐ)</w:t>
+            </w:r>
+          </w:p>
+        </w:tc>
+        <w:tc>
+          <w:tcPr>
+            <w:tcW w:type="dxa" w:w="4176"/>
+            <w:shd w:fill="F1F5F9"/>
+            <w:tcMar>
+              <w:top w:w="80" w:type="dxa"/>
+              <w:bottom w:w="80" w:type="dxa"/>
+              <w:left w:w="100" w:type="dxa"/>
+              <w:right w:w="100" w:type="dxa"/>
+            </w:tcMar>
+          </w:tcPr>
+          <w:p>
+            <w:r>
+              <w:rPr>
+                <w:b/>
+                <w:sz w:val="17"/>
+              </w:rPr>
+              <w:t>Cột Mốc Kích Hoạt &amp; Nghiệm Thu</w:t>
+            </w:r>
+          </w:p>
+        </w:tc>
+      </w:tr>
+      <w:tr>
+        <w:tc>
+          <w:tcPr>
+            <w:tcW w:type="dxa" w:w="2592"/>
+            <w:tcMar>
+              <w:top w:w="80" w:type="dxa"/>
+              <w:bottom w:w="80" w:type="dxa"/>
+              <w:left w:w="100" w:type="dxa"/>
+              <w:right w:w="100" w:type="dxa"/>
+            </w:tcMar>
+          </w:tcPr>
+          <w:p>
+            <w:pPr>
+              <w:jc w:val="center"/>
+            </w:pPr>
+            <w:r>
+              <w:rPr>
+                <w:b/>
+                <w:sz w:val="17"/>
+              </w:rPr>
+              <w:t>Đợt 1 (Tạm ứng)</w:t>
+            </w:r>
+          </w:p>
+        </w:tc>
+        <w:tc>
+          <w:tcPr>
+            <w:tcW w:type="dxa" w:w="1152"/>
+            <w:tcMar>
+              <w:top w:w="80" w:type="dxa"/>
+              <w:bottom w:w="80" w:type="dxa"/>
+              <w:left w:w="100" w:type="dxa"/>
+              <w:right w:w="100" w:type="dxa"/>
+            </w:tcMar>
+          </w:tcPr>
+          <w:p>
+            <w:pPr>
+              <w:jc w:val="center"/>
+            </w:pPr>
+            <w:r>
+              <w:rPr>
+                <w:b/>
+                <w:sz w:val="17"/>
+              </w:rPr>
+              <w:t>30%</w:t>
+            </w:r>
+          </w:p>
+        </w:tc>
+        <w:tc>
+          <w:tcPr>
+            <w:tcW w:type="dxa" w:w="2160"/>
+            <w:tcMar>
+              <w:top w:w="80" w:type="dxa"/>
+              <w:bottom w:w="80" w:type="dxa"/>
+              <w:left w:w="100" w:type="dxa"/>
+              <w:right w:w="100" w:type="dxa"/>
+            </w:tcMar>
+          </w:tcPr>
+          <w:p>
+            <w:pPr>
+              <w:jc w:val="right"/>
+            </w:pPr>
+            <w:r>
+              <w:rPr>
+                <w:b/>
+                <w:sz w:val="17"/>
+              </w:rPr>
+              <w:t>4.500.000</w:t>
+            </w:r>
+          </w:p>
+        </w:tc>
+        <w:tc>
+          <w:tcPr>
+            <w:tcW w:type="dxa" w:w="4176"/>
+            <w:tcMar>
+              <w:top w:w="80" w:type="dxa"/>
+              <w:bottom w:w="80" w:type="dxa"/>
+              <w:left w:w="100" w:type="dxa"/>
+              <w:right w:w="100" w:type="dxa"/>
+            </w:tcMar>
+          </w:tcPr>
+          <w:p>
+            <w:r>
+              <w:rPr>
+                <w:sz w:val="17"/>
+              </w:rPr>
+              <w:t>Ký kết hợp đồng và phê duyệt Bản đặc tả kỹ thuật (SRS &amp; API Contract)</w:t>
+            </w:r>
+          </w:p>
+        </w:tc>
+      </w:tr>
+      <w:tr>
+        <w:tc>
+          <w:tcPr>
+            <w:tcW w:type="dxa" w:w="2592"/>
+            <w:tcMar>
+              <w:top w:w="80" w:type="dxa"/>
+              <w:bottom w:w="80" w:type="dxa"/>
+              <w:left w:w="100" w:type="dxa"/>
+              <w:right w:w="100" w:type="dxa"/>
+            </w:tcMar>
+          </w:tcPr>
+          <w:p>
+            <w:pPr>
+              <w:jc w:val="center"/>
+            </w:pPr>
+            <w:r>
+              <w:rPr>
+                <w:b/>
+                <w:sz w:val="17"/>
+              </w:rPr>
+              <w:t>Đợt 2 (Nghiệm thu UAT)</w:t>
+            </w:r>
+          </w:p>
+        </w:tc>
+        <w:tc>
+          <w:tcPr>
+            <w:tcW w:type="dxa" w:w="1152"/>
+            <w:tcMar>
+              <w:top w:w="80" w:type="dxa"/>
+              <w:bottom w:w="80" w:type="dxa"/>
+              <w:left w:w="100" w:type="dxa"/>
+              <w:right w:w="100" w:type="dxa"/>
+            </w:tcMar>
+          </w:tcPr>
+          <w:p>
+            <w:pPr>
+              <w:jc w:val="center"/>
+            </w:pPr>
+            <w:r>
+              <w:rPr>
+                <w:b/>
+                <w:sz w:val="17"/>
+              </w:rPr>
+              <w:t>40%</w:t>
+            </w:r>
+          </w:p>
+        </w:tc>
+        <w:tc>
+          <w:tcPr>
+            <w:tcW w:type="dxa" w:w="2160"/>
+            <w:tcMar>
+              <w:top w:w="80" w:type="dxa"/>
+              <w:bottom w:w="80" w:type="dxa"/>
+              <w:left w:w="100" w:type="dxa"/>
+              <w:right w:w="100" w:type="dxa"/>
+            </w:tcMar>
+          </w:tcPr>
+          <w:p>
+            <w:pPr>
+              <w:jc w:val="right"/>
+            </w:pPr>
+            <w:r>
+              <w:rPr>
+                <w:b/>
+                <w:sz w:val="17"/>
+              </w:rPr>
+              <w:t>6.000.000</w:t>
+            </w:r>
+          </w:p>
+        </w:tc>
+        <w:tc>
+          <w:tcPr>
+            <w:tcW w:type="dxa" w:w="4176"/>
+            <w:tcMar>
+              <w:top w:w="80" w:type="dxa"/>
+              <w:bottom w:w="80" w:type="dxa"/>
+              <w:left w:w="100" w:type="dxa"/>
+              <w:right w:w="100" w:type="dxa"/>
+            </w:tcMar>
+          </w:tcPr>
+          <w:p>
+            <w:r>
+              <w:rPr>
+                <w:sz w:val="17"/>
+              </w:rPr>
+              <w:t>Hoàn thành bản dựng hệ thống, cấu hình cổng PayOS &amp; chạy thử nghiệm UAT</w:t>
+            </w:r>
+          </w:p>
+        </w:tc>
+      </w:tr>
+      <w:tr>
+        <w:tc>
+          <w:tcPr>
+            <w:tcW w:type="dxa" w:w="2592"/>
+            <w:tcMar>
+              <w:top w:w="80" w:type="dxa"/>
+              <w:bottom w:w="80" w:type="dxa"/>
+              <w:left w:w="100" w:type="dxa"/>
+              <w:right w:w="100" w:type="dxa"/>
+            </w:tcMar>
+          </w:tcPr>
+          <w:p>
+            <w:pPr>
+              <w:jc w:val="center"/>
+            </w:pPr>
+            <w:r>
+              <w:rPr>
+                <w:b/>
+                <w:sz w:val="17"/>
+              </w:rPr>
+              <w:t>Đợt 3 (Quyết toán)</w:t>
+            </w:r>
+          </w:p>
+        </w:tc>
+        <w:tc>
+          <w:tcPr>
+            <w:tcW w:type="dxa" w:w="1152"/>
+            <w:tcMar>
+              <w:top w:w="80" w:type="dxa"/>
+              <w:bottom w:w="80" w:type="dxa"/>
+              <w:left w:w="100" w:type="dxa"/>
+              <w:right w:w="100" w:type="dxa"/>
+            </w:tcMar>
+          </w:tcPr>
+          <w:p>
+            <w:pPr>
+              <w:jc w:val="center"/>
+            </w:pPr>
+            <w:r>
+              <w:rPr>
+                <w:b/>
+                <w:sz w:val="17"/>
+              </w:rPr>
+              <w:t>30%</w:t>
+            </w:r>
+          </w:p>
+        </w:tc>
+        <w:tc>
+          <w:tcPr>
+            <w:tcW w:type="dxa" w:w="2160"/>
+            <w:tcMar>
+              <w:top w:w="80" w:type="dxa"/>
+              <w:bottom w:w="80" w:type="dxa"/>
+              <w:left w:w="100" w:type="dxa"/>
+              <w:right w:w="100" w:type="dxa"/>
+            </w:tcMar>
+          </w:tcPr>
+          <w:p>
+            <w:pPr>
+              <w:jc w:val="right"/>
+            </w:pPr>
+            <w:r>
+              <w:rPr>
+                <w:b/>
+                <w:sz w:val="17"/>
+              </w:rPr>
+              <w:t>4.500.000</w:t>
+            </w:r>
+          </w:p>
+        </w:tc>
+        <w:tc>
+          <w:tcPr>
+            <w:tcW w:type="dxa" w:w="4176"/>
+            <w:tcMar>
+              <w:top w:w="80" w:type="dxa"/>
+              <w:bottom w:w="80" w:type="dxa"/>
+              <w:left w:w="100" w:type="dxa"/>
+              <w:right w:w="100" w:type="dxa"/>
+            </w:tcMar>
+          </w:tcPr>
+          <w:p>
+            <w:r>
+              <w:rPr>
+                <w:sz w:val="17"/>
+              </w:rPr>
+              <w:t>Nghiệm thu chính thức, bàn giao 100% mã nguồn, Docker và hoàn tất chuyển giao</w:t>
+            </w:r>
+          </w:p>
+        </w:tc>
+      </w:tr>
+      <w:tr>
+        <w:tc>
+          <w:tcPr>
+            <w:tcW w:type="dxa" w:w="2592"/>
+            <w:shd w:fill="FEF3C7"/>
+            <w:tcMar>
+              <w:top w:w="80" w:type="dxa"/>
+              <w:bottom w:w="80" w:type="dxa"/>
+              <w:left w:w="100" w:type="dxa"/>
+              <w:right w:w="100" w:type="dxa"/>
+            </w:tcMar>
+          </w:tcPr>
+          <w:p>
+            <w:pPr>
+              <w:jc w:val="center"/>
+            </w:pPr>
+            <w:r>
+              <w:rPr>
+                <w:b/>
+                <w:sz w:val="17"/>
+              </w:rPr>
+              <w:t>🏆 TỔNG CỘNG</w:t>
+            </w:r>
+          </w:p>
+        </w:tc>
+        <w:tc>
+          <w:tcPr>
+            <w:tcW w:type="dxa" w:w="1152"/>
+            <w:shd w:fill="FEF3C7"/>
+            <w:tcMar>
+              <w:top w:w="80" w:type="dxa"/>
+              <w:bottom w:w="80" w:type="dxa"/>
+              <w:left w:w="100" w:type="dxa"/>
+              <w:right w:w="100" w:type="dxa"/>
+            </w:tcMar>
+          </w:tcPr>
+          <w:p>
+            <w:pPr>
+              <w:jc w:val="center"/>
+            </w:pPr>
+            <w:r>
+              <w:rPr>
+                <w:b/>
+                <w:sz w:val="17"/>
+              </w:rPr>
+              <w:t>100%</w:t>
+            </w:r>
+          </w:p>
+        </w:tc>
+        <w:tc>
+          <w:tcPr>
+            <w:tcW w:type="dxa" w:w="2160"/>
+            <w:shd w:fill="FEF3C7"/>
+            <w:tcMar>
+              <w:top w:w="80" w:type="dxa"/>
+              <w:bottom w:w="80" w:type="dxa"/>
+              <w:left w:w="100" w:type="dxa"/>
+              <w:right w:w="100" w:type="dxa"/>
+            </w:tcMar>
+          </w:tcPr>
+          <w:p>
+            <w:pPr>
+              <w:jc w:val="right"/>
+            </w:pPr>
+            <w:r>
+              <w:rPr>
+                <w:b/>
+                <w:sz w:val="17"/>
+              </w:rPr>
+              <w:t>15.000.000 VNĐ</w:t>
+            </w:r>
+          </w:p>
+        </w:tc>
+        <w:tc>
+          <w:tcPr>
+            <w:tcW w:type="dxa" w:w="4176"/>
+            <w:shd w:fill="FEF3C7"/>
+            <w:tcMar>
+              <w:top w:w="80" w:type="dxa"/>
+              <w:bottom w:w="80" w:type="dxa"/>
+              <w:left w:w="100" w:type="dxa"/>
+              <w:right w:w="100" w:type="dxa"/>
+            </w:tcMar>
+          </w:tcPr>
+          <w:p>
+            <w:r>
+              <w:rPr>
+                <w:sz w:val="17"/>
+              </w:rPr>
+              <w:t>Thanh toán theo đúng tiến độ hoàn thành thực tế</w:t>
+            </w:r>
+          </w:p>
+        </w:tc>
+      </w:tr>
+    </w:tbl>
+    <w:p/>
     <w:p>
       <w:r>
         <w:rPr>

</xml_diff>

<commit_message>
feat(pricing): update docx quotation with self-contained all-in-one infrastructure assurance and 3-milestone capex
</commit_message>
<xml_diff>
--- a/02_Bao_Gia_Chi_Phi/Bao_Gia_Chi_Phi_Smart_FB_OS.docx
+++ b/02_Bao_Gia_Chi_Phi/Bao_Gia_Chi_Phi_Smart_FB_OS.docx
@@ -52,10 +52,10 @@
             <w:tcW w:type="dxa" w:w="3168"/>
             <w:shd w:fill="F8FAFC"/>
             <w:tcMar>
-              <w:top w:w="80" w:type="dxa"/>
-              <w:bottom w:w="80" w:type="dxa"/>
-              <w:left w:w="100" w:type="dxa"/>
-              <w:right w:w="100" w:type="dxa"/>
+              <w:top w:w="90" w:type="dxa"/>
+              <w:bottom w:w="90" w:type="dxa"/>
+              <w:left w:w="120" w:type="dxa"/>
+              <w:right w:w="120" w:type="dxa"/>
             </w:tcMar>
           </w:tcPr>
           <w:p>
@@ -73,10 +73,10 @@
             <w:tcW w:type="dxa" w:w="6912"/>
             <w:shd w:fill="FFFFFF"/>
             <w:tcMar>
-              <w:top w:w="80" w:type="dxa"/>
-              <w:bottom w:w="80" w:type="dxa"/>
-              <w:left w:w="100" w:type="dxa"/>
-              <w:right w:w="100" w:type="dxa"/>
+              <w:top w:w="90" w:type="dxa"/>
+              <w:bottom w:w="90" w:type="dxa"/>
+              <w:left w:w="120" w:type="dxa"/>
+              <w:right w:w="120" w:type="dxa"/>
             </w:tcMar>
           </w:tcPr>
           <w:p>
@@ -96,10 +96,10 @@
             <w:tcW w:type="dxa" w:w="3168"/>
             <w:shd w:fill="F8FAFC"/>
             <w:tcMar>
-              <w:top w:w="80" w:type="dxa"/>
-              <w:bottom w:w="80" w:type="dxa"/>
-              <w:left w:w="100" w:type="dxa"/>
-              <w:right w:w="100" w:type="dxa"/>
+              <w:top w:w="90" w:type="dxa"/>
+              <w:bottom w:w="90" w:type="dxa"/>
+              <w:left w:w="120" w:type="dxa"/>
+              <w:right w:w="120" w:type="dxa"/>
             </w:tcMar>
           </w:tcPr>
           <w:p>
@@ -117,10 +117,10 @@
             <w:tcW w:type="dxa" w:w="6912"/>
             <w:shd w:fill="FFFFFF"/>
             <w:tcMar>
-              <w:top w:w="80" w:type="dxa"/>
-              <w:bottom w:w="80" w:type="dxa"/>
-              <w:left w:w="100" w:type="dxa"/>
-              <w:right w:w="100" w:type="dxa"/>
+              <w:top w:w="90" w:type="dxa"/>
+              <w:bottom w:w="90" w:type="dxa"/>
+              <w:left w:w="120" w:type="dxa"/>
+              <w:right w:w="120" w:type="dxa"/>
             </w:tcMar>
           </w:tcPr>
           <w:p>
@@ -139,10 +139,10 @@
             <w:tcW w:type="dxa" w:w="3168"/>
             <w:shd w:fill="F8FAFC"/>
             <w:tcMar>
-              <w:top w:w="80" w:type="dxa"/>
-              <w:bottom w:w="80" w:type="dxa"/>
-              <w:left w:w="100" w:type="dxa"/>
-              <w:right w:w="100" w:type="dxa"/>
+              <w:top w:w="90" w:type="dxa"/>
+              <w:bottom w:w="90" w:type="dxa"/>
+              <w:left w:w="120" w:type="dxa"/>
+              <w:right w:w="120" w:type="dxa"/>
             </w:tcMar>
           </w:tcPr>
           <w:p>
@@ -160,10 +160,10 @@
             <w:tcW w:type="dxa" w:w="6912"/>
             <w:shd w:fill="FFFFFF"/>
             <w:tcMar>
-              <w:top w:w="80" w:type="dxa"/>
-              <w:bottom w:w="80" w:type="dxa"/>
-              <w:left w:w="100" w:type="dxa"/>
-              <w:right w:w="100" w:type="dxa"/>
+              <w:top w:w="90" w:type="dxa"/>
+              <w:bottom w:w="90" w:type="dxa"/>
+              <w:left w:w="120" w:type="dxa"/>
+              <w:right w:w="120" w:type="dxa"/>
             </w:tcMar>
           </w:tcPr>
           <w:p>
@@ -182,10 +182,10 @@
             <w:tcW w:type="dxa" w:w="3168"/>
             <w:shd w:fill="F8FAFC"/>
             <w:tcMar>
-              <w:top w:w="80" w:type="dxa"/>
-              <w:bottom w:w="80" w:type="dxa"/>
-              <w:left w:w="100" w:type="dxa"/>
-              <w:right w:w="100" w:type="dxa"/>
+              <w:top w:w="90" w:type="dxa"/>
+              <w:bottom w:w="90" w:type="dxa"/>
+              <w:left w:w="120" w:type="dxa"/>
+              <w:right w:w="120" w:type="dxa"/>
             </w:tcMar>
           </w:tcPr>
           <w:p>
@@ -203,10 +203,10 @@
             <w:tcW w:type="dxa" w:w="6912"/>
             <w:shd w:fill="FFFFFF"/>
             <w:tcMar>
-              <w:top w:w="80" w:type="dxa"/>
-              <w:bottom w:w="80" w:type="dxa"/>
-              <w:left w:w="100" w:type="dxa"/>
-              <w:right w:w="100" w:type="dxa"/>
+              <w:top w:w="90" w:type="dxa"/>
+              <w:bottom w:w="90" w:type="dxa"/>
+              <w:left w:w="120" w:type="dxa"/>
+              <w:right w:w="120" w:type="dxa"/>
             </w:tcMar>
           </w:tcPr>
           <w:p>
@@ -225,10 +225,10 @@
             <w:tcW w:type="dxa" w:w="3168"/>
             <w:shd w:fill="F8FAFC"/>
             <w:tcMar>
-              <w:top w:w="80" w:type="dxa"/>
-              <w:bottom w:w="80" w:type="dxa"/>
-              <w:left w:w="100" w:type="dxa"/>
-              <w:right w:w="100" w:type="dxa"/>
+              <w:top w:w="90" w:type="dxa"/>
+              <w:bottom w:w="90" w:type="dxa"/>
+              <w:left w:w="120" w:type="dxa"/>
+              <w:right w:w="120" w:type="dxa"/>
             </w:tcMar>
           </w:tcPr>
           <w:p>
@@ -246,10 +246,10 @@
             <w:tcW w:type="dxa" w:w="6912"/>
             <w:shd w:fill="FFFFFF"/>
             <w:tcMar>
-              <w:top w:w="80" w:type="dxa"/>
-              <w:bottom w:w="80" w:type="dxa"/>
-              <w:left w:w="100" w:type="dxa"/>
-              <w:right w:w="100" w:type="dxa"/>
+              <w:top w:w="90" w:type="dxa"/>
+              <w:bottom w:w="90" w:type="dxa"/>
+              <w:left w:w="120" w:type="dxa"/>
+              <w:right w:w="120" w:type="dxa"/>
             </w:tcMar>
           </w:tcPr>
           <w:p>
@@ -269,10 +269,10 @@
             <w:tcW w:type="dxa" w:w="3168"/>
             <w:shd w:fill="F8FAFC"/>
             <w:tcMar>
-              <w:top w:w="80" w:type="dxa"/>
-              <w:bottom w:w="80" w:type="dxa"/>
-              <w:left w:w="100" w:type="dxa"/>
-              <w:right w:w="100" w:type="dxa"/>
+              <w:top w:w="90" w:type="dxa"/>
+              <w:bottom w:w="90" w:type="dxa"/>
+              <w:left w:w="120" w:type="dxa"/>
+              <w:right w:w="120" w:type="dxa"/>
             </w:tcMar>
           </w:tcPr>
           <w:p>
@@ -290,10 +290,10 @@
             <w:tcW w:type="dxa" w:w="6912"/>
             <w:shd w:fill="FFFFFF"/>
             <w:tcMar>
-              <w:top w:w="80" w:type="dxa"/>
-              <w:bottom w:w="80" w:type="dxa"/>
-              <w:left w:w="100" w:type="dxa"/>
-              <w:right w:w="100" w:type="dxa"/>
+              <w:top w:w="90" w:type="dxa"/>
+              <w:bottom w:w="90" w:type="dxa"/>
+              <w:left w:w="120" w:type="dxa"/>
+              <w:right w:w="120" w:type="dxa"/>
             </w:tcMar>
           </w:tcPr>
           <w:p>
@@ -313,10 +313,10 @@
             <w:tcW w:type="dxa" w:w="3168"/>
             <w:shd w:fill="F8FAFC"/>
             <w:tcMar>
-              <w:top w:w="80" w:type="dxa"/>
-              <w:bottom w:w="80" w:type="dxa"/>
-              <w:left w:w="100" w:type="dxa"/>
-              <w:right w:w="100" w:type="dxa"/>
+              <w:top w:w="90" w:type="dxa"/>
+              <w:bottom w:w="90" w:type="dxa"/>
+              <w:left w:w="120" w:type="dxa"/>
+              <w:right w:w="120" w:type="dxa"/>
             </w:tcMar>
           </w:tcPr>
           <w:p>
@@ -334,10 +334,10 @@
             <w:tcW w:type="dxa" w:w="6912"/>
             <w:shd w:fill="FFFFFF"/>
             <w:tcMar>
-              <w:top w:w="80" w:type="dxa"/>
-              <w:bottom w:w="80" w:type="dxa"/>
-              <w:left w:w="100" w:type="dxa"/>
-              <w:right w:w="100" w:type="dxa"/>
+              <w:top w:w="90" w:type="dxa"/>
+              <w:bottom w:w="90" w:type="dxa"/>
+              <w:left w:w="120" w:type="dxa"/>
+              <w:right w:w="120" w:type="dxa"/>
             </w:tcMar>
           </w:tcPr>
           <w:p>
@@ -455,10 +455,10 @@
             <w:tcW w:type="dxa" w:w="3355"/>
             <w:shd w:fill="FFFBEB"/>
             <w:tcMar>
-              <w:top w:w="80" w:type="dxa"/>
-              <w:bottom w:w="80" w:type="dxa"/>
-              <w:left w:w="100" w:type="dxa"/>
-              <w:right w:w="100" w:type="dxa"/>
+              <w:top w:w="90" w:type="dxa"/>
+              <w:bottom w:w="90" w:type="dxa"/>
+              <w:left w:w="120" w:type="dxa"/>
+              <w:right w:w="120" w:type="dxa"/>
             </w:tcMar>
           </w:tcPr>
           <w:p>
@@ -470,7 +470,7 @@
               <w:br/>
               <w:t>• Bàn giao 100% mã nguồn</w:t>
               <w:br/>
-              <w:t>• 0 VNĐ phí bản quyền</w:t>
+              <w:t>• 0 VNĐ phí bản quyền phần mềm</w:t>
               <w:br/>
               <w:br/>
             </w:r>
@@ -491,10 +491,10 @@
             <w:tcW w:type="dxa" w:w="3355"/>
             <w:shd w:fill="F0F9FF"/>
             <w:tcMar>
-              <w:top w:w="80" w:type="dxa"/>
-              <w:bottom w:w="80" w:type="dxa"/>
-              <w:left w:w="100" w:type="dxa"/>
-              <w:right w:w="100" w:type="dxa"/>
+              <w:top w:w="90" w:type="dxa"/>
+              <w:bottom w:w="90" w:type="dxa"/>
+              <w:left w:w="120" w:type="dxa"/>
+              <w:right w:w="120" w:type="dxa"/>
             </w:tcMar>
           </w:tcPr>
           <w:p>
@@ -502,11 +502,11 @@
               <w:rPr>
                 <w:sz w:val="17"/>
               </w:rPr>
-              <w:t>• Cloud VPS VN, Domain, AI</w:t>
+              <w:t>• Cloud VPS VN, Domain, AI, In ấn</w:t>
               <w:br/>
-              <w:t>• Vật tư giấy in nhiệt 3 quán</w:t>
+              <w:t>• Tự chứa 100% không phát sinh thêm</w:t>
               <w:br/>
-              <w:t>• Kịch bản tối ưu chi phí</w:t>
+              <w:t>• Tiết kiệm tối đa chi phí</w:t>
               <w:br/>
               <w:br/>
             </w:r>
@@ -527,10 +527,10 @@
             <w:tcW w:type="dxa" w:w="3355"/>
             <w:shd w:fill="F0FDF4"/>
             <w:tcMar>
-              <w:top w:w="80" w:type="dxa"/>
-              <w:bottom w:w="80" w:type="dxa"/>
-              <w:left w:w="100" w:type="dxa"/>
-              <w:right w:w="100" w:type="dxa"/>
+              <w:top w:w="90" w:type="dxa"/>
+              <w:bottom w:w="90" w:type="dxa"/>
+              <w:left w:w="120" w:type="dxa"/>
+              <w:right w:w="120" w:type="dxa"/>
             </w:tcMar>
           </w:tcPr>
           <w:p>
@@ -554,7 +554,7 @@
               </w:rPr>
               <w:t>💰 300.000 – 500.000 Đ/LẦN</w:t>
               <w:br/>
-              <w:t>(Thêm tính năng: Thương lượng)</w:t>
+              <w:t>(Tính năng mới: Thương lượng)</w:t>
             </w:r>
           </w:p>
         </w:tc>
@@ -646,7 +646,7 @@
           <w:i/>
           <w:sz w:val="19"/>
         </w:rPr>
-        <w:t>(Bằng chữ: Mười lăm triệu đồng chẵn — Trả theo 3 đợt bàn giao, sở hữu vĩnh viễn mã nguồn).</w:t>
+        <w:t>(Bằng chữ: Mười lăm triệu đồng chẵn — Trả theo 3 đợt bàn giao, sở hữu vĩnh viễn 100% mã nguồn).</w:t>
       </w:r>
     </w:p>
     <w:p>
@@ -683,10 +683,10 @@
             <w:tcW w:type="dxa" w:w="2592"/>
             <w:shd w:fill="F1F5F9"/>
             <w:tcMar>
-              <w:top w:w="80" w:type="dxa"/>
-              <w:bottom w:w="80" w:type="dxa"/>
-              <w:left w:w="100" w:type="dxa"/>
-              <w:right w:w="100" w:type="dxa"/>
+              <w:top w:w="90" w:type="dxa"/>
+              <w:bottom w:w="90" w:type="dxa"/>
+              <w:left w:w="120" w:type="dxa"/>
+              <w:right w:w="120" w:type="dxa"/>
             </w:tcMar>
           </w:tcPr>
           <w:p>
@@ -704,10 +704,10 @@
             <w:tcW w:type="dxa" w:w="1152"/>
             <w:shd w:fill="F1F5F9"/>
             <w:tcMar>
-              <w:top w:w="80" w:type="dxa"/>
-              <w:bottom w:w="80" w:type="dxa"/>
-              <w:left w:w="100" w:type="dxa"/>
-              <w:right w:w="100" w:type="dxa"/>
+              <w:top w:w="90" w:type="dxa"/>
+              <w:bottom w:w="90" w:type="dxa"/>
+              <w:left w:w="120" w:type="dxa"/>
+              <w:right w:w="120" w:type="dxa"/>
             </w:tcMar>
           </w:tcPr>
           <w:p>
@@ -725,10 +725,10 @@
             <w:tcW w:type="dxa" w:w="2160"/>
             <w:shd w:fill="F1F5F9"/>
             <w:tcMar>
-              <w:top w:w="80" w:type="dxa"/>
-              <w:bottom w:w="80" w:type="dxa"/>
-              <w:left w:w="100" w:type="dxa"/>
-              <w:right w:w="100" w:type="dxa"/>
+              <w:top w:w="90" w:type="dxa"/>
+              <w:bottom w:w="90" w:type="dxa"/>
+              <w:left w:w="120" w:type="dxa"/>
+              <w:right w:w="120" w:type="dxa"/>
             </w:tcMar>
           </w:tcPr>
           <w:p>
@@ -746,10 +746,10 @@
             <w:tcW w:type="dxa" w:w="4176"/>
             <w:shd w:fill="F1F5F9"/>
             <w:tcMar>
-              <w:top w:w="80" w:type="dxa"/>
-              <w:bottom w:w="80" w:type="dxa"/>
-              <w:left w:w="100" w:type="dxa"/>
-              <w:right w:w="100" w:type="dxa"/>
+              <w:top w:w="90" w:type="dxa"/>
+              <w:bottom w:w="90" w:type="dxa"/>
+              <w:left w:w="120" w:type="dxa"/>
+              <w:right w:w="120" w:type="dxa"/>
             </w:tcMar>
           </w:tcPr>
           <w:p>
@@ -768,10 +768,10 @@
           <w:tcPr>
             <w:tcW w:type="dxa" w:w="2592"/>
             <w:tcMar>
-              <w:top w:w="80" w:type="dxa"/>
-              <w:bottom w:w="80" w:type="dxa"/>
-              <w:left w:w="100" w:type="dxa"/>
-              <w:right w:w="100" w:type="dxa"/>
+              <w:top w:w="90" w:type="dxa"/>
+              <w:bottom w:w="90" w:type="dxa"/>
+              <w:left w:w="120" w:type="dxa"/>
+              <w:right w:w="120" w:type="dxa"/>
             </w:tcMar>
           </w:tcPr>
           <w:p>
@@ -791,10 +791,10 @@
           <w:tcPr>
             <w:tcW w:type="dxa" w:w="1152"/>
             <w:tcMar>
-              <w:top w:w="80" w:type="dxa"/>
-              <w:bottom w:w="80" w:type="dxa"/>
-              <w:left w:w="100" w:type="dxa"/>
-              <w:right w:w="100" w:type="dxa"/>
+              <w:top w:w="90" w:type="dxa"/>
+              <w:bottom w:w="90" w:type="dxa"/>
+              <w:left w:w="120" w:type="dxa"/>
+              <w:right w:w="120" w:type="dxa"/>
             </w:tcMar>
           </w:tcPr>
           <w:p>
@@ -814,10 +814,10 @@
           <w:tcPr>
             <w:tcW w:type="dxa" w:w="2160"/>
             <w:tcMar>
-              <w:top w:w="80" w:type="dxa"/>
-              <w:bottom w:w="80" w:type="dxa"/>
-              <w:left w:w="100" w:type="dxa"/>
-              <w:right w:w="100" w:type="dxa"/>
+              <w:top w:w="90" w:type="dxa"/>
+              <w:bottom w:w="90" w:type="dxa"/>
+              <w:left w:w="120" w:type="dxa"/>
+              <w:right w:w="120" w:type="dxa"/>
             </w:tcMar>
           </w:tcPr>
           <w:p>
@@ -837,10 +837,10 @@
           <w:tcPr>
             <w:tcW w:type="dxa" w:w="4176"/>
             <w:tcMar>
-              <w:top w:w="80" w:type="dxa"/>
-              <w:bottom w:w="80" w:type="dxa"/>
-              <w:left w:w="100" w:type="dxa"/>
-              <w:right w:w="100" w:type="dxa"/>
+              <w:top w:w="90" w:type="dxa"/>
+              <w:bottom w:w="90" w:type="dxa"/>
+              <w:left w:w="120" w:type="dxa"/>
+              <w:right w:w="120" w:type="dxa"/>
             </w:tcMar>
           </w:tcPr>
           <w:p>
@@ -858,10 +858,10 @@
           <w:tcPr>
             <w:tcW w:type="dxa" w:w="2592"/>
             <w:tcMar>
-              <w:top w:w="80" w:type="dxa"/>
-              <w:bottom w:w="80" w:type="dxa"/>
-              <w:left w:w="100" w:type="dxa"/>
-              <w:right w:w="100" w:type="dxa"/>
+              <w:top w:w="90" w:type="dxa"/>
+              <w:bottom w:w="90" w:type="dxa"/>
+              <w:left w:w="120" w:type="dxa"/>
+              <w:right w:w="120" w:type="dxa"/>
             </w:tcMar>
           </w:tcPr>
           <w:p>
@@ -881,10 +881,10 @@
           <w:tcPr>
             <w:tcW w:type="dxa" w:w="1152"/>
             <w:tcMar>
-              <w:top w:w="80" w:type="dxa"/>
-              <w:bottom w:w="80" w:type="dxa"/>
-              <w:left w:w="100" w:type="dxa"/>
-              <w:right w:w="100" w:type="dxa"/>
+              <w:top w:w="90" w:type="dxa"/>
+              <w:bottom w:w="90" w:type="dxa"/>
+              <w:left w:w="120" w:type="dxa"/>
+              <w:right w:w="120" w:type="dxa"/>
             </w:tcMar>
           </w:tcPr>
           <w:p>
@@ -904,10 +904,10 @@
           <w:tcPr>
             <w:tcW w:type="dxa" w:w="2160"/>
             <w:tcMar>
-              <w:top w:w="80" w:type="dxa"/>
-              <w:bottom w:w="80" w:type="dxa"/>
-              <w:left w:w="100" w:type="dxa"/>
-              <w:right w:w="100" w:type="dxa"/>
+              <w:top w:w="90" w:type="dxa"/>
+              <w:bottom w:w="90" w:type="dxa"/>
+              <w:left w:w="120" w:type="dxa"/>
+              <w:right w:w="120" w:type="dxa"/>
             </w:tcMar>
           </w:tcPr>
           <w:p>
@@ -927,10 +927,10 @@
           <w:tcPr>
             <w:tcW w:type="dxa" w:w="4176"/>
             <w:tcMar>
-              <w:top w:w="80" w:type="dxa"/>
-              <w:bottom w:w="80" w:type="dxa"/>
-              <w:left w:w="100" w:type="dxa"/>
-              <w:right w:w="100" w:type="dxa"/>
+              <w:top w:w="90" w:type="dxa"/>
+              <w:bottom w:w="90" w:type="dxa"/>
+              <w:left w:w="120" w:type="dxa"/>
+              <w:right w:w="120" w:type="dxa"/>
             </w:tcMar>
           </w:tcPr>
           <w:p>
@@ -948,10 +948,10 @@
           <w:tcPr>
             <w:tcW w:type="dxa" w:w="2592"/>
             <w:tcMar>
-              <w:top w:w="80" w:type="dxa"/>
-              <w:bottom w:w="80" w:type="dxa"/>
-              <w:left w:w="100" w:type="dxa"/>
-              <w:right w:w="100" w:type="dxa"/>
+              <w:top w:w="90" w:type="dxa"/>
+              <w:bottom w:w="90" w:type="dxa"/>
+              <w:left w:w="120" w:type="dxa"/>
+              <w:right w:w="120" w:type="dxa"/>
             </w:tcMar>
           </w:tcPr>
           <w:p>
@@ -971,10 +971,10 @@
           <w:tcPr>
             <w:tcW w:type="dxa" w:w="1152"/>
             <w:tcMar>
-              <w:top w:w="80" w:type="dxa"/>
-              <w:bottom w:w="80" w:type="dxa"/>
-              <w:left w:w="100" w:type="dxa"/>
-              <w:right w:w="100" w:type="dxa"/>
+              <w:top w:w="90" w:type="dxa"/>
+              <w:bottom w:w="90" w:type="dxa"/>
+              <w:left w:w="120" w:type="dxa"/>
+              <w:right w:w="120" w:type="dxa"/>
             </w:tcMar>
           </w:tcPr>
           <w:p>
@@ -994,10 +994,10 @@
           <w:tcPr>
             <w:tcW w:type="dxa" w:w="2160"/>
             <w:tcMar>
-              <w:top w:w="80" w:type="dxa"/>
-              <w:bottom w:w="80" w:type="dxa"/>
-              <w:left w:w="100" w:type="dxa"/>
-              <w:right w:w="100" w:type="dxa"/>
+              <w:top w:w="90" w:type="dxa"/>
+              <w:bottom w:w="90" w:type="dxa"/>
+              <w:left w:w="120" w:type="dxa"/>
+              <w:right w:w="120" w:type="dxa"/>
             </w:tcMar>
           </w:tcPr>
           <w:p>
@@ -1017,10 +1017,10 @@
           <w:tcPr>
             <w:tcW w:type="dxa" w:w="4176"/>
             <w:tcMar>
-              <w:top w:w="80" w:type="dxa"/>
-              <w:bottom w:w="80" w:type="dxa"/>
-              <w:left w:w="100" w:type="dxa"/>
-              <w:right w:w="100" w:type="dxa"/>
+              <w:top w:w="90" w:type="dxa"/>
+              <w:bottom w:w="90" w:type="dxa"/>
+              <w:left w:w="120" w:type="dxa"/>
+              <w:right w:w="120" w:type="dxa"/>
             </w:tcMar>
           </w:tcPr>
           <w:p>
@@ -1039,10 +1039,10 @@
             <w:tcW w:type="dxa" w:w="2592"/>
             <w:shd w:fill="FEF3C7"/>
             <w:tcMar>
-              <w:top w:w="80" w:type="dxa"/>
-              <w:bottom w:w="80" w:type="dxa"/>
-              <w:left w:w="100" w:type="dxa"/>
-              <w:right w:w="100" w:type="dxa"/>
+              <w:top w:w="90" w:type="dxa"/>
+              <w:bottom w:w="90" w:type="dxa"/>
+              <w:left w:w="120" w:type="dxa"/>
+              <w:right w:w="120" w:type="dxa"/>
             </w:tcMar>
           </w:tcPr>
           <w:p>
@@ -1063,10 +1063,10 @@
             <w:tcW w:type="dxa" w:w="1152"/>
             <w:shd w:fill="FEF3C7"/>
             <w:tcMar>
-              <w:top w:w="80" w:type="dxa"/>
-              <w:bottom w:w="80" w:type="dxa"/>
-              <w:left w:w="100" w:type="dxa"/>
-              <w:right w:w="100" w:type="dxa"/>
+              <w:top w:w="90" w:type="dxa"/>
+              <w:bottom w:w="90" w:type="dxa"/>
+              <w:left w:w="120" w:type="dxa"/>
+              <w:right w:w="120" w:type="dxa"/>
             </w:tcMar>
           </w:tcPr>
           <w:p>
@@ -1087,10 +1087,10 @@
             <w:tcW w:type="dxa" w:w="2160"/>
             <w:shd w:fill="FEF3C7"/>
             <w:tcMar>
-              <w:top w:w="80" w:type="dxa"/>
-              <w:bottom w:w="80" w:type="dxa"/>
-              <w:left w:w="100" w:type="dxa"/>
-              <w:right w:w="100" w:type="dxa"/>
+              <w:top w:w="90" w:type="dxa"/>
+              <w:bottom w:w="90" w:type="dxa"/>
+              <w:left w:w="120" w:type="dxa"/>
+              <w:right w:w="120" w:type="dxa"/>
             </w:tcMar>
           </w:tcPr>
           <w:p>
@@ -1111,10 +1111,10 @@
             <w:tcW w:type="dxa" w:w="4176"/>
             <w:shd w:fill="FEF3C7"/>
             <w:tcMar>
-              <w:top w:w="80" w:type="dxa"/>
-              <w:bottom w:w="80" w:type="dxa"/>
-              <w:left w:w="100" w:type="dxa"/>
-              <w:right w:w="100" w:type="dxa"/>
+              <w:top w:w="90" w:type="dxa"/>
+              <w:bottom w:w="90" w:type="dxa"/>
+              <w:left w:w="120" w:type="dxa"/>
+              <w:right w:w="120" w:type="dxa"/>
             </w:tcMar>
           </w:tcPr>
           <w:p>
@@ -1296,6 +1296,56 @@
         <w:t>PHẦN 2. DỰ TOÁN CHI PHÍ VẬN HÀNH ĐỊNH KỲ (OPEX HÀNG THÁNG)</w:t>
       </w:r>
     </w:p>
+    <w:tbl>
+      <w:tblPr>
+        <w:tblW w:type="auto" w:w="0"/>
+        <w:jc w:val="center"/>
+        <w:tblLayout w:type="fixed"/>
+        <w:tblLook w:firstColumn="1" w:firstRow="1" w:lastColumn="0" w:lastRow="0" w:noHBand="0" w:noVBand="1" w:val="04A0"/>
+      </w:tblPr>
+      <w:tblGrid>
+        <w:gridCol w:w="10037"/>
+      </w:tblGrid>
+      <w:tr>
+        <w:tc>
+          <w:tcPr>
+            <w:tcW w:type="dxa" w:w="10080"/>
+            <w:tcBorders>
+              <w:top w:val="none"/>
+              <w:left w:val="single" w:sz="24" w:space="0" w:color="10B981"/>
+              <w:bottom w:val="none"/>
+              <w:right w:val="none"/>
+            </w:tcBorders>
+            <w:shd w:fill="F0FDF4"/>
+            <w:tcMar>
+              <w:top w:w="100" w:type="dxa"/>
+              <w:bottom w:w="100" w:type="dxa"/>
+              <w:left w:w="140" w:type="dxa"/>
+              <w:right w:w="140" w:type="dxa"/>
+            </w:tcMar>
+          </w:tcPr>
+          <w:p>
+            <w:r>
+              <w:rPr>
+                <w:b/>
+                <w:color w:val="059669"/>
+                <w:sz w:val="19"/>
+              </w:rPr>
+              <w:t>🔒 Cam Kết Hạ Tầng Tự Chứa 100% (All-In-One)</w:t>
+              <w:br/>
+            </w:r>
+            <w:r>
+              <w:rPr>
+                <w:color w:val="0F172A"/>
+                <w:sz w:val="18"/>
+              </w:rPr>
+              <w:t>Hệ thống đã bao gồm trọn gói 100% các thành phần hạ tầng (Máy chủ, Cơ sở dữ liệu, Bộ nhớ đệm, SSL, Tên miền, Cổng thanh toán VietQR, AI và Giấy in bill). Quán hoàn toàn KHÔNG CẦN mua thêm bất kỳ hạ tầng hay dịch vụ bên ngoài nào khác!</w:t>
+            </w:r>
+          </w:p>
+        </w:tc>
+      </w:tr>
+    </w:tbl>
+    <w:p/>
     <w:p>
       <w:pPr>
         <w:pStyle w:val="Heading2"/>
@@ -1304,7 +1354,7 @@
         <w:rPr>
           <w:b/>
           <w:color w:val="1E293B"/>
-          <w:sz w:val="22"/>
+          <w:sz w:val="21"/>
         </w:rPr>
         <w:t>🌟 KỊCH BẢN A: HẠ TẦNG CLOUD VPS VIỆT NAM (KHUYÊN DÙNG — TỐI ƯU CHI PHÍ)</w:t>
       </w:r>
@@ -1346,10 +1396,10 @@
             <w:tcW w:type="dxa" w:w="576"/>
             <w:shd w:fill="F1F5F9"/>
             <w:tcMar>
-              <w:top w:w="80" w:type="dxa"/>
-              <w:bottom w:w="80" w:type="dxa"/>
-              <w:left w:w="100" w:type="dxa"/>
-              <w:right w:w="100" w:type="dxa"/>
+              <w:top w:w="90" w:type="dxa"/>
+              <w:bottom w:w="90" w:type="dxa"/>
+              <w:left w:w="120" w:type="dxa"/>
+              <w:right w:w="120" w:type="dxa"/>
             </w:tcMar>
           </w:tcPr>
           <w:p>
@@ -1367,10 +1417,10 @@
             <w:tcW w:type="dxa" w:w="2160"/>
             <w:shd w:fill="F1F5F9"/>
             <w:tcMar>
-              <w:top w:w="80" w:type="dxa"/>
-              <w:bottom w:w="80" w:type="dxa"/>
-              <w:left w:w="100" w:type="dxa"/>
-              <w:right w:w="100" w:type="dxa"/>
+              <w:top w:w="90" w:type="dxa"/>
+              <w:bottom w:w="90" w:type="dxa"/>
+              <w:left w:w="120" w:type="dxa"/>
+              <w:right w:w="120" w:type="dxa"/>
             </w:tcMar>
           </w:tcPr>
           <w:p>
@@ -1388,10 +1438,10 @@
             <w:tcW w:type="dxa" w:w="2592"/>
             <w:shd w:fill="F1F5F9"/>
             <w:tcMar>
-              <w:top w:w="80" w:type="dxa"/>
-              <w:bottom w:w="80" w:type="dxa"/>
-              <w:left w:w="100" w:type="dxa"/>
-              <w:right w:w="100" w:type="dxa"/>
+              <w:top w:w="90" w:type="dxa"/>
+              <w:bottom w:w="90" w:type="dxa"/>
+              <w:left w:w="120" w:type="dxa"/>
+              <w:right w:w="120" w:type="dxa"/>
             </w:tcMar>
           </w:tcPr>
           <w:p>
@@ -1409,10 +1459,10 @@
             <w:tcW w:type="dxa" w:w="576"/>
             <w:shd w:fill="F1F5F9"/>
             <w:tcMar>
-              <w:top w:w="80" w:type="dxa"/>
-              <w:bottom w:w="80" w:type="dxa"/>
-              <w:left w:w="100" w:type="dxa"/>
-              <w:right w:w="100" w:type="dxa"/>
+              <w:top w:w="90" w:type="dxa"/>
+              <w:bottom w:w="90" w:type="dxa"/>
+              <w:left w:w="120" w:type="dxa"/>
+              <w:right w:w="120" w:type="dxa"/>
             </w:tcMar>
           </w:tcPr>
           <w:p>
@@ -1430,10 +1480,10 @@
             <w:tcW w:type="dxa" w:w="1152"/>
             <w:shd w:fill="F1F5F9"/>
             <w:tcMar>
-              <w:top w:w="80" w:type="dxa"/>
-              <w:bottom w:w="80" w:type="dxa"/>
-              <w:left w:w="100" w:type="dxa"/>
-              <w:right w:w="100" w:type="dxa"/>
+              <w:top w:w="90" w:type="dxa"/>
+              <w:bottom w:w="90" w:type="dxa"/>
+              <w:left w:w="120" w:type="dxa"/>
+              <w:right w:w="120" w:type="dxa"/>
             </w:tcMar>
           </w:tcPr>
           <w:p>
@@ -1451,10 +1501,10 @@
             <w:tcW w:type="dxa" w:w="1296"/>
             <w:shd w:fill="F1F5F9"/>
             <w:tcMar>
-              <w:top w:w="80" w:type="dxa"/>
-              <w:bottom w:w="80" w:type="dxa"/>
-              <w:left w:w="100" w:type="dxa"/>
-              <w:right w:w="100" w:type="dxa"/>
+              <w:top w:w="90" w:type="dxa"/>
+              <w:bottom w:w="90" w:type="dxa"/>
+              <w:left w:w="120" w:type="dxa"/>
+              <w:right w:w="120" w:type="dxa"/>
             </w:tcMar>
           </w:tcPr>
           <w:p>
@@ -1472,10 +1522,10 @@
             <w:tcW w:type="dxa" w:w="1728"/>
             <w:shd w:fill="F1F5F9"/>
             <w:tcMar>
-              <w:top w:w="80" w:type="dxa"/>
-              <w:bottom w:w="80" w:type="dxa"/>
-              <w:left w:w="100" w:type="dxa"/>
-              <w:right w:w="100" w:type="dxa"/>
+              <w:top w:w="90" w:type="dxa"/>
+              <w:bottom w:w="90" w:type="dxa"/>
+              <w:left w:w="120" w:type="dxa"/>
+              <w:right w:w="120" w:type="dxa"/>
             </w:tcMar>
           </w:tcPr>
           <w:p>
@@ -1494,10 +1544,10 @@
           <w:tcPr>
             <w:tcW w:type="dxa" w:w="576"/>
             <w:tcMar>
-              <w:top w:w="80" w:type="dxa"/>
-              <w:bottom w:w="80" w:type="dxa"/>
-              <w:left w:w="100" w:type="dxa"/>
-              <w:right w:w="100" w:type="dxa"/>
+              <w:top w:w="90" w:type="dxa"/>
+              <w:bottom w:w="90" w:type="dxa"/>
+              <w:left w:w="120" w:type="dxa"/>
+              <w:right w:w="120" w:type="dxa"/>
             </w:tcMar>
           </w:tcPr>
           <w:p>
@@ -1516,10 +1566,10 @@
           <w:tcPr>
             <w:tcW w:type="dxa" w:w="2160"/>
             <w:tcMar>
-              <w:top w:w="80" w:type="dxa"/>
-              <w:bottom w:w="80" w:type="dxa"/>
-              <w:left w:w="100" w:type="dxa"/>
-              <w:right w:w="100" w:type="dxa"/>
+              <w:top w:w="90" w:type="dxa"/>
+              <w:bottom w:w="90" w:type="dxa"/>
+              <w:left w:w="120" w:type="dxa"/>
+              <w:right w:w="120" w:type="dxa"/>
             </w:tcMar>
           </w:tcPr>
           <w:p>
@@ -1535,10 +1585,10 @@
           <w:tcPr>
             <w:tcW w:type="dxa" w:w="2592"/>
             <w:tcMar>
-              <w:top w:w="80" w:type="dxa"/>
-              <w:bottom w:w="80" w:type="dxa"/>
-              <w:left w:w="100" w:type="dxa"/>
-              <w:right w:w="100" w:type="dxa"/>
+              <w:top w:w="90" w:type="dxa"/>
+              <w:bottom w:w="90" w:type="dxa"/>
+              <w:left w:w="120" w:type="dxa"/>
+              <w:right w:w="120" w:type="dxa"/>
             </w:tcMar>
           </w:tcPr>
           <w:p>
@@ -1554,10 +1604,10 @@
           <w:tcPr>
             <w:tcW w:type="dxa" w:w="576"/>
             <w:tcMar>
-              <w:top w:w="80" w:type="dxa"/>
-              <w:bottom w:w="80" w:type="dxa"/>
-              <w:left w:w="100" w:type="dxa"/>
-              <w:right w:w="100" w:type="dxa"/>
+              <w:top w:w="90" w:type="dxa"/>
+              <w:bottom w:w="90" w:type="dxa"/>
+              <w:left w:w="120" w:type="dxa"/>
+              <w:right w:w="120" w:type="dxa"/>
             </w:tcMar>
           </w:tcPr>
           <w:p>
@@ -1576,10 +1626,10 @@
           <w:tcPr>
             <w:tcW w:type="dxa" w:w="1152"/>
             <w:tcMar>
-              <w:top w:w="80" w:type="dxa"/>
-              <w:bottom w:w="80" w:type="dxa"/>
-              <w:left w:w="100" w:type="dxa"/>
-              <w:right w:w="100" w:type="dxa"/>
+              <w:top w:w="90" w:type="dxa"/>
+              <w:bottom w:w="90" w:type="dxa"/>
+              <w:left w:w="120" w:type="dxa"/>
+              <w:right w:w="120" w:type="dxa"/>
             </w:tcMar>
           </w:tcPr>
           <w:p>
@@ -1599,10 +1649,10 @@
           <w:tcPr>
             <w:tcW w:type="dxa" w:w="1296"/>
             <w:tcMar>
-              <w:top w:w="80" w:type="dxa"/>
-              <w:bottom w:w="80" w:type="dxa"/>
-              <w:left w:w="100" w:type="dxa"/>
-              <w:right w:w="100" w:type="dxa"/>
+              <w:top w:w="90" w:type="dxa"/>
+              <w:bottom w:w="90" w:type="dxa"/>
+              <w:left w:w="120" w:type="dxa"/>
+              <w:right w:w="120" w:type="dxa"/>
             </w:tcMar>
           </w:tcPr>
           <w:p>
@@ -1622,10 +1672,10 @@
           <w:tcPr>
             <w:tcW w:type="dxa" w:w="1728"/>
             <w:tcMar>
-              <w:top w:w="80" w:type="dxa"/>
-              <w:bottom w:w="80" w:type="dxa"/>
-              <w:left w:w="100" w:type="dxa"/>
-              <w:right w:w="100" w:type="dxa"/>
+              <w:top w:w="90" w:type="dxa"/>
+              <w:bottom w:w="90" w:type="dxa"/>
+              <w:left w:w="120" w:type="dxa"/>
+              <w:right w:w="120" w:type="dxa"/>
             </w:tcMar>
           </w:tcPr>
           <w:p>
@@ -1644,10 +1694,10 @@
             <w:tcW w:type="dxa" w:w="576"/>
             <w:shd w:fill="FAFAFC"/>
             <w:tcMar>
-              <w:top w:w="80" w:type="dxa"/>
-              <w:bottom w:w="80" w:type="dxa"/>
-              <w:left w:w="100" w:type="dxa"/>
-              <w:right w:w="100" w:type="dxa"/>
+              <w:top w:w="90" w:type="dxa"/>
+              <w:bottom w:w="90" w:type="dxa"/>
+              <w:left w:w="120" w:type="dxa"/>
+              <w:right w:w="120" w:type="dxa"/>
             </w:tcMar>
           </w:tcPr>
           <w:p>
@@ -1667,10 +1717,10 @@
             <w:tcW w:type="dxa" w:w="2160"/>
             <w:shd w:fill="FAFAFC"/>
             <w:tcMar>
-              <w:top w:w="80" w:type="dxa"/>
-              <w:bottom w:w="80" w:type="dxa"/>
-              <w:left w:w="100" w:type="dxa"/>
-              <w:right w:w="100" w:type="dxa"/>
+              <w:top w:w="90" w:type="dxa"/>
+              <w:bottom w:w="90" w:type="dxa"/>
+              <w:left w:w="120" w:type="dxa"/>
+              <w:right w:w="120" w:type="dxa"/>
             </w:tcMar>
           </w:tcPr>
           <w:p>
@@ -1687,10 +1737,10 @@
             <w:tcW w:type="dxa" w:w="2592"/>
             <w:shd w:fill="FAFAFC"/>
             <w:tcMar>
-              <w:top w:w="80" w:type="dxa"/>
-              <w:bottom w:w="80" w:type="dxa"/>
-              <w:left w:w="100" w:type="dxa"/>
-              <w:right w:w="100" w:type="dxa"/>
+              <w:top w:w="90" w:type="dxa"/>
+              <w:bottom w:w="90" w:type="dxa"/>
+              <w:left w:w="120" w:type="dxa"/>
+              <w:right w:w="120" w:type="dxa"/>
             </w:tcMar>
           </w:tcPr>
           <w:p>
@@ -1707,10 +1757,10 @@
             <w:tcW w:type="dxa" w:w="576"/>
             <w:shd w:fill="FAFAFC"/>
             <w:tcMar>
-              <w:top w:w="80" w:type="dxa"/>
-              <w:bottom w:w="80" w:type="dxa"/>
-              <w:left w:w="100" w:type="dxa"/>
-              <w:right w:w="100" w:type="dxa"/>
+              <w:top w:w="90" w:type="dxa"/>
+              <w:bottom w:w="90" w:type="dxa"/>
+              <w:left w:w="120" w:type="dxa"/>
+              <w:right w:w="120" w:type="dxa"/>
             </w:tcMar>
           </w:tcPr>
           <w:p>
@@ -1730,10 +1780,10 @@
             <w:tcW w:type="dxa" w:w="1152"/>
             <w:shd w:fill="FAFAFC"/>
             <w:tcMar>
-              <w:top w:w="80" w:type="dxa"/>
-              <w:bottom w:w="80" w:type="dxa"/>
-              <w:left w:w="100" w:type="dxa"/>
-              <w:right w:w="100" w:type="dxa"/>
+              <w:top w:w="90" w:type="dxa"/>
+              <w:bottom w:w="90" w:type="dxa"/>
+              <w:left w:w="120" w:type="dxa"/>
+              <w:right w:w="120" w:type="dxa"/>
             </w:tcMar>
           </w:tcPr>
           <w:p>
@@ -1754,10 +1804,10 @@
             <w:tcW w:type="dxa" w:w="1296"/>
             <w:shd w:fill="FAFAFC"/>
             <w:tcMar>
-              <w:top w:w="80" w:type="dxa"/>
-              <w:bottom w:w="80" w:type="dxa"/>
-              <w:left w:w="100" w:type="dxa"/>
-              <w:right w:w="100" w:type="dxa"/>
+              <w:top w:w="90" w:type="dxa"/>
+              <w:bottom w:w="90" w:type="dxa"/>
+              <w:left w:w="120" w:type="dxa"/>
+              <w:right w:w="120" w:type="dxa"/>
             </w:tcMar>
           </w:tcPr>
           <w:p>
@@ -1778,10 +1828,10 @@
             <w:tcW w:type="dxa" w:w="1728"/>
             <w:shd w:fill="FAFAFC"/>
             <w:tcMar>
-              <w:top w:w="80" w:type="dxa"/>
-              <w:bottom w:w="80" w:type="dxa"/>
-              <w:left w:w="100" w:type="dxa"/>
-              <w:right w:w="100" w:type="dxa"/>
+              <w:top w:w="90" w:type="dxa"/>
+              <w:bottom w:w="90" w:type="dxa"/>
+              <w:left w:w="120" w:type="dxa"/>
+              <w:right w:w="120" w:type="dxa"/>
             </w:tcMar>
           </w:tcPr>
           <w:p>
@@ -1799,10 +1849,10 @@
           <w:tcPr>
             <w:tcW w:type="dxa" w:w="576"/>
             <w:tcMar>
-              <w:top w:w="80" w:type="dxa"/>
-              <w:bottom w:w="80" w:type="dxa"/>
-              <w:left w:w="100" w:type="dxa"/>
-              <w:right w:w="100" w:type="dxa"/>
+              <w:top w:w="90" w:type="dxa"/>
+              <w:bottom w:w="90" w:type="dxa"/>
+              <w:left w:w="120" w:type="dxa"/>
+              <w:right w:w="120" w:type="dxa"/>
             </w:tcMar>
           </w:tcPr>
           <w:p>
@@ -1821,10 +1871,10 @@
           <w:tcPr>
             <w:tcW w:type="dxa" w:w="2160"/>
             <w:tcMar>
-              <w:top w:w="80" w:type="dxa"/>
-              <w:bottom w:w="80" w:type="dxa"/>
-              <w:left w:w="100" w:type="dxa"/>
-              <w:right w:w="100" w:type="dxa"/>
+              <w:top w:w="90" w:type="dxa"/>
+              <w:bottom w:w="90" w:type="dxa"/>
+              <w:left w:w="120" w:type="dxa"/>
+              <w:right w:w="120" w:type="dxa"/>
             </w:tcMar>
           </w:tcPr>
           <w:p>
@@ -1840,10 +1890,10 @@
           <w:tcPr>
             <w:tcW w:type="dxa" w:w="2592"/>
             <w:tcMar>
-              <w:top w:w="80" w:type="dxa"/>
-              <w:bottom w:w="80" w:type="dxa"/>
-              <w:left w:w="100" w:type="dxa"/>
-              <w:right w:w="100" w:type="dxa"/>
+              <w:top w:w="90" w:type="dxa"/>
+              <w:bottom w:w="90" w:type="dxa"/>
+              <w:left w:w="120" w:type="dxa"/>
+              <w:right w:w="120" w:type="dxa"/>
             </w:tcMar>
           </w:tcPr>
           <w:p>
@@ -1859,10 +1909,10 @@
           <w:tcPr>
             <w:tcW w:type="dxa" w:w="576"/>
             <w:tcMar>
-              <w:top w:w="80" w:type="dxa"/>
-              <w:bottom w:w="80" w:type="dxa"/>
-              <w:left w:w="100" w:type="dxa"/>
-              <w:right w:w="100" w:type="dxa"/>
+              <w:top w:w="90" w:type="dxa"/>
+              <w:bottom w:w="90" w:type="dxa"/>
+              <w:left w:w="120" w:type="dxa"/>
+              <w:right w:w="120" w:type="dxa"/>
             </w:tcMar>
           </w:tcPr>
           <w:p>
@@ -1881,10 +1931,10 @@
           <w:tcPr>
             <w:tcW w:type="dxa" w:w="1152"/>
             <w:tcMar>
-              <w:top w:w="80" w:type="dxa"/>
-              <w:bottom w:w="80" w:type="dxa"/>
-              <w:left w:w="100" w:type="dxa"/>
-              <w:right w:w="100" w:type="dxa"/>
+              <w:top w:w="90" w:type="dxa"/>
+              <w:bottom w:w="90" w:type="dxa"/>
+              <w:left w:w="120" w:type="dxa"/>
+              <w:right w:w="120" w:type="dxa"/>
             </w:tcMar>
           </w:tcPr>
           <w:p>
@@ -1904,10 +1954,10 @@
           <w:tcPr>
             <w:tcW w:type="dxa" w:w="1296"/>
             <w:tcMar>
-              <w:top w:w="80" w:type="dxa"/>
-              <w:bottom w:w="80" w:type="dxa"/>
-              <w:left w:w="100" w:type="dxa"/>
-              <w:right w:w="100" w:type="dxa"/>
+              <w:top w:w="90" w:type="dxa"/>
+              <w:bottom w:w="90" w:type="dxa"/>
+              <w:left w:w="120" w:type="dxa"/>
+              <w:right w:w="120" w:type="dxa"/>
             </w:tcMar>
           </w:tcPr>
           <w:p>
@@ -1927,10 +1977,10 @@
           <w:tcPr>
             <w:tcW w:type="dxa" w:w="1728"/>
             <w:tcMar>
-              <w:top w:w="80" w:type="dxa"/>
-              <w:bottom w:w="80" w:type="dxa"/>
-              <w:left w:w="100" w:type="dxa"/>
-              <w:right w:w="100" w:type="dxa"/>
+              <w:top w:w="90" w:type="dxa"/>
+              <w:bottom w:w="90" w:type="dxa"/>
+              <w:left w:w="120" w:type="dxa"/>
+              <w:right w:w="120" w:type="dxa"/>
             </w:tcMar>
           </w:tcPr>
           <w:p>
@@ -1949,10 +1999,10 @@
             <w:tcW w:type="dxa" w:w="576"/>
             <w:shd w:fill="FAFAFC"/>
             <w:tcMar>
-              <w:top w:w="80" w:type="dxa"/>
-              <w:bottom w:w="80" w:type="dxa"/>
-              <w:left w:w="100" w:type="dxa"/>
-              <w:right w:w="100" w:type="dxa"/>
+              <w:top w:w="90" w:type="dxa"/>
+              <w:bottom w:w="90" w:type="dxa"/>
+              <w:left w:w="120" w:type="dxa"/>
+              <w:right w:w="120" w:type="dxa"/>
             </w:tcMar>
           </w:tcPr>
           <w:p>
@@ -1972,10 +2022,10 @@
             <w:tcW w:type="dxa" w:w="2160"/>
             <w:shd w:fill="FAFAFC"/>
             <w:tcMar>
-              <w:top w:w="80" w:type="dxa"/>
-              <w:bottom w:w="80" w:type="dxa"/>
-              <w:left w:w="100" w:type="dxa"/>
-              <w:right w:w="100" w:type="dxa"/>
+              <w:top w:w="90" w:type="dxa"/>
+              <w:bottom w:w="90" w:type="dxa"/>
+              <w:left w:w="120" w:type="dxa"/>
+              <w:right w:w="120" w:type="dxa"/>
             </w:tcMar>
           </w:tcPr>
           <w:p>
@@ -1992,10 +2042,10 @@
             <w:tcW w:type="dxa" w:w="2592"/>
             <w:shd w:fill="FAFAFC"/>
             <w:tcMar>
-              <w:top w:w="80" w:type="dxa"/>
-              <w:bottom w:w="80" w:type="dxa"/>
-              <w:left w:w="100" w:type="dxa"/>
-              <w:right w:w="100" w:type="dxa"/>
+              <w:top w:w="90" w:type="dxa"/>
+              <w:bottom w:w="90" w:type="dxa"/>
+              <w:left w:w="120" w:type="dxa"/>
+              <w:right w:w="120" w:type="dxa"/>
             </w:tcMar>
           </w:tcPr>
           <w:p>
@@ -2012,10 +2062,10 @@
             <w:tcW w:type="dxa" w:w="576"/>
             <w:shd w:fill="FAFAFC"/>
             <w:tcMar>
-              <w:top w:w="80" w:type="dxa"/>
-              <w:bottom w:w="80" w:type="dxa"/>
-              <w:left w:w="100" w:type="dxa"/>
-              <w:right w:w="100" w:type="dxa"/>
+              <w:top w:w="90" w:type="dxa"/>
+              <w:bottom w:w="90" w:type="dxa"/>
+              <w:left w:w="120" w:type="dxa"/>
+              <w:right w:w="120" w:type="dxa"/>
             </w:tcMar>
           </w:tcPr>
           <w:p>
@@ -2035,10 +2085,10 @@
             <w:tcW w:type="dxa" w:w="1152"/>
             <w:shd w:fill="FAFAFC"/>
             <w:tcMar>
-              <w:top w:w="80" w:type="dxa"/>
-              <w:bottom w:w="80" w:type="dxa"/>
-              <w:left w:w="100" w:type="dxa"/>
-              <w:right w:w="100" w:type="dxa"/>
+              <w:top w:w="90" w:type="dxa"/>
+              <w:bottom w:w="90" w:type="dxa"/>
+              <w:left w:w="120" w:type="dxa"/>
+              <w:right w:w="120" w:type="dxa"/>
             </w:tcMar>
           </w:tcPr>
           <w:p>
@@ -2059,10 +2109,10 @@
             <w:tcW w:type="dxa" w:w="1296"/>
             <w:shd w:fill="FAFAFC"/>
             <w:tcMar>
-              <w:top w:w="80" w:type="dxa"/>
-              <w:bottom w:w="80" w:type="dxa"/>
-              <w:left w:w="100" w:type="dxa"/>
-              <w:right w:w="100" w:type="dxa"/>
+              <w:top w:w="90" w:type="dxa"/>
+              <w:bottom w:w="90" w:type="dxa"/>
+              <w:left w:w="120" w:type="dxa"/>
+              <w:right w:w="120" w:type="dxa"/>
             </w:tcMar>
           </w:tcPr>
           <w:p>
@@ -2083,10 +2133,10 @@
             <w:tcW w:type="dxa" w:w="1728"/>
             <w:shd w:fill="FAFAFC"/>
             <w:tcMar>
-              <w:top w:w="80" w:type="dxa"/>
-              <w:bottom w:w="80" w:type="dxa"/>
-              <w:left w:w="100" w:type="dxa"/>
-              <w:right w:w="100" w:type="dxa"/>
+              <w:top w:w="90" w:type="dxa"/>
+              <w:bottom w:w="90" w:type="dxa"/>
+              <w:left w:w="120" w:type="dxa"/>
+              <w:right w:w="120" w:type="dxa"/>
             </w:tcMar>
           </w:tcPr>
           <w:p>
@@ -2104,10 +2154,10 @@
           <w:tcPr>
             <w:tcW w:type="dxa" w:w="576"/>
             <w:tcMar>
-              <w:top w:w="80" w:type="dxa"/>
-              <w:bottom w:w="80" w:type="dxa"/>
-              <w:left w:w="100" w:type="dxa"/>
-              <w:right w:w="100" w:type="dxa"/>
+              <w:top w:w="90" w:type="dxa"/>
+              <w:bottom w:w="90" w:type="dxa"/>
+              <w:left w:w="120" w:type="dxa"/>
+              <w:right w:w="120" w:type="dxa"/>
             </w:tcMar>
           </w:tcPr>
           <w:p>
@@ -2126,10 +2176,10 @@
           <w:tcPr>
             <w:tcW w:type="dxa" w:w="2160"/>
             <w:tcMar>
-              <w:top w:w="80" w:type="dxa"/>
-              <w:bottom w:w="80" w:type="dxa"/>
-              <w:left w:w="100" w:type="dxa"/>
-              <w:right w:w="100" w:type="dxa"/>
+              <w:top w:w="90" w:type="dxa"/>
+              <w:bottom w:w="90" w:type="dxa"/>
+              <w:left w:w="120" w:type="dxa"/>
+              <w:right w:w="120" w:type="dxa"/>
             </w:tcMar>
           </w:tcPr>
           <w:p>
@@ -2145,10 +2195,10 @@
           <w:tcPr>
             <w:tcW w:type="dxa" w:w="2592"/>
             <w:tcMar>
-              <w:top w:w="80" w:type="dxa"/>
-              <w:bottom w:w="80" w:type="dxa"/>
-              <w:left w:w="100" w:type="dxa"/>
-              <w:right w:w="100" w:type="dxa"/>
+              <w:top w:w="90" w:type="dxa"/>
+              <w:bottom w:w="90" w:type="dxa"/>
+              <w:left w:w="120" w:type="dxa"/>
+              <w:right w:w="120" w:type="dxa"/>
             </w:tcMar>
           </w:tcPr>
           <w:p>
@@ -2164,10 +2214,10 @@
           <w:tcPr>
             <w:tcW w:type="dxa" w:w="576"/>
             <w:tcMar>
-              <w:top w:w="80" w:type="dxa"/>
-              <w:bottom w:w="80" w:type="dxa"/>
-              <w:left w:w="100" w:type="dxa"/>
-              <w:right w:w="100" w:type="dxa"/>
+              <w:top w:w="90" w:type="dxa"/>
+              <w:bottom w:w="90" w:type="dxa"/>
+              <w:left w:w="120" w:type="dxa"/>
+              <w:right w:w="120" w:type="dxa"/>
             </w:tcMar>
           </w:tcPr>
           <w:p>
@@ -2186,10 +2236,10 @@
           <w:tcPr>
             <w:tcW w:type="dxa" w:w="1152"/>
             <w:tcMar>
-              <w:top w:w="80" w:type="dxa"/>
-              <w:bottom w:w="80" w:type="dxa"/>
-              <w:left w:w="100" w:type="dxa"/>
-              <w:right w:w="100" w:type="dxa"/>
+              <w:top w:w="90" w:type="dxa"/>
+              <w:bottom w:w="90" w:type="dxa"/>
+              <w:left w:w="120" w:type="dxa"/>
+              <w:right w:w="120" w:type="dxa"/>
             </w:tcMar>
           </w:tcPr>
           <w:p>
@@ -2209,10 +2259,10 @@
           <w:tcPr>
             <w:tcW w:type="dxa" w:w="1296"/>
             <w:tcMar>
-              <w:top w:w="80" w:type="dxa"/>
-              <w:bottom w:w="80" w:type="dxa"/>
-              <w:left w:w="100" w:type="dxa"/>
-              <w:right w:w="100" w:type="dxa"/>
+              <w:top w:w="90" w:type="dxa"/>
+              <w:bottom w:w="90" w:type="dxa"/>
+              <w:left w:w="120" w:type="dxa"/>
+              <w:right w:w="120" w:type="dxa"/>
             </w:tcMar>
           </w:tcPr>
           <w:p>
@@ -2232,10 +2282,10 @@
           <w:tcPr>
             <w:tcW w:type="dxa" w:w="1728"/>
             <w:tcMar>
-              <w:top w:w="80" w:type="dxa"/>
-              <w:bottom w:w="80" w:type="dxa"/>
-              <w:left w:w="100" w:type="dxa"/>
-              <w:right w:w="100" w:type="dxa"/>
+              <w:top w:w="90" w:type="dxa"/>
+              <w:bottom w:w="90" w:type="dxa"/>
+              <w:left w:w="120" w:type="dxa"/>
+              <w:right w:w="120" w:type="dxa"/>
             </w:tcMar>
           </w:tcPr>
           <w:p>
@@ -2254,10 +2304,10 @@
             <w:tcW w:type="dxa" w:w="576"/>
             <w:shd w:fill="FAFAFC"/>
             <w:tcMar>
-              <w:top w:w="80" w:type="dxa"/>
-              <w:bottom w:w="80" w:type="dxa"/>
-              <w:left w:w="100" w:type="dxa"/>
-              <w:right w:w="100" w:type="dxa"/>
+              <w:top w:w="90" w:type="dxa"/>
+              <w:bottom w:w="90" w:type="dxa"/>
+              <w:left w:w="120" w:type="dxa"/>
+              <w:right w:w="120" w:type="dxa"/>
             </w:tcMar>
           </w:tcPr>
           <w:p>
@@ -2277,10 +2327,10 @@
             <w:tcW w:type="dxa" w:w="2160"/>
             <w:shd w:fill="FAFAFC"/>
             <w:tcMar>
-              <w:top w:w="80" w:type="dxa"/>
-              <w:bottom w:w="80" w:type="dxa"/>
-              <w:left w:w="100" w:type="dxa"/>
-              <w:right w:w="100" w:type="dxa"/>
+              <w:top w:w="90" w:type="dxa"/>
+              <w:bottom w:w="90" w:type="dxa"/>
+              <w:left w:w="120" w:type="dxa"/>
+              <w:right w:w="120" w:type="dxa"/>
             </w:tcMar>
           </w:tcPr>
           <w:p>
@@ -2297,10 +2347,10 @@
             <w:tcW w:type="dxa" w:w="2592"/>
             <w:shd w:fill="FAFAFC"/>
             <w:tcMar>
-              <w:top w:w="80" w:type="dxa"/>
-              <w:bottom w:w="80" w:type="dxa"/>
-              <w:left w:w="100" w:type="dxa"/>
-              <w:right w:w="100" w:type="dxa"/>
+              <w:top w:w="90" w:type="dxa"/>
+              <w:bottom w:w="90" w:type="dxa"/>
+              <w:left w:w="120" w:type="dxa"/>
+              <w:right w:w="120" w:type="dxa"/>
             </w:tcMar>
           </w:tcPr>
           <w:p>
@@ -2317,10 +2367,10 @@
             <w:tcW w:type="dxa" w:w="576"/>
             <w:shd w:fill="FAFAFC"/>
             <w:tcMar>
-              <w:top w:w="80" w:type="dxa"/>
-              <w:bottom w:w="80" w:type="dxa"/>
-              <w:left w:w="100" w:type="dxa"/>
-              <w:right w:w="100" w:type="dxa"/>
+              <w:top w:w="90" w:type="dxa"/>
+              <w:bottom w:w="90" w:type="dxa"/>
+              <w:left w:w="120" w:type="dxa"/>
+              <w:right w:w="120" w:type="dxa"/>
             </w:tcMar>
           </w:tcPr>
           <w:p>
@@ -2340,10 +2390,10 @@
             <w:tcW w:type="dxa" w:w="1152"/>
             <w:shd w:fill="FAFAFC"/>
             <w:tcMar>
-              <w:top w:w="80" w:type="dxa"/>
-              <w:bottom w:w="80" w:type="dxa"/>
-              <w:left w:w="100" w:type="dxa"/>
-              <w:right w:w="100" w:type="dxa"/>
+              <w:top w:w="90" w:type="dxa"/>
+              <w:bottom w:w="90" w:type="dxa"/>
+              <w:left w:w="120" w:type="dxa"/>
+              <w:right w:w="120" w:type="dxa"/>
             </w:tcMar>
           </w:tcPr>
           <w:p>
@@ -2364,10 +2414,10 @@
             <w:tcW w:type="dxa" w:w="1296"/>
             <w:shd w:fill="FAFAFC"/>
             <w:tcMar>
-              <w:top w:w="80" w:type="dxa"/>
-              <w:bottom w:w="80" w:type="dxa"/>
-              <w:left w:w="100" w:type="dxa"/>
-              <w:right w:w="100" w:type="dxa"/>
+              <w:top w:w="90" w:type="dxa"/>
+              <w:bottom w:w="90" w:type="dxa"/>
+              <w:left w:w="120" w:type="dxa"/>
+              <w:right w:w="120" w:type="dxa"/>
             </w:tcMar>
           </w:tcPr>
           <w:p>
@@ -2388,10 +2438,10 @@
             <w:tcW w:type="dxa" w:w="1728"/>
             <w:shd w:fill="FAFAFC"/>
             <w:tcMar>
-              <w:top w:w="80" w:type="dxa"/>
-              <w:bottom w:w="80" w:type="dxa"/>
-              <w:left w:w="100" w:type="dxa"/>
-              <w:right w:w="100" w:type="dxa"/>
+              <w:top w:w="90" w:type="dxa"/>
+              <w:bottom w:w="90" w:type="dxa"/>
+              <w:left w:w="120" w:type="dxa"/>
+              <w:right w:w="120" w:type="dxa"/>
             </w:tcMar>
           </w:tcPr>
           <w:p>
@@ -2409,10 +2459,10 @@
           <w:tcPr>
             <w:tcW w:type="dxa" w:w="576"/>
             <w:tcMar>
-              <w:top w:w="80" w:type="dxa"/>
-              <w:bottom w:w="80" w:type="dxa"/>
-              <w:left w:w="100" w:type="dxa"/>
-              <w:right w:w="100" w:type="dxa"/>
+              <w:top w:w="90" w:type="dxa"/>
+              <w:bottom w:w="90" w:type="dxa"/>
+              <w:left w:w="120" w:type="dxa"/>
+              <w:right w:w="120" w:type="dxa"/>
             </w:tcMar>
           </w:tcPr>
           <w:p>
@@ -2431,10 +2481,10 @@
           <w:tcPr>
             <w:tcW w:type="dxa" w:w="2160"/>
             <w:tcMar>
-              <w:top w:w="80" w:type="dxa"/>
-              <w:bottom w:w="80" w:type="dxa"/>
-              <w:left w:w="100" w:type="dxa"/>
-              <w:right w:w="100" w:type="dxa"/>
+              <w:top w:w="90" w:type="dxa"/>
+              <w:bottom w:w="90" w:type="dxa"/>
+              <w:left w:w="120" w:type="dxa"/>
+              <w:right w:w="120" w:type="dxa"/>
             </w:tcMar>
           </w:tcPr>
           <w:p>
@@ -2450,10 +2500,10 @@
           <w:tcPr>
             <w:tcW w:type="dxa" w:w="2592"/>
             <w:tcMar>
-              <w:top w:w="80" w:type="dxa"/>
-              <w:bottom w:w="80" w:type="dxa"/>
-              <w:left w:w="100" w:type="dxa"/>
-              <w:right w:w="100" w:type="dxa"/>
+              <w:top w:w="90" w:type="dxa"/>
+              <w:bottom w:w="90" w:type="dxa"/>
+              <w:left w:w="120" w:type="dxa"/>
+              <w:right w:w="120" w:type="dxa"/>
             </w:tcMar>
           </w:tcPr>
           <w:p>
@@ -2469,10 +2519,10 @@
           <w:tcPr>
             <w:tcW w:type="dxa" w:w="576"/>
             <w:tcMar>
-              <w:top w:w="80" w:type="dxa"/>
-              <w:bottom w:w="80" w:type="dxa"/>
-              <w:left w:w="100" w:type="dxa"/>
-              <w:right w:w="100" w:type="dxa"/>
+              <w:top w:w="90" w:type="dxa"/>
+              <w:bottom w:w="90" w:type="dxa"/>
+              <w:left w:w="120" w:type="dxa"/>
+              <w:right w:w="120" w:type="dxa"/>
             </w:tcMar>
           </w:tcPr>
           <w:p>
@@ -2491,10 +2541,10 @@
           <w:tcPr>
             <w:tcW w:type="dxa" w:w="1152"/>
             <w:tcMar>
-              <w:top w:w="80" w:type="dxa"/>
-              <w:bottom w:w="80" w:type="dxa"/>
-              <w:left w:w="100" w:type="dxa"/>
-              <w:right w:w="100" w:type="dxa"/>
+              <w:top w:w="90" w:type="dxa"/>
+              <w:bottom w:w="90" w:type="dxa"/>
+              <w:left w:w="120" w:type="dxa"/>
+              <w:right w:w="120" w:type="dxa"/>
             </w:tcMar>
           </w:tcPr>
           <w:p>
@@ -2514,10 +2564,10 @@
           <w:tcPr>
             <w:tcW w:type="dxa" w:w="1296"/>
             <w:tcMar>
-              <w:top w:w="80" w:type="dxa"/>
-              <w:bottom w:w="80" w:type="dxa"/>
-              <w:left w:w="100" w:type="dxa"/>
-              <w:right w:w="100" w:type="dxa"/>
+              <w:top w:w="90" w:type="dxa"/>
+              <w:bottom w:w="90" w:type="dxa"/>
+              <w:left w:w="120" w:type="dxa"/>
+              <w:right w:w="120" w:type="dxa"/>
             </w:tcMar>
           </w:tcPr>
           <w:p>
@@ -2537,10 +2587,10 @@
           <w:tcPr>
             <w:tcW w:type="dxa" w:w="1728"/>
             <w:tcMar>
-              <w:top w:w="80" w:type="dxa"/>
-              <w:bottom w:w="80" w:type="dxa"/>
-              <w:left w:w="100" w:type="dxa"/>
-              <w:right w:w="100" w:type="dxa"/>
+              <w:top w:w="90" w:type="dxa"/>
+              <w:bottom w:w="90" w:type="dxa"/>
+              <w:left w:w="120" w:type="dxa"/>
+              <w:right w:w="120" w:type="dxa"/>
             </w:tcMar>
           </w:tcPr>
           <w:p>
@@ -2559,10 +2609,10 @@
             <w:tcW w:type="dxa" w:w="576"/>
             <w:shd w:fill="FAFAFC"/>
             <w:tcMar>
-              <w:top w:w="80" w:type="dxa"/>
-              <w:bottom w:w="80" w:type="dxa"/>
-              <w:left w:w="100" w:type="dxa"/>
-              <w:right w:w="100" w:type="dxa"/>
+              <w:top w:w="90" w:type="dxa"/>
+              <w:bottom w:w="90" w:type="dxa"/>
+              <w:left w:w="120" w:type="dxa"/>
+              <w:right w:w="120" w:type="dxa"/>
             </w:tcMar>
           </w:tcPr>
           <w:p>
@@ -2582,10 +2632,10 @@
             <w:tcW w:type="dxa" w:w="2160"/>
             <w:shd w:fill="FAFAFC"/>
             <w:tcMar>
-              <w:top w:w="80" w:type="dxa"/>
-              <w:bottom w:w="80" w:type="dxa"/>
-              <w:left w:w="100" w:type="dxa"/>
-              <w:right w:w="100" w:type="dxa"/>
+              <w:top w:w="90" w:type="dxa"/>
+              <w:bottom w:w="90" w:type="dxa"/>
+              <w:left w:w="120" w:type="dxa"/>
+              <w:right w:w="120" w:type="dxa"/>
             </w:tcMar>
           </w:tcPr>
           <w:p>
@@ -2602,10 +2652,10 @@
             <w:tcW w:type="dxa" w:w="2592"/>
             <w:shd w:fill="FAFAFC"/>
             <w:tcMar>
-              <w:top w:w="80" w:type="dxa"/>
-              <w:bottom w:w="80" w:type="dxa"/>
-              <w:left w:w="100" w:type="dxa"/>
-              <w:right w:w="100" w:type="dxa"/>
+              <w:top w:w="90" w:type="dxa"/>
+              <w:bottom w:w="90" w:type="dxa"/>
+              <w:left w:w="120" w:type="dxa"/>
+              <w:right w:w="120" w:type="dxa"/>
             </w:tcMar>
           </w:tcPr>
           <w:p>
@@ -2622,10 +2672,10 @@
             <w:tcW w:type="dxa" w:w="576"/>
             <w:shd w:fill="FAFAFC"/>
             <w:tcMar>
-              <w:top w:w="80" w:type="dxa"/>
-              <w:bottom w:w="80" w:type="dxa"/>
-              <w:left w:w="100" w:type="dxa"/>
-              <w:right w:w="100" w:type="dxa"/>
+              <w:top w:w="90" w:type="dxa"/>
+              <w:bottom w:w="90" w:type="dxa"/>
+              <w:left w:w="120" w:type="dxa"/>
+              <w:right w:w="120" w:type="dxa"/>
             </w:tcMar>
           </w:tcPr>
           <w:p>
@@ -2645,10 +2695,10 @@
             <w:tcW w:type="dxa" w:w="1152"/>
             <w:shd w:fill="FAFAFC"/>
             <w:tcMar>
-              <w:top w:w="80" w:type="dxa"/>
-              <w:bottom w:w="80" w:type="dxa"/>
-              <w:left w:w="100" w:type="dxa"/>
-              <w:right w:w="100" w:type="dxa"/>
+              <w:top w:w="90" w:type="dxa"/>
+              <w:bottom w:w="90" w:type="dxa"/>
+              <w:left w:w="120" w:type="dxa"/>
+              <w:right w:w="120" w:type="dxa"/>
             </w:tcMar>
           </w:tcPr>
           <w:p>
@@ -2669,10 +2719,10 @@
             <w:tcW w:type="dxa" w:w="1296"/>
             <w:shd w:fill="FAFAFC"/>
             <w:tcMar>
-              <w:top w:w="80" w:type="dxa"/>
-              <w:bottom w:w="80" w:type="dxa"/>
-              <w:left w:w="100" w:type="dxa"/>
-              <w:right w:w="100" w:type="dxa"/>
+              <w:top w:w="90" w:type="dxa"/>
+              <w:bottom w:w="90" w:type="dxa"/>
+              <w:left w:w="120" w:type="dxa"/>
+              <w:right w:w="120" w:type="dxa"/>
             </w:tcMar>
           </w:tcPr>
           <w:p>
@@ -2693,10 +2743,10 @@
             <w:tcW w:type="dxa" w:w="1728"/>
             <w:shd w:fill="FAFAFC"/>
             <w:tcMar>
-              <w:top w:w="80" w:type="dxa"/>
-              <w:bottom w:w="80" w:type="dxa"/>
-              <w:left w:w="100" w:type="dxa"/>
-              <w:right w:w="100" w:type="dxa"/>
+              <w:top w:w="90" w:type="dxa"/>
+              <w:bottom w:w="90" w:type="dxa"/>
+              <w:left w:w="120" w:type="dxa"/>
+              <w:right w:w="120" w:type="dxa"/>
             </w:tcMar>
           </w:tcPr>
           <w:p>
@@ -2794,7 +2844,7 @@
         <w:rPr>
           <w:b/>
           <w:color w:val="1E293B"/>
-          <w:sz w:val="22"/>
+          <w:sz w:val="21"/>
         </w:rPr>
         <w:t>🚀 KỊCH BẢN B: HẠ TẦNG MANAGED CLOUD / SERVERLESS (MỞ RỘNG LINH HOẠT)</w:t>
       </w:r>
@@ -2835,10 +2885,10 @@
             <w:tcW w:type="dxa" w:w="576"/>
             <w:shd w:fill="F1F5F9"/>
             <w:tcMar>
-              <w:top w:w="80" w:type="dxa"/>
-              <w:bottom w:w="80" w:type="dxa"/>
-              <w:left w:w="100" w:type="dxa"/>
-              <w:right w:w="100" w:type="dxa"/>
+              <w:top w:w="90" w:type="dxa"/>
+              <w:bottom w:w="90" w:type="dxa"/>
+              <w:left w:w="120" w:type="dxa"/>
+              <w:right w:w="120" w:type="dxa"/>
             </w:tcMar>
           </w:tcPr>
           <w:p>
@@ -2856,10 +2906,10 @@
             <w:tcW w:type="dxa" w:w="2880"/>
             <w:shd w:fill="F1F5F9"/>
             <w:tcMar>
-              <w:top w:w="80" w:type="dxa"/>
-              <w:bottom w:w="80" w:type="dxa"/>
-              <w:left w:w="100" w:type="dxa"/>
-              <w:right w:w="100" w:type="dxa"/>
+              <w:top w:w="90" w:type="dxa"/>
+              <w:bottom w:w="90" w:type="dxa"/>
+              <w:left w:w="120" w:type="dxa"/>
+              <w:right w:w="120" w:type="dxa"/>
             </w:tcMar>
           </w:tcPr>
           <w:p>
@@ -2877,10 +2927,10 @@
             <w:tcW w:type="dxa" w:w="2880"/>
             <w:shd w:fill="F1F5F9"/>
             <w:tcMar>
-              <w:top w:w="80" w:type="dxa"/>
-              <w:bottom w:w="80" w:type="dxa"/>
-              <w:left w:w="100" w:type="dxa"/>
-              <w:right w:w="100" w:type="dxa"/>
+              <w:top w:w="90" w:type="dxa"/>
+              <w:bottom w:w="90" w:type="dxa"/>
+              <w:left w:w="120" w:type="dxa"/>
+              <w:right w:w="120" w:type="dxa"/>
             </w:tcMar>
           </w:tcPr>
           <w:p>
@@ -2898,10 +2948,10 @@
             <w:tcW w:type="dxa" w:w="576"/>
             <w:shd w:fill="F1F5F9"/>
             <w:tcMar>
-              <w:top w:w="80" w:type="dxa"/>
-              <w:bottom w:w="80" w:type="dxa"/>
-              <w:left w:w="100" w:type="dxa"/>
-              <w:right w:w="100" w:type="dxa"/>
+              <w:top w:w="90" w:type="dxa"/>
+              <w:bottom w:w="90" w:type="dxa"/>
+              <w:left w:w="120" w:type="dxa"/>
+              <w:right w:w="120" w:type="dxa"/>
             </w:tcMar>
           </w:tcPr>
           <w:p>
@@ -2919,10 +2969,10 @@
             <w:tcW w:type="dxa" w:w="1584"/>
             <w:shd w:fill="F1F5F9"/>
             <w:tcMar>
-              <w:top w:w="80" w:type="dxa"/>
-              <w:bottom w:w="80" w:type="dxa"/>
-              <w:left w:w="100" w:type="dxa"/>
-              <w:right w:w="100" w:type="dxa"/>
+              <w:top w:w="90" w:type="dxa"/>
+              <w:bottom w:w="90" w:type="dxa"/>
+              <w:left w:w="120" w:type="dxa"/>
+              <w:right w:w="120" w:type="dxa"/>
             </w:tcMar>
           </w:tcPr>
           <w:p>
@@ -2940,10 +2990,10 @@
             <w:tcW w:type="dxa" w:w="1584"/>
             <w:shd w:fill="F1F5F9"/>
             <w:tcMar>
-              <w:top w:w="80" w:type="dxa"/>
-              <w:bottom w:w="80" w:type="dxa"/>
-              <w:left w:w="100" w:type="dxa"/>
-              <w:right w:w="100" w:type="dxa"/>
+              <w:top w:w="90" w:type="dxa"/>
+              <w:bottom w:w="90" w:type="dxa"/>
+              <w:left w:w="120" w:type="dxa"/>
+              <w:right w:w="120" w:type="dxa"/>
             </w:tcMar>
           </w:tcPr>
           <w:p>
@@ -2962,10 +3012,10 @@
           <w:tcPr>
             <w:tcW w:type="dxa" w:w="576"/>
             <w:tcMar>
-              <w:top w:w="80" w:type="dxa"/>
-              <w:bottom w:w="80" w:type="dxa"/>
-              <w:left w:w="100" w:type="dxa"/>
-              <w:right w:w="100" w:type="dxa"/>
+              <w:top w:w="90" w:type="dxa"/>
+              <w:bottom w:w="90" w:type="dxa"/>
+              <w:left w:w="120" w:type="dxa"/>
+              <w:right w:w="120" w:type="dxa"/>
             </w:tcMar>
           </w:tcPr>
           <w:p>
@@ -2984,10 +3034,10 @@
           <w:tcPr>
             <w:tcW w:type="dxa" w:w="2880"/>
             <w:tcMar>
-              <w:top w:w="80" w:type="dxa"/>
-              <w:bottom w:w="80" w:type="dxa"/>
-              <w:left w:w="100" w:type="dxa"/>
-              <w:right w:w="100" w:type="dxa"/>
+              <w:top w:w="90" w:type="dxa"/>
+              <w:bottom w:w="90" w:type="dxa"/>
+              <w:left w:w="120" w:type="dxa"/>
+              <w:right w:w="120" w:type="dxa"/>
             </w:tcMar>
           </w:tcPr>
           <w:p>
@@ -3003,10 +3053,10 @@
           <w:tcPr>
             <w:tcW w:type="dxa" w:w="2880"/>
             <w:tcMar>
-              <w:top w:w="80" w:type="dxa"/>
-              <w:bottom w:w="80" w:type="dxa"/>
-              <w:left w:w="100" w:type="dxa"/>
-              <w:right w:w="100" w:type="dxa"/>
+              <w:top w:w="90" w:type="dxa"/>
+              <w:bottom w:w="90" w:type="dxa"/>
+              <w:left w:w="120" w:type="dxa"/>
+              <w:right w:w="120" w:type="dxa"/>
             </w:tcMar>
           </w:tcPr>
           <w:p>
@@ -3022,10 +3072,10 @@
           <w:tcPr>
             <w:tcW w:type="dxa" w:w="576"/>
             <w:tcMar>
-              <w:top w:w="80" w:type="dxa"/>
-              <w:bottom w:w="80" w:type="dxa"/>
-              <w:left w:w="100" w:type="dxa"/>
-              <w:right w:w="100" w:type="dxa"/>
+              <w:top w:w="90" w:type="dxa"/>
+              <w:bottom w:w="90" w:type="dxa"/>
+              <w:left w:w="120" w:type="dxa"/>
+              <w:right w:w="120" w:type="dxa"/>
             </w:tcMar>
           </w:tcPr>
           <w:p>
@@ -3044,10 +3094,10 @@
           <w:tcPr>
             <w:tcW w:type="dxa" w:w="1584"/>
             <w:tcMar>
-              <w:top w:w="80" w:type="dxa"/>
-              <w:bottom w:w="80" w:type="dxa"/>
-              <w:left w:w="100" w:type="dxa"/>
-              <w:right w:w="100" w:type="dxa"/>
+              <w:top w:w="90" w:type="dxa"/>
+              <w:bottom w:w="90" w:type="dxa"/>
+              <w:left w:w="120" w:type="dxa"/>
+              <w:right w:w="120" w:type="dxa"/>
             </w:tcMar>
           </w:tcPr>
           <w:p>
@@ -3067,10 +3117,10 @@
           <w:tcPr>
             <w:tcW w:type="dxa" w:w="1584"/>
             <w:tcMar>
-              <w:top w:w="80" w:type="dxa"/>
-              <w:bottom w:w="80" w:type="dxa"/>
-              <w:left w:w="100" w:type="dxa"/>
-              <w:right w:w="100" w:type="dxa"/>
+              <w:top w:w="90" w:type="dxa"/>
+              <w:bottom w:w="90" w:type="dxa"/>
+              <w:left w:w="120" w:type="dxa"/>
+              <w:right w:w="120" w:type="dxa"/>
             </w:tcMar>
           </w:tcPr>
           <w:p>
@@ -3089,10 +3139,10 @@
             <w:tcW w:type="dxa" w:w="576"/>
             <w:shd w:fill="FAFAFC"/>
             <w:tcMar>
-              <w:top w:w="80" w:type="dxa"/>
-              <w:bottom w:w="80" w:type="dxa"/>
-              <w:left w:w="100" w:type="dxa"/>
-              <w:right w:w="100" w:type="dxa"/>
+              <w:top w:w="90" w:type="dxa"/>
+              <w:bottom w:w="90" w:type="dxa"/>
+              <w:left w:w="120" w:type="dxa"/>
+              <w:right w:w="120" w:type="dxa"/>
             </w:tcMar>
           </w:tcPr>
           <w:p>
@@ -3112,10 +3162,10 @@
             <w:tcW w:type="dxa" w:w="2880"/>
             <w:shd w:fill="FAFAFC"/>
             <w:tcMar>
-              <w:top w:w="80" w:type="dxa"/>
-              <w:bottom w:w="80" w:type="dxa"/>
-              <w:left w:w="100" w:type="dxa"/>
-              <w:right w:w="100" w:type="dxa"/>
+              <w:top w:w="90" w:type="dxa"/>
+              <w:bottom w:w="90" w:type="dxa"/>
+              <w:left w:w="120" w:type="dxa"/>
+              <w:right w:w="120" w:type="dxa"/>
             </w:tcMar>
           </w:tcPr>
           <w:p>
@@ -3132,10 +3182,10 @@
             <w:tcW w:type="dxa" w:w="2880"/>
             <w:shd w:fill="FAFAFC"/>
             <w:tcMar>
-              <w:top w:w="80" w:type="dxa"/>
-              <w:bottom w:w="80" w:type="dxa"/>
-              <w:left w:w="100" w:type="dxa"/>
-              <w:right w:w="100" w:type="dxa"/>
+              <w:top w:w="90" w:type="dxa"/>
+              <w:bottom w:w="90" w:type="dxa"/>
+              <w:left w:w="120" w:type="dxa"/>
+              <w:right w:w="120" w:type="dxa"/>
             </w:tcMar>
           </w:tcPr>
           <w:p>
@@ -3152,10 +3202,10 @@
             <w:tcW w:type="dxa" w:w="576"/>
             <w:shd w:fill="FAFAFC"/>
             <w:tcMar>
-              <w:top w:w="80" w:type="dxa"/>
-              <w:bottom w:w="80" w:type="dxa"/>
-              <w:left w:w="100" w:type="dxa"/>
-              <w:right w:w="100" w:type="dxa"/>
+              <w:top w:w="90" w:type="dxa"/>
+              <w:bottom w:w="90" w:type="dxa"/>
+              <w:left w:w="120" w:type="dxa"/>
+              <w:right w:w="120" w:type="dxa"/>
             </w:tcMar>
           </w:tcPr>
           <w:p>
@@ -3175,10 +3225,10 @@
             <w:tcW w:type="dxa" w:w="1584"/>
             <w:shd w:fill="FAFAFC"/>
             <w:tcMar>
-              <w:top w:w="80" w:type="dxa"/>
-              <w:bottom w:w="80" w:type="dxa"/>
-              <w:left w:w="100" w:type="dxa"/>
-              <w:right w:w="100" w:type="dxa"/>
+              <w:top w:w="90" w:type="dxa"/>
+              <w:bottom w:w="90" w:type="dxa"/>
+              <w:left w:w="120" w:type="dxa"/>
+              <w:right w:w="120" w:type="dxa"/>
             </w:tcMar>
           </w:tcPr>
           <w:p>
@@ -3199,10 +3249,10 @@
             <w:tcW w:type="dxa" w:w="1584"/>
             <w:shd w:fill="FAFAFC"/>
             <w:tcMar>
-              <w:top w:w="80" w:type="dxa"/>
-              <w:bottom w:w="80" w:type="dxa"/>
-              <w:left w:w="100" w:type="dxa"/>
-              <w:right w:w="100" w:type="dxa"/>
+              <w:top w:w="90" w:type="dxa"/>
+              <w:bottom w:w="90" w:type="dxa"/>
+              <w:left w:w="120" w:type="dxa"/>
+              <w:right w:w="120" w:type="dxa"/>
             </w:tcMar>
           </w:tcPr>
           <w:p>
@@ -3220,10 +3270,10 @@
           <w:tcPr>
             <w:tcW w:type="dxa" w:w="576"/>
             <w:tcMar>
-              <w:top w:w="80" w:type="dxa"/>
-              <w:bottom w:w="80" w:type="dxa"/>
-              <w:left w:w="100" w:type="dxa"/>
-              <w:right w:w="100" w:type="dxa"/>
+              <w:top w:w="90" w:type="dxa"/>
+              <w:bottom w:w="90" w:type="dxa"/>
+              <w:left w:w="120" w:type="dxa"/>
+              <w:right w:w="120" w:type="dxa"/>
             </w:tcMar>
           </w:tcPr>
           <w:p>
@@ -3242,10 +3292,10 @@
           <w:tcPr>
             <w:tcW w:type="dxa" w:w="2880"/>
             <w:tcMar>
-              <w:top w:w="80" w:type="dxa"/>
-              <w:bottom w:w="80" w:type="dxa"/>
-              <w:left w:w="100" w:type="dxa"/>
-              <w:right w:w="100" w:type="dxa"/>
+              <w:top w:w="90" w:type="dxa"/>
+              <w:bottom w:w="90" w:type="dxa"/>
+              <w:left w:w="120" w:type="dxa"/>
+              <w:right w:w="120" w:type="dxa"/>
             </w:tcMar>
           </w:tcPr>
           <w:p>
@@ -3261,10 +3311,10 @@
           <w:tcPr>
             <w:tcW w:type="dxa" w:w="2880"/>
             <w:tcMar>
-              <w:top w:w="80" w:type="dxa"/>
-              <w:bottom w:w="80" w:type="dxa"/>
-              <w:left w:w="100" w:type="dxa"/>
-              <w:right w:w="100" w:type="dxa"/>
+              <w:top w:w="90" w:type="dxa"/>
+              <w:bottom w:w="90" w:type="dxa"/>
+              <w:left w:w="120" w:type="dxa"/>
+              <w:right w:w="120" w:type="dxa"/>
             </w:tcMar>
           </w:tcPr>
           <w:p>
@@ -3280,10 +3330,10 @@
           <w:tcPr>
             <w:tcW w:type="dxa" w:w="576"/>
             <w:tcMar>
-              <w:top w:w="80" w:type="dxa"/>
-              <w:bottom w:w="80" w:type="dxa"/>
-              <w:left w:w="100" w:type="dxa"/>
-              <w:right w:w="100" w:type="dxa"/>
+              <w:top w:w="90" w:type="dxa"/>
+              <w:bottom w:w="90" w:type="dxa"/>
+              <w:left w:w="120" w:type="dxa"/>
+              <w:right w:w="120" w:type="dxa"/>
             </w:tcMar>
           </w:tcPr>
           <w:p>
@@ -3302,10 +3352,10 @@
           <w:tcPr>
             <w:tcW w:type="dxa" w:w="1584"/>
             <w:tcMar>
-              <w:top w:w="80" w:type="dxa"/>
-              <w:bottom w:w="80" w:type="dxa"/>
-              <w:left w:w="100" w:type="dxa"/>
-              <w:right w:w="100" w:type="dxa"/>
+              <w:top w:w="90" w:type="dxa"/>
+              <w:bottom w:w="90" w:type="dxa"/>
+              <w:left w:w="120" w:type="dxa"/>
+              <w:right w:w="120" w:type="dxa"/>
             </w:tcMar>
           </w:tcPr>
           <w:p>
@@ -3325,10 +3375,10 @@
           <w:tcPr>
             <w:tcW w:type="dxa" w:w="1584"/>
             <w:tcMar>
-              <w:top w:w="80" w:type="dxa"/>
-              <w:bottom w:w="80" w:type="dxa"/>
-              <w:left w:w="100" w:type="dxa"/>
-              <w:right w:w="100" w:type="dxa"/>
+              <w:top w:w="90" w:type="dxa"/>
+              <w:bottom w:w="90" w:type="dxa"/>
+              <w:left w:w="120" w:type="dxa"/>
+              <w:right w:w="120" w:type="dxa"/>
             </w:tcMar>
           </w:tcPr>
           <w:p>
@@ -3347,10 +3397,10 @@
             <w:tcW w:type="dxa" w:w="576"/>
             <w:shd w:fill="FAFAFC"/>
             <w:tcMar>
-              <w:top w:w="80" w:type="dxa"/>
-              <w:bottom w:w="80" w:type="dxa"/>
-              <w:left w:w="100" w:type="dxa"/>
-              <w:right w:w="100" w:type="dxa"/>
+              <w:top w:w="90" w:type="dxa"/>
+              <w:bottom w:w="90" w:type="dxa"/>
+              <w:left w:w="120" w:type="dxa"/>
+              <w:right w:w="120" w:type="dxa"/>
             </w:tcMar>
           </w:tcPr>
           <w:p>
@@ -3370,10 +3420,10 @@
             <w:tcW w:type="dxa" w:w="2880"/>
             <w:shd w:fill="FAFAFC"/>
             <w:tcMar>
-              <w:top w:w="80" w:type="dxa"/>
-              <w:bottom w:w="80" w:type="dxa"/>
-              <w:left w:w="100" w:type="dxa"/>
-              <w:right w:w="100" w:type="dxa"/>
+              <w:top w:w="90" w:type="dxa"/>
+              <w:bottom w:w="90" w:type="dxa"/>
+              <w:left w:w="120" w:type="dxa"/>
+              <w:right w:w="120" w:type="dxa"/>
             </w:tcMar>
           </w:tcPr>
           <w:p>
@@ -3390,10 +3440,10 @@
             <w:tcW w:type="dxa" w:w="2880"/>
             <w:shd w:fill="FAFAFC"/>
             <w:tcMar>
-              <w:top w:w="80" w:type="dxa"/>
-              <w:bottom w:w="80" w:type="dxa"/>
-              <w:left w:w="100" w:type="dxa"/>
-              <w:right w:w="100" w:type="dxa"/>
+              <w:top w:w="90" w:type="dxa"/>
+              <w:bottom w:w="90" w:type="dxa"/>
+              <w:left w:w="120" w:type="dxa"/>
+              <w:right w:w="120" w:type="dxa"/>
             </w:tcMar>
           </w:tcPr>
           <w:p>
@@ -3410,10 +3460,10 @@
             <w:tcW w:type="dxa" w:w="576"/>
             <w:shd w:fill="FAFAFC"/>
             <w:tcMar>
-              <w:top w:w="80" w:type="dxa"/>
-              <w:bottom w:w="80" w:type="dxa"/>
-              <w:left w:w="100" w:type="dxa"/>
-              <w:right w:w="100" w:type="dxa"/>
+              <w:top w:w="90" w:type="dxa"/>
+              <w:bottom w:w="90" w:type="dxa"/>
+              <w:left w:w="120" w:type="dxa"/>
+              <w:right w:w="120" w:type="dxa"/>
             </w:tcMar>
           </w:tcPr>
           <w:p>
@@ -3433,10 +3483,10 @@
             <w:tcW w:type="dxa" w:w="1584"/>
             <w:shd w:fill="FAFAFC"/>
             <w:tcMar>
-              <w:top w:w="80" w:type="dxa"/>
-              <w:bottom w:w="80" w:type="dxa"/>
-              <w:left w:w="100" w:type="dxa"/>
-              <w:right w:w="100" w:type="dxa"/>
+              <w:top w:w="90" w:type="dxa"/>
+              <w:bottom w:w="90" w:type="dxa"/>
+              <w:left w:w="120" w:type="dxa"/>
+              <w:right w:w="120" w:type="dxa"/>
             </w:tcMar>
           </w:tcPr>
           <w:p>
@@ -3457,10 +3507,10 @@
             <w:tcW w:type="dxa" w:w="1584"/>
             <w:shd w:fill="FAFAFC"/>
             <w:tcMar>
-              <w:top w:w="80" w:type="dxa"/>
-              <w:bottom w:w="80" w:type="dxa"/>
-              <w:left w:w="100" w:type="dxa"/>
-              <w:right w:w="100" w:type="dxa"/>
+              <w:top w:w="90" w:type="dxa"/>
+              <w:bottom w:w="90" w:type="dxa"/>
+              <w:left w:w="120" w:type="dxa"/>
+              <w:right w:w="120" w:type="dxa"/>
             </w:tcMar>
           </w:tcPr>
           <w:p>
@@ -3478,10 +3528,10 @@
           <w:tcPr>
             <w:tcW w:type="dxa" w:w="576"/>
             <w:tcMar>
-              <w:top w:w="80" w:type="dxa"/>
-              <w:bottom w:w="80" w:type="dxa"/>
-              <w:left w:w="100" w:type="dxa"/>
-              <w:right w:w="100" w:type="dxa"/>
+              <w:top w:w="90" w:type="dxa"/>
+              <w:bottom w:w="90" w:type="dxa"/>
+              <w:left w:w="120" w:type="dxa"/>
+              <w:right w:w="120" w:type="dxa"/>
             </w:tcMar>
           </w:tcPr>
           <w:p>
@@ -3500,10 +3550,10 @@
           <w:tcPr>
             <w:tcW w:type="dxa" w:w="2880"/>
             <w:tcMar>
-              <w:top w:w="80" w:type="dxa"/>
-              <w:bottom w:w="80" w:type="dxa"/>
-              <w:left w:w="100" w:type="dxa"/>
-              <w:right w:w="100" w:type="dxa"/>
+              <w:top w:w="90" w:type="dxa"/>
+              <w:bottom w:w="90" w:type="dxa"/>
+              <w:left w:w="120" w:type="dxa"/>
+              <w:right w:w="120" w:type="dxa"/>
             </w:tcMar>
           </w:tcPr>
           <w:p>
@@ -3519,10 +3569,10 @@
           <w:tcPr>
             <w:tcW w:type="dxa" w:w="2880"/>
             <w:tcMar>
-              <w:top w:w="80" w:type="dxa"/>
-              <w:bottom w:w="80" w:type="dxa"/>
-              <w:left w:w="100" w:type="dxa"/>
-              <w:right w:w="100" w:type="dxa"/>
+              <w:top w:w="90" w:type="dxa"/>
+              <w:bottom w:w="90" w:type="dxa"/>
+              <w:left w:w="120" w:type="dxa"/>
+              <w:right w:w="120" w:type="dxa"/>
             </w:tcMar>
           </w:tcPr>
           <w:p>
@@ -3538,10 +3588,10 @@
           <w:tcPr>
             <w:tcW w:type="dxa" w:w="576"/>
             <w:tcMar>
-              <w:top w:w="80" w:type="dxa"/>
-              <w:bottom w:w="80" w:type="dxa"/>
-              <w:left w:w="100" w:type="dxa"/>
-              <w:right w:w="100" w:type="dxa"/>
+              <w:top w:w="90" w:type="dxa"/>
+              <w:bottom w:w="90" w:type="dxa"/>
+              <w:left w:w="120" w:type="dxa"/>
+              <w:right w:w="120" w:type="dxa"/>
             </w:tcMar>
           </w:tcPr>
           <w:p>
@@ -3560,10 +3610,10 @@
           <w:tcPr>
             <w:tcW w:type="dxa" w:w="1584"/>
             <w:tcMar>
-              <w:top w:w="80" w:type="dxa"/>
-              <w:bottom w:w="80" w:type="dxa"/>
-              <w:left w:w="100" w:type="dxa"/>
-              <w:right w:w="100" w:type="dxa"/>
+              <w:top w:w="90" w:type="dxa"/>
+              <w:bottom w:w="90" w:type="dxa"/>
+              <w:left w:w="120" w:type="dxa"/>
+              <w:right w:w="120" w:type="dxa"/>
             </w:tcMar>
           </w:tcPr>
           <w:p>
@@ -3583,10 +3633,10 @@
           <w:tcPr>
             <w:tcW w:type="dxa" w:w="1584"/>
             <w:tcMar>
-              <w:top w:w="80" w:type="dxa"/>
-              <w:bottom w:w="80" w:type="dxa"/>
-              <w:left w:w="100" w:type="dxa"/>
-              <w:right w:w="100" w:type="dxa"/>
+              <w:top w:w="90" w:type="dxa"/>
+              <w:bottom w:w="90" w:type="dxa"/>
+              <w:left w:w="120" w:type="dxa"/>
+              <w:right w:w="120" w:type="dxa"/>
             </w:tcMar>
           </w:tcPr>
           <w:p>

</xml_diff>